<commit_message>
Update docx: distance learning platform study
Replace the existing .docx with an updated version covering the organization of distance learning platforms in district schools for computer science lessons (tuman maktablarida masofaviy ta'lim platformalarini informatika darslarida tashkil etishni o'rganish). Binary document updated — likely content or formatting revisions.
</commit_message>
<xml_diff>
--- a/tuman maktablarida masofaviy talim platformalarini informatika darslarida tashkil etishni o'rganish.docx
+++ b/tuman maktablarida masofaviy talim platformalarini informatika darslarida tashkil etishni o'rganish.docx
@@ -16,11 +16,11 @@
           <w:szCs w:val="28"/>
         </w:rPr>
       </w:pPr>
-      <w:bookmarkStart w:id="0" w:name="_Toc14432"/>
-      <w:bookmarkStart w:id="1" w:name="_Toc32418"/>
-      <w:bookmarkStart w:id="2" w:name="_Toc22473"/>
-      <w:bookmarkStart w:id="3" w:name="_Toc11431"/>
-      <w:bookmarkStart w:id="4" w:name="_Toc19517"/>
+      <w:bookmarkStart w:id="0" w:name="_Toc11431"/>
+      <w:bookmarkStart w:id="1" w:name="_Toc19517"/>
+      <w:bookmarkStart w:id="2" w:name="_Toc14432"/>
+      <w:bookmarkStart w:id="3" w:name="_Toc22473"/>
+      <w:bookmarkStart w:id="4" w:name="_Toc32418"/>
       <w:r>
         <w:rPr>
           <w:rFonts w:hint="default" w:ascii="Times New Roman" w:hAnsi="Times New Roman" w:cs="Times New Roman"/>
@@ -264,7 +264,7 @@
           <w:sz w:val="28"/>
           <w:szCs w:val="28"/>
         </w:rPr>
-        <w:t>6</w:t>
+        <w:t>7</w:t>
       </w:r>
       <w:r>
         <w:rPr>
@@ -389,7 +389,7 @@
           <w:sz w:val="28"/>
           <w:szCs w:val="28"/>
         </w:rPr>
-        <w:t>6</w:t>
+        <w:t>7</w:t>
       </w:r>
       <w:r>
         <w:rPr>
@@ -514,7 +514,7 @@
           <w:sz w:val="28"/>
           <w:szCs w:val="28"/>
         </w:rPr>
-        <w:t>9</w:t>
+        <w:t>10</w:t>
       </w:r>
       <w:r>
         <w:rPr>
@@ -639,7 +639,7 @@
           <w:sz w:val="28"/>
           <w:szCs w:val="28"/>
         </w:rPr>
-        <w:t>12</w:t>
+        <w:t>13</w:t>
       </w:r>
       <w:r>
         <w:rPr>
@@ -764,7 +764,7 @@
           <w:sz w:val="28"/>
           <w:szCs w:val="28"/>
         </w:rPr>
-        <w:t>16</w:t>
+        <w:t>17</w:t>
       </w:r>
       <w:r>
         <w:rPr>
@@ -889,7 +889,7 @@
           <w:sz w:val="28"/>
           <w:szCs w:val="28"/>
         </w:rPr>
-        <w:t>16</w:t>
+        <w:t>17</w:t>
       </w:r>
       <w:r>
         <w:rPr>
@@ -1014,7 +1014,7 @@
           <w:sz w:val="28"/>
           <w:szCs w:val="28"/>
         </w:rPr>
-        <w:t>19</w:t>
+        <w:t>20</w:t>
       </w:r>
       <w:r>
         <w:rPr>
@@ -1139,7 +1139,7 @@
           <w:sz w:val="28"/>
           <w:szCs w:val="28"/>
         </w:rPr>
-        <w:t>22</w:t>
+        <w:t>23</w:t>
       </w:r>
       <w:r>
         <w:rPr>
@@ -1264,7 +1264,7 @@
           <w:sz w:val="28"/>
           <w:szCs w:val="28"/>
         </w:rPr>
-        <w:t>25</w:t>
+        <w:t>26</w:t>
       </w:r>
       <w:r>
         <w:rPr>
@@ -1389,7 +1389,7 @@
           <w:sz w:val="28"/>
           <w:szCs w:val="28"/>
         </w:rPr>
-        <w:t>30</w:t>
+        <w:t>31</w:t>
       </w:r>
       <w:r>
         <w:rPr>
@@ -1514,7 +1514,7 @@
           <w:sz w:val="28"/>
           <w:szCs w:val="28"/>
         </w:rPr>
-        <w:t>30</w:t>
+        <w:t>31</w:t>
       </w:r>
       <w:r>
         <w:rPr>
@@ -1639,7 +1639,7 @@
           <w:sz w:val="28"/>
           <w:szCs w:val="28"/>
         </w:rPr>
-        <w:t>34</w:t>
+        <w:t>35</w:t>
       </w:r>
       <w:r>
         <w:rPr>
@@ -1764,7 +1764,7 @@
           <w:sz w:val="28"/>
           <w:szCs w:val="28"/>
         </w:rPr>
-        <w:t>38</w:t>
+        <w:t>39</w:t>
       </w:r>
       <w:r>
         <w:rPr>
@@ -1889,7 +1889,7 @@
           <w:sz w:val="28"/>
           <w:szCs w:val="28"/>
         </w:rPr>
-        <w:t>43</w:t>
+        <w:t>44</w:t>
       </w:r>
       <w:r>
         <w:rPr>
@@ -2014,7 +2014,7 @@
           <w:sz w:val="28"/>
           <w:szCs w:val="28"/>
         </w:rPr>
-        <w:t>49</w:t>
+        <w:t>50</w:t>
       </w:r>
       <w:r>
         <w:rPr>
@@ -2139,7 +2139,7 @@
           <w:sz w:val="28"/>
           <w:szCs w:val="28"/>
         </w:rPr>
-        <w:t>49</w:t>
+        <w:t>50</w:t>
       </w:r>
       <w:r>
         <w:rPr>
@@ -2264,7 +2264,7 @@
           <w:sz w:val="28"/>
           <w:szCs w:val="28"/>
         </w:rPr>
-        <w:t>52</w:t>
+        <w:t>53</w:t>
       </w:r>
       <w:r>
         <w:rPr>
@@ -2389,7 +2389,7 @@
           <w:sz w:val="28"/>
           <w:szCs w:val="28"/>
         </w:rPr>
-        <w:t>54</w:t>
+        <w:t>55</w:t>
       </w:r>
       <w:r>
         <w:rPr>
@@ -2514,7 +2514,7 @@
           <w:sz w:val="28"/>
           <w:szCs w:val="28"/>
         </w:rPr>
-        <w:t>58</w:t>
+        <w:t>59</w:t>
       </w:r>
       <w:r>
         <w:rPr>
@@ -2639,7 +2639,7 @@
           <w:sz w:val="28"/>
           <w:szCs w:val="28"/>
         </w:rPr>
-        <w:t>65</w:t>
+        <w:t>66</w:t>
       </w:r>
       <w:r>
         <w:rPr>
@@ -2764,7 +2764,7 @@
           <w:sz w:val="28"/>
           <w:szCs w:val="28"/>
         </w:rPr>
-        <w:t>68</w:t>
+        <w:t>69</w:t>
       </w:r>
       <w:r>
         <w:rPr>
@@ -2821,21 +2821,11 @@
         </w:rPr>
         <w:br w:type="page"/>
       </w:r>
-      <w:bookmarkStart w:id="147" w:name="_GoBack"/>
-      <w:bookmarkEnd w:id="147"/>
     </w:p>
     <w:p>
       <w:pPr>
         <w:pStyle w:val="2"/>
         <w:bidi w:val="0"/>
-        <w:rPr>
-          <w:rStyle w:val="13"/>
-          <w:rFonts w:hint="default" w:ascii="Times New Roman" w:hAnsi="Times New Roman" w:cs="Times New Roman"/>
-          <w:b/>
-          <w:bCs/>
-          <w:sz w:val="28"/>
-          <w:szCs w:val="28"/>
-        </w:rPr>
       </w:pPr>
       <w:bookmarkStart w:id="5" w:name="_Toc27613"/>
       <w:bookmarkStart w:id="6" w:name="_Toc10430"/>
@@ -2857,30 +2847,45 @@
       <w:bookmarkEnd w:id="4"/>
       <w:bookmarkEnd w:id="5"/>
       <w:bookmarkEnd w:id="6"/>
-    </w:p>
-    <w:p>
-      <w:pPr>
-        <w:pStyle w:val="12"/>
-        <w:keepNext w:val="0"/>
-        <w:keepLines w:val="0"/>
-        <w:widowControl/>
-        <w:suppressLineNumbers w:val="0"/>
-        <w:spacing w:line="360" w:lineRule="auto"/>
-        <w:ind w:firstLine="720" w:firstLineChars="0"/>
-        <w:jc w:val="both"/>
-        <w:rPr>
-          <w:rFonts w:hint="default" w:ascii="Times New Roman" w:hAnsi="Times New Roman" w:cs="Times New Roman"/>
-          <w:sz w:val="28"/>
-          <w:szCs w:val="28"/>
-        </w:rPr>
-      </w:pPr>
-      <w:r>
-        <w:rPr>
-          <w:rFonts w:hint="default" w:ascii="Times New Roman" w:hAnsi="Times New Roman" w:cs="Times New Roman"/>
-          <w:sz w:val="28"/>
-          <w:szCs w:val="28"/>
-        </w:rPr>
-        <w:t>Hozirgi globallashuv va raqamli texnologiyalar jadal rivojlanayotgan davrda ta’lim tizimini modernizatsiya qilish muhim ahamiyat kasb etmoqda. Axborot-kommunikatsiya texnologiyalarining (AKT) keng joriy etilishi ta’lim jarayoniga yangicha yondashuvlarni olib kirib, o‘qitishning samaradorligini oshirishga xizmat qilmoqda. Ayniqsa, masofaviy ta’lim tizimlari zamonaviy ta’limning ajralmas qismiga aylanib bormoqda. Bu esa o‘z navbatida umumta’lim maktablarida, xususan, tuman maktablarida ham masofaviy ta’lim platformalarini joriy etish zaruratini yuzaga keltirmoqda.</w:t>
+      <w:bookmarkStart w:id="7" w:name="_Toc22652"/>
+      <w:bookmarkStart w:id="8" w:name="_Toc13329"/>
+      <w:bookmarkStart w:id="9" w:name="_Toc4640"/>
+      <w:bookmarkStart w:id="10" w:name="_Toc9986"/>
+      <w:bookmarkStart w:id="11" w:name="_Toc5295"/>
+    </w:p>
+    <w:p>
+      <w:pPr>
+        <w:pStyle w:val="12"/>
+        <w:keepNext w:val="0"/>
+        <w:keepLines w:val="0"/>
+        <w:widowControl/>
+        <w:suppressLineNumbers w:val="0"/>
+        <w:spacing w:line="360" w:lineRule="auto"/>
+        <w:ind w:firstLine="720" w:firstLineChars="0"/>
+        <w:jc w:val="both"/>
+        <w:rPr>
+          <w:rFonts w:hint="default" w:ascii="Times New Roman" w:hAnsi="Times New Roman" w:cs="Times New Roman"/>
+          <w:sz w:val="28"/>
+          <w:szCs w:val="28"/>
+        </w:rPr>
+      </w:pPr>
+      <w:r>
+        <w:rPr>
+          <w:rFonts w:hint="default" w:ascii="Times New Roman" w:hAnsi="Times New Roman" w:cs="Times New Roman"/>
+          <w:sz w:val="28"/>
+          <w:szCs w:val="28"/>
+        </w:rPr>
+        <w:t>Hozirgi globallashuv va raqamli texnologiyalar jadal rivojlanayotgan davrda ta’lim tizimini modernizatsiya qilish muhim ahamiyat kasb etmoqda. Axborot-kommunikatsiya texnologiyalar</w:t>
+      </w:r>
+      <w:bookmarkStart w:id="147" w:name="_GoBack"/>
+      <w:bookmarkEnd w:id="147"/>
+      <w:r>
+        <w:rPr>
+          <w:rFonts w:hint="default" w:ascii="Times New Roman" w:hAnsi="Times New Roman" w:cs="Times New Roman"/>
+          <w:sz w:val="28"/>
+          <w:szCs w:val="28"/>
+        </w:rPr>
+        <w:t>ining (AKT) keng joriy etilishi ta’lim jarayoniga yangicha yondashuvlarni olib kirib, o‘qitishning samaradorligini oshirishga xizmat qilmoqda. Ayniqsa, masofaviy ta’lim tizimlari zamonaviy ta’limning ajralmas qismiga aylanib bormoqda. Bu esa o‘z navbatida umumta’lim maktablarida, xususan, tuman maktablarida ham masofaviy ta’lim platformalarini joriy etish zaruratini yuzaga keltirmoqda.</w:t>
       </w:r>
     </w:p>
     <w:p>
@@ -2935,6 +2940,34 @@
     </w:p>
     <w:p>
       <w:pPr>
+        <w:keepNext w:val="0"/>
+        <w:keepLines w:val="0"/>
+        <w:widowControl/>
+        <w:suppressLineNumbers w:val="0"/>
+        <w:spacing w:line="360" w:lineRule="auto"/>
+        <w:jc w:val="both"/>
+        <w:outlineLvl w:val="9"/>
+        <w:rPr>
+          <w:rFonts w:hint="default" w:ascii="Times New Roman" w:hAnsi="Times New Roman" w:cs="Times New Roman"/>
+          <w:b/>
+          <w:bCs/>
+          <w:sz w:val="28"/>
+          <w:szCs w:val="28"/>
+        </w:rPr>
+      </w:pPr>
+      <w:r>
+        <w:rPr>
+          <w:rFonts w:hint="default" w:ascii="Times New Roman" w:hAnsi="Times New Roman" w:cs="Times New Roman"/>
+          <w:b/>
+          <w:bCs/>
+          <w:sz w:val="28"/>
+          <w:szCs w:val="28"/>
+        </w:rPr>
+        <w:t>Mavzuning dolzarbligi</w:t>
+      </w:r>
+    </w:p>
+    <w:p>
+      <w:pPr>
         <w:pStyle w:val="12"/>
         <w:keepNext w:val="0"/>
         <w:keepLines w:val="0"/>
@@ -2960,6 +2993,34 @@
     </w:p>
     <w:p>
       <w:pPr>
+        <w:keepNext w:val="0"/>
+        <w:keepLines w:val="0"/>
+        <w:widowControl/>
+        <w:suppressLineNumbers w:val="0"/>
+        <w:spacing w:line="360" w:lineRule="auto"/>
+        <w:jc w:val="both"/>
+        <w:outlineLvl w:val="9"/>
+        <w:rPr>
+          <w:rFonts w:hint="default" w:ascii="Times New Roman" w:hAnsi="Times New Roman" w:cs="Times New Roman"/>
+          <w:b/>
+          <w:bCs/>
+          <w:sz w:val="28"/>
+          <w:szCs w:val="28"/>
+        </w:rPr>
+      </w:pPr>
+      <w:r>
+        <w:rPr>
+          <w:rFonts w:hint="default" w:ascii="Times New Roman" w:hAnsi="Times New Roman" w:cs="Times New Roman"/>
+          <w:b/>
+          <w:bCs/>
+          <w:sz w:val="28"/>
+          <w:szCs w:val="28"/>
+        </w:rPr>
+        <w:t>Tadqiqotning maqsadi</w:t>
+      </w:r>
+    </w:p>
+    <w:p>
+      <w:pPr>
         <w:pStyle w:val="12"/>
         <w:keepNext w:val="0"/>
         <w:keepLines w:val="0"/>
@@ -2985,6 +3046,34 @@
     </w:p>
     <w:p>
       <w:pPr>
+        <w:keepNext w:val="0"/>
+        <w:keepLines w:val="0"/>
+        <w:widowControl/>
+        <w:suppressLineNumbers w:val="0"/>
+        <w:spacing w:line="360" w:lineRule="auto"/>
+        <w:jc w:val="both"/>
+        <w:outlineLvl w:val="9"/>
+        <w:rPr>
+          <w:rFonts w:hint="default" w:ascii="Times New Roman" w:hAnsi="Times New Roman" w:cs="Times New Roman"/>
+          <w:b/>
+          <w:bCs/>
+          <w:sz w:val="28"/>
+          <w:szCs w:val="28"/>
+        </w:rPr>
+      </w:pPr>
+      <w:r>
+        <w:rPr>
+          <w:rFonts w:hint="default" w:ascii="Times New Roman" w:hAnsi="Times New Roman" w:cs="Times New Roman"/>
+          <w:b/>
+          <w:bCs/>
+          <w:sz w:val="28"/>
+          <w:szCs w:val="28"/>
+        </w:rPr>
+        <w:t>Tadqiqot vazifalari</w:t>
+      </w:r>
+    </w:p>
+    <w:p>
+      <w:pPr>
         <w:pStyle w:val="12"/>
         <w:keepNext w:val="0"/>
         <w:keepLines w:val="0"/>
@@ -3009,245 +3098,371 @@
     </w:p>
     <w:p>
       <w:pPr>
-        <w:keepNext w:val="0"/>
-        <w:keepLines w:val="0"/>
-        <w:widowControl/>
-        <w:numPr>
-          <w:ilvl w:val="0"/>
-          <w:numId w:val="1"/>
-        </w:numPr>
-        <w:suppressLineNumbers w:val="0"/>
-        <w:spacing w:before="0" w:beforeAutospacing="1" w:after="0" w:afterAutospacing="1" w:line="360" w:lineRule="auto"/>
-        <w:ind w:left="420" w:leftChars="0" w:hanging="420" w:firstLineChars="0"/>
-        <w:jc w:val="both"/>
-        <w:rPr>
-          <w:rFonts w:hint="default" w:ascii="Times New Roman" w:hAnsi="Times New Roman" w:cs="Times New Roman"/>
-          <w:sz w:val="28"/>
-          <w:szCs w:val="28"/>
-        </w:rPr>
-      </w:pPr>
-      <w:r>
-        <w:rPr>
-          <w:rFonts w:hint="default" w:ascii="Times New Roman" w:hAnsi="Times New Roman" w:cs="Times New Roman"/>
-          <w:sz w:val="28"/>
-          <w:szCs w:val="28"/>
-        </w:rPr>
-        <w:t xml:space="preserve">masofaviy ta’limning nazariy asoslarini o‘rganish; </w:t>
-      </w:r>
-    </w:p>
-    <w:p>
-      <w:pPr>
-        <w:keepNext w:val="0"/>
-        <w:keepLines w:val="0"/>
-        <w:widowControl/>
-        <w:numPr>
-          <w:ilvl w:val="0"/>
-          <w:numId w:val="1"/>
-        </w:numPr>
-        <w:suppressLineNumbers w:val="0"/>
-        <w:spacing w:before="0" w:beforeAutospacing="1" w:after="0" w:afterAutospacing="1" w:line="360" w:lineRule="auto"/>
-        <w:ind w:left="420" w:leftChars="0" w:hanging="420" w:firstLineChars="0"/>
-        <w:jc w:val="both"/>
-        <w:rPr>
-          <w:rFonts w:hint="default" w:ascii="Times New Roman" w:hAnsi="Times New Roman" w:cs="Times New Roman"/>
-          <w:sz w:val="28"/>
-          <w:szCs w:val="28"/>
-        </w:rPr>
-      </w:pPr>
-      <w:r>
-        <w:rPr>
-          <w:rFonts w:hint="default" w:ascii="Times New Roman" w:hAnsi="Times New Roman" w:cs="Times New Roman"/>
-          <w:sz w:val="28"/>
-          <w:szCs w:val="28"/>
-        </w:rPr>
-        <w:t xml:space="preserve">mavjud masofaviy ta’lim platformalarini tahlil qilish; </w:t>
-      </w:r>
-    </w:p>
-    <w:p>
-      <w:pPr>
-        <w:keepNext w:val="0"/>
-        <w:keepLines w:val="0"/>
-        <w:widowControl/>
-        <w:numPr>
-          <w:ilvl w:val="0"/>
-          <w:numId w:val="1"/>
-        </w:numPr>
-        <w:suppressLineNumbers w:val="0"/>
-        <w:spacing w:before="0" w:beforeAutospacing="1" w:after="0" w:afterAutospacing="1" w:line="360" w:lineRule="auto"/>
-        <w:ind w:left="420" w:leftChars="0" w:hanging="420" w:firstLineChars="0"/>
-        <w:jc w:val="both"/>
-        <w:rPr>
-          <w:rFonts w:hint="default" w:ascii="Times New Roman" w:hAnsi="Times New Roman" w:cs="Times New Roman"/>
-          <w:sz w:val="28"/>
-          <w:szCs w:val="28"/>
-        </w:rPr>
-      </w:pPr>
-      <w:r>
-        <w:rPr>
-          <w:rFonts w:hint="default" w:ascii="Times New Roman" w:hAnsi="Times New Roman" w:cs="Times New Roman"/>
-          <w:sz w:val="28"/>
-          <w:szCs w:val="28"/>
-        </w:rPr>
-        <w:t xml:space="preserve">tuman maktablarida informatika fanini o‘qitish holatini o‘rganish; </w:t>
-      </w:r>
-    </w:p>
-    <w:p>
-      <w:pPr>
-        <w:keepNext w:val="0"/>
-        <w:keepLines w:val="0"/>
-        <w:widowControl/>
-        <w:numPr>
-          <w:ilvl w:val="0"/>
-          <w:numId w:val="1"/>
-        </w:numPr>
-        <w:suppressLineNumbers w:val="0"/>
-        <w:spacing w:before="0" w:beforeAutospacing="1" w:after="0" w:afterAutospacing="1" w:line="360" w:lineRule="auto"/>
-        <w:ind w:left="420" w:leftChars="0" w:hanging="420" w:firstLineChars="0"/>
-        <w:jc w:val="both"/>
-        <w:rPr>
-          <w:rFonts w:hint="default" w:ascii="Times New Roman" w:hAnsi="Times New Roman" w:cs="Times New Roman"/>
-          <w:sz w:val="28"/>
-          <w:szCs w:val="28"/>
-        </w:rPr>
-      </w:pPr>
-      <w:r>
-        <w:rPr>
-          <w:rFonts w:hint="default" w:ascii="Times New Roman" w:hAnsi="Times New Roman" w:cs="Times New Roman"/>
-          <w:sz w:val="28"/>
-          <w:szCs w:val="28"/>
-        </w:rPr>
-        <w:t xml:space="preserve">masofaviy ta’limni tashkil etish metodikasini ishlab chiqish; </w:t>
-      </w:r>
-    </w:p>
-    <w:p>
-      <w:pPr>
-        <w:keepNext w:val="0"/>
-        <w:keepLines w:val="0"/>
-        <w:widowControl/>
-        <w:numPr>
-          <w:ilvl w:val="0"/>
-          <w:numId w:val="1"/>
-        </w:numPr>
-        <w:suppressLineNumbers w:val="0"/>
-        <w:spacing w:before="0" w:beforeAutospacing="1" w:after="0" w:afterAutospacing="1" w:line="360" w:lineRule="auto"/>
-        <w:ind w:left="420" w:leftChars="0" w:hanging="420" w:firstLineChars="0"/>
-        <w:jc w:val="both"/>
-        <w:rPr>
-          <w:rFonts w:hint="default" w:ascii="Times New Roman" w:hAnsi="Times New Roman" w:cs="Times New Roman"/>
-          <w:sz w:val="28"/>
-          <w:szCs w:val="28"/>
-        </w:rPr>
-      </w:pPr>
-      <w:r>
-        <w:rPr>
-          <w:rFonts w:hint="default" w:ascii="Times New Roman" w:hAnsi="Times New Roman" w:cs="Times New Roman"/>
-          <w:sz w:val="28"/>
-          <w:szCs w:val="28"/>
-        </w:rPr>
-        <w:t xml:space="preserve">o‘quv jarayoniga mos platforma loyihasini yaratish; </w:t>
-      </w:r>
-    </w:p>
-    <w:p>
-      <w:pPr>
-        <w:keepNext w:val="0"/>
-        <w:keepLines w:val="0"/>
-        <w:widowControl/>
-        <w:numPr>
-          <w:ilvl w:val="0"/>
-          <w:numId w:val="1"/>
-        </w:numPr>
-        <w:suppressLineNumbers w:val="0"/>
-        <w:spacing w:before="0" w:beforeAutospacing="1" w:after="0" w:afterAutospacing="1" w:line="360" w:lineRule="auto"/>
-        <w:ind w:left="420" w:leftChars="0" w:hanging="420" w:firstLineChars="0"/>
-        <w:jc w:val="both"/>
-        <w:rPr>
-          <w:rFonts w:hint="default" w:ascii="Times New Roman" w:hAnsi="Times New Roman" w:cs="Times New Roman"/>
-          <w:sz w:val="28"/>
-          <w:szCs w:val="28"/>
-        </w:rPr>
-      </w:pPr>
-      <w:r>
-        <w:rPr>
-          <w:rFonts w:hint="default" w:ascii="Times New Roman" w:hAnsi="Times New Roman" w:cs="Times New Roman"/>
-          <w:sz w:val="28"/>
-          <w:szCs w:val="28"/>
-        </w:rPr>
-        <w:t xml:space="preserve">yaratilgan tizimni amaliy jihatdan sinovdan o‘tkazish va natijalarini tahlil qilish. </w:t>
-      </w:r>
-    </w:p>
-    <w:p>
-      <w:pPr>
-        <w:pStyle w:val="12"/>
-        <w:keepNext w:val="0"/>
-        <w:keepLines w:val="0"/>
-        <w:widowControl/>
-        <w:suppressLineNumbers w:val="0"/>
-        <w:spacing w:line="360" w:lineRule="auto"/>
-        <w:ind w:firstLine="720" w:firstLineChars="0"/>
-        <w:jc w:val="both"/>
-        <w:rPr>
-          <w:rFonts w:hint="default" w:ascii="Times New Roman" w:hAnsi="Times New Roman" w:cs="Times New Roman"/>
-          <w:sz w:val="28"/>
-          <w:szCs w:val="28"/>
-        </w:rPr>
-      </w:pPr>
-      <w:r>
-        <w:rPr>
-          <w:rFonts w:hint="default" w:ascii="Times New Roman" w:hAnsi="Times New Roman" w:cs="Times New Roman"/>
-          <w:sz w:val="28"/>
-          <w:szCs w:val="28"/>
-        </w:rPr>
-        <w:t>Tadqiqot obyekti sifatida tuman maktablarida informatika fanini o‘qitish jarayoni olindi. Tadqiqot predmeti esa informatika darslarida masofaviy ta’lim platformalarini tashkil etish metodikasi va texnologiyalari hisoblanadi.</w:t>
-      </w:r>
-    </w:p>
-    <w:p>
-      <w:pPr>
-        <w:pStyle w:val="12"/>
-        <w:keepNext w:val="0"/>
-        <w:keepLines w:val="0"/>
-        <w:widowControl/>
-        <w:suppressLineNumbers w:val="0"/>
-        <w:spacing w:line="360" w:lineRule="auto"/>
-        <w:ind w:firstLine="720" w:firstLineChars="0"/>
-        <w:jc w:val="both"/>
-        <w:rPr>
-          <w:rFonts w:hint="default" w:ascii="Times New Roman" w:hAnsi="Times New Roman" w:cs="Times New Roman"/>
-          <w:sz w:val="28"/>
-          <w:szCs w:val="28"/>
-        </w:rPr>
-      </w:pPr>
-      <w:r>
-        <w:rPr>
-          <w:rFonts w:hint="default" w:ascii="Times New Roman" w:hAnsi="Times New Roman" w:cs="Times New Roman"/>
-          <w:sz w:val="28"/>
-          <w:szCs w:val="28"/>
-        </w:rPr>
-        <w:t>Mazkur diplom ishining ilmiy yangiligi shundan iboratki, unda tuman maktablari sharoitiga moslashtirilgan masofaviy ta’lim platformasi modeli ishlab chiqiladi va informatika fanini o‘qitishda qo‘llash uchun metodik tavsiyalar beriladi. Bundan tashqari, o‘quvchilarni baholashning zamonaviy usullari, jumladan kunlik reyting tizimi asosida monitoring qilish mexanizmi taklif etiladi.</w:t>
-      </w:r>
-    </w:p>
-    <w:p>
-      <w:pPr>
-        <w:pStyle w:val="12"/>
-        <w:keepNext w:val="0"/>
-        <w:keepLines w:val="0"/>
-        <w:widowControl/>
-        <w:suppressLineNumbers w:val="0"/>
-        <w:spacing w:line="360" w:lineRule="auto"/>
-        <w:ind w:firstLine="720" w:firstLineChars="0"/>
-        <w:jc w:val="both"/>
-        <w:rPr>
-          <w:rFonts w:hint="default" w:ascii="Times New Roman" w:hAnsi="Times New Roman" w:cs="Times New Roman"/>
-          <w:sz w:val="28"/>
-          <w:szCs w:val="28"/>
-        </w:rPr>
-      </w:pPr>
-      <w:r>
-        <w:rPr>
-          <w:rFonts w:hint="default" w:ascii="Times New Roman" w:hAnsi="Times New Roman" w:cs="Times New Roman"/>
-          <w:sz w:val="28"/>
-          <w:szCs w:val="28"/>
-        </w:rPr>
-        <w:t>Ishning amaliy ahamiyati shundaki, ishlab chiqilgan platforma modeli va metodik tavsiyalar tuman maktablarida informatika fanini samarali o‘qitishda qo‘llanishi mumkin. Shuningdek, ushbu loyiha orqali o‘qituvchilar o‘z darslarini raqamli muhitga moslashtirish imkoniyatiga ega bo‘ladilar, o‘quvchilar esa bilimlarni mustaqil ravishda egallash va o‘zlashtirish darajasini oshirishlari mumkin bo‘ladi.</w:t>
+        <w:pStyle w:val="12"/>
+        <w:keepNext w:val="0"/>
+        <w:keepLines w:val="0"/>
+        <w:widowControl/>
+        <w:suppressLineNumbers w:val="0"/>
+        <w:spacing w:line="360" w:lineRule="auto"/>
+        <w:jc w:val="both"/>
+        <w:rPr>
+          <w:rFonts w:hint="default" w:ascii="Times New Roman" w:hAnsi="Times New Roman" w:cs="Times New Roman"/>
+          <w:sz w:val="28"/>
+          <w:szCs w:val="28"/>
+        </w:rPr>
+      </w:pPr>
+      <w:r>
+        <w:rPr>
+          <w:rFonts w:hint="default" w:ascii="Times New Roman" w:hAnsi="Times New Roman" w:cs="Times New Roman"/>
+          <w:sz w:val="28"/>
+          <w:szCs w:val="28"/>
+        </w:rPr>
+        <w:t> masofaviy ta’limning nazariy asoslarini o‘rganish;</w:t>
+      </w:r>
+      <w:r>
+        <w:rPr>
+          <w:rFonts w:hint="default" w:ascii="Times New Roman" w:hAnsi="Times New Roman" w:cs="Times New Roman"/>
+          <w:sz w:val="28"/>
+          <w:szCs w:val="28"/>
+        </w:rPr>
+        <w:br w:type="textWrapping"/>
+      </w:r>
+      <w:r>
+        <w:rPr>
+          <w:rFonts w:hint="default" w:ascii="Times New Roman" w:hAnsi="Times New Roman" w:cs="Times New Roman"/>
+          <w:sz w:val="28"/>
+          <w:szCs w:val="28"/>
+        </w:rPr>
+        <w:t> mavjud masofaviy ta’lim platformalarini tahlil qilish;</w:t>
+      </w:r>
+      <w:r>
+        <w:rPr>
+          <w:rFonts w:hint="default" w:ascii="Times New Roman" w:hAnsi="Times New Roman" w:cs="Times New Roman"/>
+          <w:sz w:val="28"/>
+          <w:szCs w:val="28"/>
+        </w:rPr>
+        <w:br w:type="textWrapping"/>
+      </w:r>
+      <w:r>
+        <w:rPr>
+          <w:rFonts w:hint="default" w:ascii="Times New Roman" w:hAnsi="Times New Roman" w:cs="Times New Roman"/>
+          <w:sz w:val="28"/>
+          <w:szCs w:val="28"/>
+        </w:rPr>
+        <w:t> tuman maktablarida informatika fanini o‘qitish holatini o‘rganish;</w:t>
+      </w:r>
+      <w:r>
+        <w:rPr>
+          <w:rFonts w:hint="default" w:ascii="Times New Roman" w:hAnsi="Times New Roman" w:cs="Times New Roman"/>
+          <w:sz w:val="28"/>
+          <w:szCs w:val="28"/>
+        </w:rPr>
+        <w:br w:type="textWrapping"/>
+      </w:r>
+      <w:r>
+        <w:rPr>
+          <w:rFonts w:hint="default" w:ascii="Times New Roman" w:hAnsi="Times New Roman" w:cs="Times New Roman"/>
+          <w:sz w:val="28"/>
+          <w:szCs w:val="28"/>
+        </w:rPr>
+        <w:t> masofaviy ta’limni tashkil etish metodikasini ishlab chiqish;</w:t>
+      </w:r>
+      <w:r>
+        <w:rPr>
+          <w:rFonts w:hint="default" w:ascii="Times New Roman" w:hAnsi="Times New Roman" w:cs="Times New Roman"/>
+          <w:sz w:val="28"/>
+          <w:szCs w:val="28"/>
+        </w:rPr>
+        <w:br w:type="textWrapping"/>
+      </w:r>
+      <w:r>
+        <w:rPr>
+          <w:rFonts w:hint="default" w:ascii="Times New Roman" w:hAnsi="Times New Roman" w:cs="Times New Roman"/>
+          <w:sz w:val="28"/>
+          <w:szCs w:val="28"/>
+        </w:rPr>
+        <w:t> o‘quv jarayoniga mos platforma loyihasini yaratish;</w:t>
+      </w:r>
+      <w:r>
+        <w:rPr>
+          <w:rFonts w:hint="default" w:ascii="Times New Roman" w:hAnsi="Times New Roman" w:cs="Times New Roman"/>
+          <w:sz w:val="28"/>
+          <w:szCs w:val="28"/>
+        </w:rPr>
+        <w:br w:type="textWrapping"/>
+      </w:r>
+      <w:r>
+        <w:rPr>
+          <w:rFonts w:hint="default" w:ascii="Times New Roman" w:hAnsi="Times New Roman" w:cs="Times New Roman"/>
+          <w:sz w:val="28"/>
+          <w:szCs w:val="28"/>
+        </w:rPr>
+        <w:t> yaratilgan tizimni amaliy jihatdan sinovdan o‘tkazish va natijalarini tahlil qilish.</w:t>
+      </w:r>
+    </w:p>
+    <w:p>
+      <w:pPr>
+        <w:keepNext w:val="0"/>
+        <w:keepLines w:val="0"/>
+        <w:widowControl/>
+        <w:suppressLineNumbers w:val="0"/>
+        <w:spacing w:line="360" w:lineRule="auto"/>
+        <w:jc w:val="both"/>
+        <w:outlineLvl w:val="9"/>
+        <w:rPr>
+          <w:rFonts w:hint="default" w:ascii="Times New Roman" w:hAnsi="Times New Roman" w:cs="Times New Roman"/>
+          <w:b/>
+          <w:bCs/>
+          <w:sz w:val="28"/>
+          <w:szCs w:val="28"/>
+        </w:rPr>
+      </w:pPr>
+      <w:r>
+        <w:rPr>
+          <w:rFonts w:hint="default" w:ascii="Times New Roman" w:hAnsi="Times New Roman" w:cs="Times New Roman"/>
+          <w:b/>
+          <w:bCs/>
+          <w:sz w:val="28"/>
+          <w:szCs w:val="28"/>
+        </w:rPr>
+        <w:t>Tadqiqot obyekti</w:t>
+      </w:r>
+    </w:p>
+    <w:p>
+      <w:pPr>
+        <w:pStyle w:val="12"/>
+        <w:keepNext w:val="0"/>
+        <w:keepLines w:val="0"/>
+        <w:widowControl/>
+        <w:suppressLineNumbers w:val="0"/>
+        <w:spacing w:line="360" w:lineRule="auto"/>
+        <w:ind w:firstLine="720" w:firstLineChars="0"/>
+        <w:jc w:val="both"/>
+        <w:rPr>
+          <w:rFonts w:hint="default" w:ascii="Times New Roman" w:hAnsi="Times New Roman" w:cs="Times New Roman"/>
+          <w:sz w:val="28"/>
+          <w:szCs w:val="28"/>
+        </w:rPr>
+      </w:pPr>
+      <w:r>
+        <w:rPr>
+          <w:rFonts w:hint="default" w:ascii="Times New Roman" w:hAnsi="Times New Roman" w:cs="Times New Roman"/>
+          <w:sz w:val="28"/>
+          <w:szCs w:val="28"/>
+        </w:rPr>
+        <w:t>Tadqiqot obyekti sifatida tuman maktablarida informatika fanini o‘qitish jarayoni olindi.</w:t>
+      </w:r>
+    </w:p>
+    <w:p>
+      <w:pPr>
+        <w:keepNext w:val="0"/>
+        <w:keepLines w:val="0"/>
+        <w:widowControl/>
+        <w:suppressLineNumbers w:val="0"/>
+        <w:spacing w:line="360" w:lineRule="auto"/>
+        <w:jc w:val="both"/>
+        <w:outlineLvl w:val="9"/>
+        <w:rPr>
+          <w:rFonts w:hint="default" w:ascii="Times New Roman" w:hAnsi="Times New Roman" w:cs="Times New Roman"/>
+          <w:b/>
+          <w:bCs/>
+          <w:sz w:val="28"/>
+          <w:szCs w:val="28"/>
+        </w:rPr>
+      </w:pPr>
+      <w:r>
+        <w:rPr>
+          <w:rFonts w:hint="default" w:ascii="Times New Roman" w:hAnsi="Times New Roman" w:cs="Times New Roman"/>
+          <w:b/>
+          <w:bCs/>
+          <w:sz w:val="28"/>
+          <w:szCs w:val="28"/>
+        </w:rPr>
+        <w:t>Tadqiqot predmeti</w:t>
+      </w:r>
+    </w:p>
+    <w:p>
+      <w:pPr>
+        <w:pStyle w:val="12"/>
+        <w:keepNext w:val="0"/>
+        <w:keepLines w:val="0"/>
+        <w:widowControl/>
+        <w:suppressLineNumbers w:val="0"/>
+        <w:spacing w:line="360" w:lineRule="auto"/>
+        <w:ind w:firstLine="720" w:firstLineChars="0"/>
+        <w:jc w:val="both"/>
+        <w:rPr>
+          <w:rFonts w:hint="default" w:ascii="Times New Roman" w:hAnsi="Times New Roman" w:cs="Times New Roman"/>
+          <w:sz w:val="28"/>
+          <w:szCs w:val="28"/>
+        </w:rPr>
+      </w:pPr>
+      <w:r>
+        <w:rPr>
+          <w:rFonts w:hint="default" w:ascii="Times New Roman" w:hAnsi="Times New Roman" w:cs="Times New Roman"/>
+          <w:sz w:val="28"/>
+          <w:szCs w:val="28"/>
+        </w:rPr>
+        <w:t>Tadqiqot predmeti informatika darslarida masofaviy ta’lim platformalarini tashkil etish metodikasi va texnologiyalaridan iborat.</w:t>
+      </w:r>
+    </w:p>
+    <w:p>
+      <w:pPr>
+        <w:keepNext w:val="0"/>
+        <w:keepLines w:val="0"/>
+        <w:widowControl/>
+        <w:suppressLineNumbers w:val="0"/>
+        <w:spacing w:line="360" w:lineRule="auto"/>
+        <w:jc w:val="both"/>
+        <w:outlineLvl w:val="9"/>
+        <w:rPr>
+          <w:rFonts w:hint="default" w:ascii="Times New Roman" w:hAnsi="Times New Roman" w:cs="Times New Roman"/>
+          <w:b/>
+          <w:bCs/>
+          <w:sz w:val="28"/>
+          <w:szCs w:val="28"/>
+        </w:rPr>
+      </w:pPr>
+      <w:r>
+        <w:rPr>
+          <w:rFonts w:hint="default" w:ascii="Times New Roman" w:hAnsi="Times New Roman" w:cs="Times New Roman"/>
+          <w:b/>
+          <w:bCs/>
+          <w:sz w:val="28"/>
+          <w:szCs w:val="28"/>
+        </w:rPr>
+        <w:t>Tadqiqot metodlari</w:t>
+      </w:r>
+    </w:p>
+    <w:p>
+      <w:pPr>
+        <w:pStyle w:val="12"/>
+        <w:keepNext w:val="0"/>
+        <w:keepLines w:val="0"/>
+        <w:widowControl/>
+        <w:suppressLineNumbers w:val="0"/>
+        <w:spacing w:line="360" w:lineRule="auto"/>
+        <w:ind w:firstLine="720" w:firstLineChars="0"/>
+        <w:jc w:val="both"/>
+        <w:rPr>
+          <w:rFonts w:hint="default" w:ascii="Times New Roman" w:hAnsi="Times New Roman" w:cs="Times New Roman"/>
+          <w:sz w:val="28"/>
+          <w:szCs w:val="28"/>
+        </w:rPr>
+      </w:pPr>
+      <w:r>
+        <w:rPr>
+          <w:rFonts w:hint="default" w:ascii="Times New Roman" w:hAnsi="Times New Roman" w:cs="Times New Roman"/>
+          <w:sz w:val="28"/>
+          <w:szCs w:val="28"/>
+        </w:rPr>
+        <w:t>Tadqiqot jarayonida pedagogik kuzatish, taqqoslash, tahlil qilish, suhbat, anketa so‘rovi, tajriba-sinov ishlari hamda axborot texnologiyalariga oid ilmiy-uslubiy manbalarni o‘rganish metodlaridan foydalanildi.</w:t>
+      </w:r>
+    </w:p>
+    <w:p>
+      <w:pPr>
+        <w:keepNext w:val="0"/>
+        <w:keepLines w:val="0"/>
+        <w:widowControl/>
+        <w:suppressLineNumbers w:val="0"/>
+        <w:spacing w:line="360" w:lineRule="auto"/>
+        <w:jc w:val="both"/>
+        <w:outlineLvl w:val="9"/>
+        <w:rPr>
+          <w:rFonts w:hint="default" w:ascii="Times New Roman" w:hAnsi="Times New Roman" w:cs="Times New Roman"/>
+          <w:b/>
+          <w:bCs/>
+          <w:sz w:val="28"/>
+          <w:szCs w:val="28"/>
+        </w:rPr>
+      </w:pPr>
+      <w:r>
+        <w:rPr>
+          <w:rFonts w:hint="default" w:ascii="Times New Roman" w:hAnsi="Times New Roman" w:cs="Times New Roman"/>
+          <w:b/>
+          <w:bCs/>
+          <w:sz w:val="28"/>
+          <w:szCs w:val="28"/>
+        </w:rPr>
+        <w:t>Tadqiqotning ilmiy yangiligi</w:t>
+      </w:r>
+    </w:p>
+    <w:p>
+      <w:pPr>
+        <w:pStyle w:val="12"/>
+        <w:keepNext w:val="0"/>
+        <w:keepLines w:val="0"/>
+        <w:widowControl/>
+        <w:suppressLineNumbers w:val="0"/>
+        <w:spacing w:line="360" w:lineRule="auto"/>
+        <w:ind w:firstLine="720" w:firstLineChars="0"/>
+        <w:jc w:val="both"/>
+        <w:rPr>
+          <w:rFonts w:hint="default" w:ascii="Times New Roman" w:hAnsi="Times New Roman" w:cs="Times New Roman"/>
+          <w:sz w:val="28"/>
+          <w:szCs w:val="28"/>
+        </w:rPr>
+      </w:pPr>
+      <w:r>
+        <w:rPr>
+          <w:rFonts w:hint="default" w:ascii="Times New Roman" w:hAnsi="Times New Roman" w:cs="Times New Roman"/>
+          <w:sz w:val="28"/>
+          <w:szCs w:val="28"/>
+        </w:rPr>
+        <w:t>Mazkur diplom ishining ilmiy yangiligi shundan iboratki, unda tuman maktablari sharoitiga moslashtirilgan masofaviy ta’lim platformasi modeli ishlab chiqildi hamda informatika fanini o‘qitishda undan samarali foydalanish metodikasi taklif etildi. Shuningdek, o‘quvchilarning bilimini monitoring qilish va baholashning zamonaviy reyting tizimiga asoslangan mexanizmi ishlab chiqildi.</w:t>
+      </w:r>
+    </w:p>
+    <w:p>
+      <w:pPr>
+        <w:keepNext w:val="0"/>
+        <w:keepLines w:val="0"/>
+        <w:widowControl/>
+        <w:suppressLineNumbers w:val="0"/>
+        <w:spacing w:line="360" w:lineRule="auto"/>
+        <w:jc w:val="both"/>
+        <w:outlineLvl w:val="9"/>
+        <w:rPr>
+          <w:rFonts w:hint="default" w:ascii="Times New Roman" w:hAnsi="Times New Roman" w:cs="Times New Roman"/>
+          <w:b/>
+          <w:bCs/>
+          <w:sz w:val="28"/>
+          <w:szCs w:val="28"/>
+        </w:rPr>
+      </w:pPr>
+      <w:r>
+        <w:rPr>
+          <w:rFonts w:hint="default" w:ascii="Times New Roman" w:hAnsi="Times New Roman" w:cs="Times New Roman"/>
+          <w:b/>
+          <w:bCs/>
+          <w:sz w:val="28"/>
+          <w:szCs w:val="28"/>
+        </w:rPr>
+        <w:t>Tadqiqotning amaliy ahamiyati</w:t>
+      </w:r>
+    </w:p>
+    <w:p>
+      <w:pPr>
+        <w:pStyle w:val="12"/>
+        <w:keepNext w:val="0"/>
+        <w:keepLines w:val="0"/>
+        <w:widowControl/>
+        <w:suppressLineNumbers w:val="0"/>
+        <w:spacing w:line="360" w:lineRule="auto"/>
+        <w:ind w:firstLine="720" w:firstLineChars="0"/>
+        <w:jc w:val="both"/>
+        <w:rPr>
+          <w:rFonts w:hint="default" w:ascii="Times New Roman" w:hAnsi="Times New Roman" w:cs="Times New Roman"/>
+          <w:sz w:val="28"/>
+          <w:szCs w:val="28"/>
+        </w:rPr>
+      </w:pPr>
+      <w:r>
+        <w:rPr>
+          <w:rFonts w:hint="default" w:ascii="Times New Roman" w:hAnsi="Times New Roman" w:cs="Times New Roman"/>
+          <w:sz w:val="28"/>
+          <w:szCs w:val="28"/>
+        </w:rPr>
+        <w:t>Tadqiqotning amaliy ahamiyati shundaki, ishlab chiqilgan platforma modeli va metodik tavsiyalar umumta’lim maktablarida informatika fanini o‘qitish jarayonida qo‘llanishi mumkin. Mazkur tavsiyalar o‘qituvchilarga darslarni zamonaviy raqamli muhit asosida tashkil etish imkonini beradi. Shuningdek, o‘quvchilar bilimlarni mustaqil ravishda egallash va o‘zlashtirish darajasini oshirish imkoniyatiga ega bo‘ladilar.</w:t>
       </w:r>
     </w:p>
     <w:p>
@@ -3302,6 +3517,76 @@
     </w:p>
     <w:p>
       <w:pPr>
+        <w:keepNext w:val="0"/>
+        <w:keepLines w:val="0"/>
+        <w:widowControl/>
+        <w:suppressLineNumbers w:val="0"/>
+        <w:spacing w:line="360" w:lineRule="auto"/>
+        <w:jc w:val="both"/>
+        <w:outlineLvl w:val="9"/>
+        <w:rPr>
+          <w:rFonts w:hint="default" w:ascii="Times New Roman" w:hAnsi="Times New Roman" w:cs="Times New Roman"/>
+          <w:b/>
+          <w:bCs/>
+          <w:sz w:val="28"/>
+          <w:szCs w:val="28"/>
+        </w:rPr>
+      </w:pPr>
+      <w:r>
+        <w:rPr>
+          <w:rFonts w:hint="default" w:ascii="Times New Roman" w:hAnsi="Times New Roman" w:cs="Times New Roman"/>
+          <w:b/>
+          <w:bCs/>
+          <w:sz w:val="28"/>
+          <w:szCs w:val="28"/>
+        </w:rPr>
+        <w:t>Ishning tuzilishi</w:t>
+      </w:r>
+    </w:p>
+    <w:p>
+      <w:pPr>
+        <w:pStyle w:val="12"/>
+        <w:keepNext w:val="0"/>
+        <w:keepLines w:val="0"/>
+        <w:widowControl/>
+        <w:suppressLineNumbers w:val="0"/>
+        <w:spacing w:line="360" w:lineRule="auto"/>
+        <w:ind w:firstLine="720" w:firstLineChars="0"/>
+        <w:jc w:val="both"/>
+        <w:rPr>
+          <w:rFonts w:hint="default" w:ascii="Times New Roman" w:hAnsi="Times New Roman" w:cs="Times New Roman"/>
+          <w:sz w:val="28"/>
+          <w:szCs w:val="28"/>
+        </w:rPr>
+      </w:pPr>
+      <w:r>
+        <w:rPr>
+          <w:rFonts w:hint="default" w:ascii="Times New Roman" w:hAnsi="Times New Roman" w:cs="Times New Roman"/>
+          <w:sz w:val="28"/>
+          <w:szCs w:val="28"/>
+        </w:rPr>
+        <w:t xml:space="preserve">Diplom ishi kirish, </w:t>
+      </w:r>
+      <w:r>
+        <w:rPr>
+          <w:rFonts w:hint="default" w:ascii="Times New Roman" w:hAnsi="Times New Roman" w:cs="Times New Roman"/>
+          <w:sz w:val="28"/>
+          <w:szCs w:val="28"/>
+          <w:lang w:val="en-GB"/>
+        </w:rPr>
+        <w:t xml:space="preserve">to’rt </w:t>
+      </w:r>
+      <w:r>
+        <w:rPr>
+          <w:rFonts w:hint="default" w:ascii="Times New Roman" w:hAnsi="Times New Roman" w:cs="Times New Roman"/>
+          <w:sz w:val="28"/>
+          <w:szCs w:val="28"/>
+        </w:rPr>
+        <w:t>bob, xulosa, foydalanilgan adabiyotlar ro‘yxati va ilovalardan iborat.</w:t>
+      </w:r>
+    </w:p>
+    <w:p>
+      <w:pPr>
         <w:pStyle w:val="12"/>
         <w:keepNext w:val="0"/>
         <w:keepLines w:val="0"/>
@@ -3327,6 +3612,8 @@
     </w:p>
     <w:p>
       <w:pPr>
+        <w:spacing w:line="360" w:lineRule="auto"/>
+        <w:jc w:val="both"/>
         <w:rPr>
           <w:rStyle w:val="13"/>
           <w:rFonts w:hint="default" w:ascii="Times New Roman" w:hAnsi="Times New Roman" w:cs="Times New Roman"/>
@@ -3336,11 +3623,6 @@
           <w:szCs w:val="28"/>
         </w:rPr>
       </w:pPr>
-      <w:bookmarkStart w:id="7" w:name="_Toc9986"/>
-      <w:bookmarkStart w:id="8" w:name="_Toc4640"/>
-      <w:bookmarkStart w:id="9" w:name="_Toc5295"/>
-      <w:bookmarkStart w:id="10" w:name="_Toc22652"/>
-      <w:bookmarkStart w:id="11" w:name="_Toc13329"/>
       <w:r>
         <w:rPr>
           <w:rStyle w:val="13"/>
@@ -3369,8 +3651,8 @@
           <w:szCs w:val="28"/>
         </w:rPr>
       </w:pPr>
-      <w:bookmarkStart w:id="12" w:name="_Toc32216"/>
-      <w:bookmarkStart w:id="13" w:name="_Toc3411"/>
+      <w:bookmarkStart w:id="12" w:name="_Toc3411"/>
+      <w:bookmarkStart w:id="13" w:name="_Toc32216"/>
       <w:r>
         <w:rPr>
           <w:rStyle w:val="13"/>
@@ -3395,7 +3677,7 @@
         <w:pStyle w:val="3"/>
         <w:numPr>
           <w:ilvl w:val="1"/>
-          <w:numId w:val="2"/>
+          <w:numId w:val="1"/>
         </w:numPr>
         <w:bidi w:val="0"/>
         <w:rPr>
@@ -3404,10 +3686,10 @@
           <w:szCs w:val="28"/>
         </w:rPr>
       </w:pPr>
-      <w:bookmarkStart w:id="14" w:name="_Toc23775"/>
-      <w:bookmarkStart w:id="15" w:name="_Toc19546"/>
-      <w:bookmarkStart w:id="16" w:name="_Toc3836"/>
-      <w:bookmarkStart w:id="17" w:name="_Toc8819"/>
+      <w:bookmarkStart w:id="14" w:name="_Toc3836"/>
+      <w:bookmarkStart w:id="15" w:name="_Toc8819"/>
+      <w:bookmarkStart w:id="16" w:name="_Toc19546"/>
+      <w:bookmarkStart w:id="17" w:name="_Toc23775"/>
       <w:r>
         <w:rPr>
           <w:rFonts w:hint="default" w:ascii="Times New Roman" w:hAnsi="Times New Roman" w:cs="Times New Roman"/>
@@ -3768,7 +4050,7 @@
         <w:pStyle w:val="3"/>
         <w:numPr>
           <w:ilvl w:val="1"/>
-          <w:numId w:val="2"/>
+          <w:numId w:val="1"/>
         </w:numPr>
         <w:bidi w:val="0"/>
         <w:rPr>
@@ -3777,9 +4059,9 @@
           <w:szCs w:val="28"/>
         </w:rPr>
       </w:pPr>
-      <w:bookmarkStart w:id="18" w:name="_Toc15444"/>
-      <w:bookmarkStart w:id="19" w:name="_Toc22329"/>
-      <w:bookmarkStart w:id="20" w:name="_Toc15461"/>
+      <w:bookmarkStart w:id="18" w:name="_Toc15461"/>
+      <w:bookmarkStart w:id="19" w:name="_Toc15444"/>
+      <w:bookmarkStart w:id="20" w:name="_Toc22329"/>
       <w:r>
         <w:rPr>
           <w:rFonts w:hint="default" w:ascii="Times New Roman" w:hAnsi="Times New Roman" w:cs="Times New Roman"/>
@@ -4130,7 +4412,7 @@
         <w:pStyle w:val="3"/>
         <w:numPr>
           <w:ilvl w:val="1"/>
-          <w:numId w:val="2"/>
+          <w:numId w:val="1"/>
         </w:numPr>
         <w:bidi w:val="0"/>
         <w:rPr>
@@ -4139,8 +4421,8 @@
           <w:szCs w:val="28"/>
         </w:rPr>
       </w:pPr>
-      <w:bookmarkStart w:id="21" w:name="_Toc13838"/>
-      <w:bookmarkStart w:id="22" w:name="_Toc761"/>
+      <w:bookmarkStart w:id="21" w:name="_Toc761"/>
+      <w:bookmarkStart w:id="22" w:name="_Toc13838"/>
       <w:bookmarkStart w:id="23" w:name="_Toc15565"/>
       <w:r>
         <w:rPr>
@@ -4589,8 +4871,8 @@
         </w:rPr>
       </w:pPr>
       <w:bookmarkStart w:id="31" w:name="_Toc611"/>
-      <w:bookmarkStart w:id="32" w:name="_Toc32523"/>
-      <w:bookmarkStart w:id="33" w:name="_Toc2393"/>
+      <w:bookmarkStart w:id="32" w:name="_Toc2393"/>
+      <w:bookmarkStart w:id="33" w:name="_Toc32523"/>
       <w:r>
         <w:rPr>
           <w:rFonts w:hint="default" w:ascii="Times New Roman" w:hAnsi="Times New Roman" w:cs="Times New Roman"/>
@@ -4874,7 +5156,7 @@
         <w:widowControl/>
         <w:numPr>
           <w:ilvl w:val="0"/>
-          <w:numId w:val="3"/>
+          <w:numId w:val="2"/>
         </w:numPr>
         <w:suppressLineNumbers w:val="0"/>
         <w:spacing w:before="0" w:beforeAutospacing="1" w:after="0" w:afterAutospacing="1" w:line="360" w:lineRule="auto"/>
@@ -4902,7 +5184,7 @@
         <w:widowControl/>
         <w:numPr>
           <w:ilvl w:val="0"/>
-          <w:numId w:val="3"/>
+          <w:numId w:val="2"/>
         </w:numPr>
         <w:suppressLineNumbers w:val="0"/>
         <w:spacing w:before="0" w:beforeAutospacing="1" w:after="0" w:afterAutospacing="1" w:line="360" w:lineRule="auto"/>
@@ -4930,7 +5212,7 @@
         <w:widowControl/>
         <w:numPr>
           <w:ilvl w:val="0"/>
-          <w:numId w:val="3"/>
+          <w:numId w:val="2"/>
         </w:numPr>
         <w:suppressLineNumbers w:val="0"/>
         <w:spacing w:before="0" w:beforeAutospacing="1" w:after="0" w:afterAutospacing="1" w:line="360" w:lineRule="auto"/>
@@ -4958,7 +5240,7 @@
         <w:widowControl/>
         <w:numPr>
           <w:ilvl w:val="0"/>
-          <w:numId w:val="3"/>
+          <w:numId w:val="2"/>
         </w:numPr>
         <w:suppressLineNumbers w:val="0"/>
         <w:spacing w:before="0" w:beforeAutospacing="1" w:after="0" w:afterAutospacing="1" w:line="360" w:lineRule="auto"/>
@@ -4986,7 +5268,7 @@
         <w:widowControl/>
         <w:numPr>
           <w:ilvl w:val="0"/>
-          <w:numId w:val="3"/>
+          <w:numId w:val="2"/>
         </w:numPr>
         <w:suppressLineNumbers w:val="0"/>
         <w:spacing w:before="0" w:beforeAutospacing="1" w:after="0" w:afterAutospacing="1" w:line="360" w:lineRule="auto"/>
@@ -5239,7 +5521,7 @@
         <w:widowControl/>
         <w:numPr>
           <w:ilvl w:val="0"/>
-          <w:numId w:val="3"/>
+          <w:numId w:val="2"/>
         </w:numPr>
         <w:suppressLineNumbers w:val="0"/>
         <w:spacing w:before="0" w:beforeAutospacing="1" w:after="0" w:afterAutospacing="1" w:line="360" w:lineRule="auto"/>
@@ -5276,7 +5558,7 @@
         <w:widowControl/>
         <w:numPr>
           <w:ilvl w:val="0"/>
-          <w:numId w:val="3"/>
+          <w:numId w:val="2"/>
         </w:numPr>
         <w:suppressLineNumbers w:val="0"/>
         <w:spacing w:before="0" w:beforeAutospacing="1" w:after="0" w:afterAutospacing="1" w:line="360" w:lineRule="auto"/>
@@ -5313,7 +5595,7 @@
         <w:widowControl/>
         <w:numPr>
           <w:ilvl w:val="0"/>
-          <w:numId w:val="3"/>
+          <w:numId w:val="2"/>
         </w:numPr>
         <w:suppressLineNumbers w:val="0"/>
         <w:spacing w:before="0" w:beforeAutospacing="1" w:after="0" w:afterAutospacing="1" w:line="360" w:lineRule="auto"/>
@@ -5464,7 +5746,7 @@
         <w:widowControl/>
         <w:numPr>
           <w:ilvl w:val="0"/>
-          <w:numId w:val="3"/>
+          <w:numId w:val="2"/>
         </w:numPr>
         <w:suppressLineNumbers w:val="0"/>
         <w:spacing w:before="0" w:beforeAutospacing="1" w:after="0" w:afterAutospacing="1" w:line="360" w:lineRule="auto"/>
@@ -5492,7 +5774,7 @@
         <w:widowControl/>
         <w:numPr>
           <w:ilvl w:val="0"/>
-          <w:numId w:val="3"/>
+          <w:numId w:val="2"/>
         </w:numPr>
         <w:suppressLineNumbers w:val="0"/>
         <w:spacing w:before="0" w:beforeAutospacing="1" w:after="0" w:afterAutospacing="1" w:line="360" w:lineRule="auto"/>
@@ -5520,7 +5802,7 @@
         <w:widowControl/>
         <w:numPr>
           <w:ilvl w:val="0"/>
-          <w:numId w:val="3"/>
+          <w:numId w:val="2"/>
         </w:numPr>
         <w:suppressLineNumbers w:val="0"/>
         <w:spacing w:before="0" w:beforeAutospacing="1" w:after="0" w:afterAutospacing="1" w:line="360" w:lineRule="auto"/>
@@ -5623,7 +5905,7 @@
         <w:widowControl/>
         <w:numPr>
           <w:ilvl w:val="0"/>
-          <w:numId w:val="3"/>
+          <w:numId w:val="2"/>
         </w:numPr>
         <w:suppressLineNumbers w:val="0"/>
         <w:spacing w:before="0" w:beforeAutospacing="1" w:after="0" w:afterAutospacing="1" w:line="360" w:lineRule="auto"/>
@@ -5660,7 +5942,7 @@
         <w:widowControl/>
         <w:numPr>
           <w:ilvl w:val="0"/>
-          <w:numId w:val="3"/>
+          <w:numId w:val="2"/>
         </w:numPr>
         <w:suppressLineNumbers w:val="0"/>
         <w:spacing w:before="0" w:beforeAutospacing="1" w:after="0" w:afterAutospacing="1" w:line="360" w:lineRule="auto"/>
@@ -5697,7 +5979,7 @@
         <w:widowControl/>
         <w:numPr>
           <w:ilvl w:val="0"/>
-          <w:numId w:val="3"/>
+          <w:numId w:val="2"/>
         </w:numPr>
         <w:suppressLineNumbers w:val="0"/>
         <w:spacing w:before="0" w:beforeAutospacing="1" w:after="0" w:afterAutospacing="1" w:line="360" w:lineRule="auto"/>
@@ -5734,7 +6016,7 @@
         <w:widowControl/>
         <w:numPr>
           <w:ilvl w:val="0"/>
-          <w:numId w:val="3"/>
+          <w:numId w:val="2"/>
         </w:numPr>
         <w:suppressLineNumbers w:val="0"/>
         <w:spacing w:before="0" w:beforeAutospacing="1" w:after="0" w:afterAutospacing="1" w:line="360" w:lineRule="auto"/>
@@ -5771,7 +6053,7 @@
         <w:widowControl/>
         <w:numPr>
           <w:ilvl w:val="0"/>
-          <w:numId w:val="3"/>
+          <w:numId w:val="2"/>
         </w:numPr>
         <w:suppressLineNumbers w:val="0"/>
         <w:spacing w:before="0" w:beforeAutospacing="1" w:after="0" w:afterAutospacing="1" w:line="360" w:lineRule="auto"/>
@@ -5887,8 +6169,8 @@
         </w:rPr>
       </w:pPr>
       <w:bookmarkStart w:id="37" w:name="_Toc2967"/>
-      <w:bookmarkStart w:id="38" w:name="_Toc13550"/>
-      <w:bookmarkStart w:id="39" w:name="_Toc11591"/>
+      <w:bookmarkStart w:id="38" w:name="_Toc11591"/>
+      <w:bookmarkStart w:id="39" w:name="_Toc13550"/>
       <w:r>
         <w:rPr>
           <w:rFonts w:hint="default" w:ascii="Times New Roman" w:hAnsi="Times New Roman" w:cs="Times New Roman"/>
@@ -5983,7 +6265,7 @@
         <w:widowControl/>
         <w:numPr>
           <w:ilvl w:val="0"/>
-          <w:numId w:val="3"/>
+          <w:numId w:val="2"/>
         </w:numPr>
         <w:suppressLineNumbers w:val="0"/>
         <w:spacing w:before="0" w:beforeAutospacing="1" w:after="0" w:afterAutospacing="1" w:line="360" w:lineRule="auto"/>
@@ -6020,7 +6302,7 @@
         <w:widowControl/>
         <w:numPr>
           <w:ilvl w:val="0"/>
-          <w:numId w:val="3"/>
+          <w:numId w:val="2"/>
         </w:numPr>
         <w:suppressLineNumbers w:val="0"/>
         <w:spacing w:before="0" w:beforeAutospacing="1" w:after="0" w:afterAutospacing="1" w:line="360" w:lineRule="auto"/>
@@ -6057,7 +6339,7 @@
         <w:widowControl/>
         <w:numPr>
           <w:ilvl w:val="0"/>
-          <w:numId w:val="3"/>
+          <w:numId w:val="2"/>
         </w:numPr>
         <w:suppressLineNumbers w:val="0"/>
         <w:spacing w:before="0" w:beforeAutospacing="1" w:after="0" w:afterAutospacing="1" w:line="360" w:lineRule="auto"/>
@@ -6094,7 +6376,7 @@
         <w:widowControl/>
         <w:numPr>
           <w:ilvl w:val="0"/>
-          <w:numId w:val="3"/>
+          <w:numId w:val="2"/>
         </w:numPr>
         <w:suppressLineNumbers w:val="0"/>
         <w:spacing w:before="0" w:beforeAutospacing="1" w:after="0" w:afterAutospacing="1" w:line="360" w:lineRule="auto"/>
@@ -6424,8 +6706,8 @@
         </w:rPr>
       </w:pPr>
       <w:bookmarkStart w:id="40" w:name="_Toc10099"/>
-      <w:bookmarkStart w:id="41" w:name="_Toc15853"/>
-      <w:bookmarkStart w:id="42" w:name="_Toc5804"/>
+      <w:bookmarkStart w:id="41" w:name="_Toc5804"/>
+      <w:bookmarkStart w:id="42" w:name="_Toc15853"/>
       <w:r>
         <w:rPr>
           <w:rFonts w:hint="default" w:ascii="Times New Roman" w:hAnsi="Times New Roman" w:cs="Times New Roman"/>
@@ -6545,7 +6827,7 @@
         <w:widowControl/>
         <w:numPr>
           <w:ilvl w:val="0"/>
-          <w:numId w:val="3"/>
+          <w:numId w:val="2"/>
         </w:numPr>
         <w:suppressLineNumbers w:val="0"/>
         <w:spacing w:before="0" w:beforeAutospacing="1" w:after="0" w:afterAutospacing="1" w:line="360" w:lineRule="auto"/>
@@ -6582,7 +6864,7 @@
         <w:widowControl/>
         <w:numPr>
           <w:ilvl w:val="0"/>
-          <w:numId w:val="3"/>
+          <w:numId w:val="2"/>
         </w:numPr>
         <w:suppressLineNumbers w:val="0"/>
         <w:spacing w:before="0" w:beforeAutospacing="1" w:after="0" w:afterAutospacing="1" w:line="360" w:lineRule="auto"/>
@@ -6619,7 +6901,7 @@
         <w:widowControl/>
         <w:numPr>
           <w:ilvl w:val="0"/>
-          <w:numId w:val="3"/>
+          <w:numId w:val="2"/>
         </w:numPr>
         <w:suppressLineNumbers w:val="0"/>
         <w:spacing w:before="0" w:beforeAutospacing="1" w:after="0" w:afterAutospacing="1" w:line="360" w:lineRule="auto"/>
@@ -6820,7 +7102,7 @@
         <w:widowControl/>
         <w:numPr>
           <w:ilvl w:val="0"/>
-          <w:numId w:val="3"/>
+          <w:numId w:val="2"/>
         </w:numPr>
         <w:suppressLineNumbers w:val="0"/>
         <w:spacing w:before="0" w:beforeAutospacing="1" w:after="0" w:afterAutospacing="1" w:line="360" w:lineRule="auto"/>
@@ -6848,7 +7130,7 @@
         <w:widowControl/>
         <w:numPr>
           <w:ilvl w:val="0"/>
-          <w:numId w:val="3"/>
+          <w:numId w:val="2"/>
         </w:numPr>
         <w:suppressLineNumbers w:val="0"/>
         <w:spacing w:before="0" w:beforeAutospacing="1" w:after="0" w:afterAutospacing="1" w:line="360" w:lineRule="auto"/>
@@ -6876,7 +7158,7 @@
         <w:widowControl/>
         <w:numPr>
           <w:ilvl w:val="0"/>
-          <w:numId w:val="3"/>
+          <w:numId w:val="2"/>
         </w:numPr>
         <w:suppressLineNumbers w:val="0"/>
         <w:spacing w:before="0" w:beforeAutospacing="1" w:after="0" w:afterAutospacing="1" w:line="360" w:lineRule="auto"/>
@@ -6954,7 +7236,7 @@
         <w:widowControl/>
         <w:numPr>
           <w:ilvl w:val="0"/>
-          <w:numId w:val="3"/>
+          <w:numId w:val="2"/>
         </w:numPr>
         <w:suppressLineNumbers w:val="0"/>
         <w:spacing w:before="0" w:beforeAutospacing="1" w:after="0" w:afterAutospacing="1" w:line="360" w:lineRule="auto"/>
@@ -6982,7 +7264,7 @@
         <w:widowControl/>
         <w:numPr>
           <w:ilvl w:val="0"/>
-          <w:numId w:val="3"/>
+          <w:numId w:val="2"/>
         </w:numPr>
         <w:suppressLineNumbers w:val="0"/>
         <w:spacing w:before="0" w:beforeAutospacing="1" w:after="0" w:afterAutospacing="1" w:line="360" w:lineRule="auto"/>
@@ -7010,7 +7292,7 @@
         <w:widowControl/>
         <w:numPr>
           <w:ilvl w:val="0"/>
-          <w:numId w:val="3"/>
+          <w:numId w:val="2"/>
         </w:numPr>
         <w:suppressLineNumbers w:val="0"/>
         <w:spacing w:before="0" w:beforeAutospacing="1" w:after="0" w:afterAutospacing="1" w:line="360" w:lineRule="auto"/>
@@ -7188,7 +7470,7 @@
         <w:widowControl/>
         <w:numPr>
           <w:ilvl w:val="0"/>
-          <w:numId w:val="3"/>
+          <w:numId w:val="2"/>
         </w:numPr>
         <w:suppressLineNumbers w:val="0"/>
         <w:spacing w:before="0" w:beforeAutospacing="1" w:after="0" w:afterAutospacing="1" w:line="360" w:lineRule="auto"/>
@@ -7216,7 +7498,7 @@
         <w:widowControl/>
         <w:numPr>
           <w:ilvl w:val="0"/>
-          <w:numId w:val="3"/>
+          <w:numId w:val="2"/>
         </w:numPr>
         <w:suppressLineNumbers w:val="0"/>
         <w:spacing w:before="0" w:beforeAutospacing="1" w:after="0" w:afterAutospacing="1" w:line="360" w:lineRule="auto"/>
@@ -7244,7 +7526,7 @@
         <w:widowControl/>
         <w:numPr>
           <w:ilvl w:val="0"/>
-          <w:numId w:val="3"/>
+          <w:numId w:val="2"/>
         </w:numPr>
         <w:suppressLineNumbers w:val="0"/>
         <w:spacing w:before="0" w:beforeAutospacing="1" w:after="0" w:afterAutospacing="1" w:line="360" w:lineRule="auto"/>
@@ -7272,7 +7554,7 @@
         <w:widowControl/>
         <w:numPr>
           <w:ilvl w:val="0"/>
-          <w:numId w:val="3"/>
+          <w:numId w:val="2"/>
         </w:numPr>
         <w:suppressLineNumbers w:val="0"/>
         <w:spacing w:before="0" w:beforeAutospacing="1" w:after="0" w:afterAutospacing="1" w:line="360" w:lineRule="auto"/>
@@ -7587,7 +7869,7 @@
         <w:widowControl/>
         <w:numPr>
           <w:ilvl w:val="0"/>
-          <w:numId w:val="3"/>
+          <w:numId w:val="2"/>
         </w:numPr>
         <w:suppressLineNumbers w:val="0"/>
         <w:spacing w:before="0" w:beforeAutospacing="1" w:after="0" w:afterAutospacing="1" w:line="360" w:lineRule="auto"/>
@@ -7615,7 +7897,7 @@
         <w:widowControl/>
         <w:numPr>
           <w:ilvl w:val="0"/>
-          <w:numId w:val="3"/>
+          <w:numId w:val="2"/>
         </w:numPr>
         <w:suppressLineNumbers w:val="0"/>
         <w:spacing w:before="0" w:beforeAutospacing="1" w:after="0" w:afterAutospacing="1" w:line="360" w:lineRule="auto"/>
@@ -7643,7 +7925,7 @@
         <w:widowControl/>
         <w:numPr>
           <w:ilvl w:val="0"/>
-          <w:numId w:val="3"/>
+          <w:numId w:val="2"/>
         </w:numPr>
         <w:suppressLineNumbers w:val="0"/>
         <w:spacing w:before="0" w:beforeAutospacing="1" w:after="0" w:afterAutospacing="1" w:line="360" w:lineRule="auto"/>
@@ -7671,7 +7953,7 @@
         <w:widowControl/>
         <w:numPr>
           <w:ilvl w:val="0"/>
-          <w:numId w:val="3"/>
+          <w:numId w:val="2"/>
         </w:numPr>
         <w:suppressLineNumbers w:val="0"/>
         <w:spacing w:before="0" w:beforeAutospacing="1" w:after="0" w:afterAutospacing="1" w:line="360" w:lineRule="auto"/>
@@ -7893,7 +8175,7 @@
         <w:widowControl/>
         <w:numPr>
           <w:ilvl w:val="0"/>
-          <w:numId w:val="3"/>
+          <w:numId w:val="2"/>
         </w:numPr>
         <w:suppressLineNumbers w:val="0"/>
         <w:spacing w:before="0" w:beforeAutospacing="1" w:after="0" w:afterAutospacing="1" w:line="360" w:lineRule="auto"/>
@@ -7921,7 +8203,7 @@
         <w:widowControl/>
         <w:numPr>
           <w:ilvl w:val="0"/>
-          <w:numId w:val="3"/>
+          <w:numId w:val="2"/>
         </w:numPr>
         <w:suppressLineNumbers w:val="0"/>
         <w:spacing w:before="0" w:beforeAutospacing="1" w:after="0" w:afterAutospacing="1" w:line="360" w:lineRule="auto"/>
@@ -7949,7 +8231,7 @@
         <w:widowControl/>
         <w:numPr>
           <w:ilvl w:val="0"/>
-          <w:numId w:val="3"/>
+          <w:numId w:val="2"/>
         </w:numPr>
         <w:suppressLineNumbers w:val="0"/>
         <w:spacing w:before="0" w:beforeAutospacing="1" w:after="0" w:afterAutospacing="1" w:line="360" w:lineRule="auto"/>
@@ -7977,7 +8259,7 @@
         <w:widowControl/>
         <w:numPr>
           <w:ilvl w:val="0"/>
-          <w:numId w:val="3"/>
+          <w:numId w:val="2"/>
         </w:numPr>
         <w:suppressLineNumbers w:val="0"/>
         <w:spacing w:before="0" w:beforeAutospacing="1" w:after="0" w:afterAutospacing="1" w:line="360" w:lineRule="auto"/>
@@ -8085,7 +8367,7 @@
         <w:widowControl/>
         <w:numPr>
           <w:ilvl w:val="0"/>
-          <w:numId w:val="3"/>
+          <w:numId w:val="2"/>
         </w:numPr>
         <w:suppressLineNumbers w:val="0"/>
         <w:spacing w:before="0" w:beforeAutospacing="1" w:after="0" w:afterAutospacing="1" w:line="360" w:lineRule="auto"/>
@@ -8113,7 +8395,7 @@
         <w:widowControl/>
         <w:numPr>
           <w:ilvl w:val="0"/>
-          <w:numId w:val="3"/>
+          <w:numId w:val="2"/>
         </w:numPr>
         <w:suppressLineNumbers w:val="0"/>
         <w:spacing w:before="0" w:beforeAutospacing="1" w:after="0" w:afterAutospacing="1" w:line="360" w:lineRule="auto"/>
@@ -8141,7 +8423,7 @@
         <w:widowControl/>
         <w:numPr>
           <w:ilvl w:val="0"/>
-          <w:numId w:val="3"/>
+          <w:numId w:val="2"/>
         </w:numPr>
         <w:suppressLineNumbers w:val="0"/>
         <w:spacing w:before="0" w:beforeAutospacing="1" w:after="0" w:afterAutospacing="1" w:line="360" w:lineRule="auto"/>
@@ -8169,7 +8451,7 @@
         <w:widowControl/>
         <w:numPr>
           <w:ilvl w:val="0"/>
-          <w:numId w:val="3"/>
+          <w:numId w:val="2"/>
         </w:numPr>
         <w:suppressLineNumbers w:val="0"/>
         <w:spacing w:before="0" w:beforeAutospacing="1" w:after="0" w:afterAutospacing="1" w:line="360" w:lineRule="auto"/>
@@ -8276,7 +8558,7 @@
         <w:widowControl/>
         <w:numPr>
           <w:ilvl w:val="0"/>
-          <w:numId w:val="3"/>
+          <w:numId w:val="2"/>
         </w:numPr>
         <w:suppressLineNumbers w:val="0"/>
         <w:spacing w:before="0" w:beforeAutospacing="1" w:after="0" w:afterAutospacing="1" w:line="360" w:lineRule="auto"/>
@@ -8313,7 +8595,7 @@
         <w:widowControl/>
         <w:numPr>
           <w:ilvl w:val="0"/>
-          <w:numId w:val="3"/>
+          <w:numId w:val="2"/>
         </w:numPr>
         <w:suppressLineNumbers w:val="0"/>
         <w:spacing w:before="0" w:beforeAutospacing="1" w:after="0" w:afterAutospacing="1" w:line="360" w:lineRule="auto"/>
@@ -8350,7 +8632,7 @@
         <w:widowControl/>
         <w:numPr>
           <w:ilvl w:val="0"/>
-          <w:numId w:val="3"/>
+          <w:numId w:val="2"/>
         </w:numPr>
         <w:suppressLineNumbers w:val="0"/>
         <w:spacing w:before="0" w:beforeAutospacing="1" w:after="0" w:afterAutospacing="1" w:line="360" w:lineRule="auto"/>
@@ -8492,7 +8774,7 @@
         <w:widowControl/>
         <w:numPr>
           <w:ilvl w:val="0"/>
-          <w:numId w:val="3"/>
+          <w:numId w:val="2"/>
         </w:numPr>
         <w:suppressLineNumbers w:val="0"/>
         <w:spacing w:before="0" w:beforeAutospacing="1" w:after="0" w:afterAutospacing="1" w:line="360" w:lineRule="auto"/>
@@ -8520,7 +8802,7 @@
         <w:widowControl/>
         <w:numPr>
           <w:ilvl w:val="0"/>
-          <w:numId w:val="3"/>
+          <w:numId w:val="2"/>
         </w:numPr>
         <w:suppressLineNumbers w:val="0"/>
         <w:spacing w:before="0" w:beforeAutospacing="1" w:after="0" w:afterAutospacing="1" w:line="360" w:lineRule="auto"/>
@@ -8548,7 +8830,7 @@
         <w:widowControl/>
         <w:numPr>
           <w:ilvl w:val="0"/>
-          <w:numId w:val="3"/>
+          <w:numId w:val="2"/>
         </w:numPr>
         <w:suppressLineNumbers w:val="0"/>
         <w:spacing w:before="0" w:beforeAutospacing="1" w:after="0" w:afterAutospacing="1" w:line="360" w:lineRule="auto"/>
@@ -8735,7 +9017,7 @@
         <w:widowControl/>
         <w:numPr>
           <w:ilvl w:val="0"/>
-          <w:numId w:val="3"/>
+          <w:numId w:val="2"/>
         </w:numPr>
         <w:suppressLineNumbers w:val="0"/>
         <w:spacing w:before="0" w:beforeAutospacing="1" w:after="0" w:afterAutospacing="1" w:line="360" w:lineRule="auto"/>
@@ -8763,7 +9045,7 @@
         <w:widowControl/>
         <w:numPr>
           <w:ilvl w:val="0"/>
-          <w:numId w:val="3"/>
+          <w:numId w:val="2"/>
         </w:numPr>
         <w:suppressLineNumbers w:val="0"/>
         <w:spacing w:before="0" w:beforeAutospacing="1" w:after="0" w:afterAutospacing="1" w:line="360" w:lineRule="auto"/>
@@ -8791,7 +9073,7 @@
         <w:widowControl/>
         <w:numPr>
           <w:ilvl w:val="0"/>
-          <w:numId w:val="3"/>
+          <w:numId w:val="2"/>
         </w:numPr>
         <w:suppressLineNumbers w:val="0"/>
         <w:spacing w:before="0" w:beforeAutospacing="1" w:after="0" w:afterAutospacing="1" w:line="360" w:lineRule="auto"/>
@@ -8874,7 +9156,7 @@
         <w:widowControl/>
         <w:numPr>
           <w:ilvl w:val="0"/>
-          <w:numId w:val="3"/>
+          <w:numId w:val="2"/>
         </w:numPr>
         <w:suppressLineNumbers w:val="0"/>
         <w:spacing w:before="0" w:beforeAutospacing="1" w:after="0" w:afterAutospacing="1" w:line="360" w:lineRule="auto"/>
@@ -8911,7 +9193,7 @@
         <w:widowControl/>
         <w:numPr>
           <w:ilvl w:val="0"/>
-          <w:numId w:val="3"/>
+          <w:numId w:val="2"/>
         </w:numPr>
         <w:suppressLineNumbers w:val="0"/>
         <w:spacing w:before="0" w:beforeAutospacing="1" w:after="0" w:afterAutospacing="1" w:line="360" w:lineRule="auto"/>
@@ -8948,7 +9230,7 @@
         <w:widowControl/>
         <w:numPr>
           <w:ilvl w:val="0"/>
-          <w:numId w:val="3"/>
+          <w:numId w:val="2"/>
         </w:numPr>
         <w:suppressLineNumbers w:val="0"/>
         <w:spacing w:before="0" w:beforeAutospacing="1" w:after="0" w:afterAutospacing="1" w:line="360" w:lineRule="auto"/>
@@ -8985,7 +9267,7 @@
         <w:widowControl/>
         <w:numPr>
           <w:ilvl w:val="0"/>
-          <w:numId w:val="3"/>
+          <w:numId w:val="2"/>
         </w:numPr>
         <w:suppressLineNumbers w:val="0"/>
         <w:spacing w:before="0" w:beforeAutospacing="1" w:after="0" w:afterAutospacing="1" w:line="360" w:lineRule="auto"/>
@@ -9022,7 +9304,7 @@
         <w:widowControl/>
         <w:numPr>
           <w:ilvl w:val="0"/>
-          <w:numId w:val="3"/>
+          <w:numId w:val="2"/>
         </w:numPr>
         <w:suppressLineNumbers w:val="0"/>
         <w:spacing w:before="0" w:beforeAutospacing="1" w:after="0" w:afterAutospacing="1" w:line="360" w:lineRule="auto"/>
@@ -9231,7 +9513,7 @@
         <w:widowControl/>
         <w:numPr>
           <w:ilvl w:val="0"/>
-          <w:numId w:val="3"/>
+          <w:numId w:val="2"/>
         </w:numPr>
         <w:suppressLineNumbers w:val="0"/>
         <w:spacing w:before="0" w:beforeAutospacing="1" w:after="0" w:afterAutospacing="1" w:line="360" w:lineRule="auto"/>
@@ -9259,7 +9541,7 @@
         <w:widowControl/>
         <w:numPr>
           <w:ilvl w:val="0"/>
-          <w:numId w:val="3"/>
+          <w:numId w:val="2"/>
         </w:numPr>
         <w:suppressLineNumbers w:val="0"/>
         <w:spacing w:before="0" w:beforeAutospacing="1" w:after="0" w:afterAutospacing="1" w:line="360" w:lineRule="auto"/>
@@ -9287,7 +9569,7 @@
         <w:widowControl/>
         <w:numPr>
           <w:ilvl w:val="0"/>
-          <w:numId w:val="3"/>
+          <w:numId w:val="2"/>
         </w:numPr>
         <w:suppressLineNumbers w:val="0"/>
         <w:spacing w:before="0" w:beforeAutospacing="1" w:after="0" w:afterAutospacing="1" w:line="360" w:lineRule="auto"/>
@@ -9315,7 +9597,7 @@
         <w:widowControl/>
         <w:numPr>
           <w:ilvl w:val="0"/>
-          <w:numId w:val="3"/>
+          <w:numId w:val="2"/>
         </w:numPr>
         <w:suppressLineNumbers w:val="0"/>
         <w:spacing w:before="0" w:beforeAutospacing="1" w:after="0" w:afterAutospacing="1" w:line="360" w:lineRule="auto"/>
@@ -9343,7 +9625,7 @@
         <w:widowControl/>
         <w:numPr>
           <w:ilvl w:val="0"/>
-          <w:numId w:val="3"/>
+          <w:numId w:val="2"/>
         </w:numPr>
         <w:suppressLineNumbers w:val="0"/>
         <w:spacing w:before="0" w:beforeAutospacing="1" w:after="0" w:afterAutospacing="1" w:line="360" w:lineRule="auto"/>
@@ -9515,7 +9797,7 @@
         <w:widowControl/>
         <w:numPr>
           <w:ilvl w:val="0"/>
-          <w:numId w:val="3"/>
+          <w:numId w:val="2"/>
         </w:numPr>
         <w:suppressLineNumbers w:val="0"/>
         <w:spacing w:before="0" w:beforeAutospacing="1" w:after="0" w:afterAutospacing="1" w:line="360" w:lineRule="auto"/>
@@ -9543,7 +9825,7 @@
         <w:widowControl/>
         <w:numPr>
           <w:ilvl w:val="0"/>
-          <w:numId w:val="3"/>
+          <w:numId w:val="2"/>
         </w:numPr>
         <w:suppressLineNumbers w:val="0"/>
         <w:spacing w:before="0" w:beforeAutospacing="1" w:after="0" w:afterAutospacing="1" w:line="360" w:lineRule="auto"/>
@@ -9571,7 +9853,7 @@
         <w:widowControl/>
         <w:numPr>
           <w:ilvl w:val="0"/>
-          <w:numId w:val="3"/>
+          <w:numId w:val="2"/>
         </w:numPr>
         <w:suppressLineNumbers w:val="0"/>
         <w:spacing w:before="0" w:beforeAutospacing="1" w:after="0" w:afterAutospacing="1" w:line="360" w:lineRule="auto"/>
@@ -9599,7 +9881,7 @@
         <w:widowControl/>
         <w:numPr>
           <w:ilvl w:val="0"/>
-          <w:numId w:val="3"/>
+          <w:numId w:val="2"/>
         </w:numPr>
         <w:suppressLineNumbers w:val="0"/>
         <w:spacing w:before="0" w:beforeAutospacing="1" w:after="0" w:afterAutospacing="1" w:line="360" w:lineRule="auto"/>
@@ -9627,7 +9909,7 @@
         <w:widowControl/>
         <w:numPr>
           <w:ilvl w:val="0"/>
-          <w:numId w:val="3"/>
+          <w:numId w:val="2"/>
         </w:numPr>
         <w:suppressLineNumbers w:val="0"/>
         <w:spacing w:before="0" w:beforeAutospacing="1" w:after="0" w:afterAutospacing="1" w:line="360" w:lineRule="auto"/>
@@ -9680,7 +9962,7 @@
         <w:widowControl/>
         <w:numPr>
           <w:ilvl w:val="0"/>
-          <w:numId w:val="3"/>
+          <w:numId w:val="2"/>
         </w:numPr>
         <w:suppressLineNumbers w:val="0"/>
         <w:spacing w:before="0" w:beforeAutospacing="1" w:after="0" w:afterAutospacing="1" w:line="360" w:lineRule="auto"/>
@@ -9725,7 +10007,7 @@
         <w:widowControl/>
         <w:numPr>
           <w:ilvl w:val="0"/>
-          <w:numId w:val="3"/>
+          <w:numId w:val="2"/>
         </w:numPr>
         <w:suppressLineNumbers w:val="0"/>
         <w:spacing w:before="0" w:beforeAutospacing="1" w:after="0" w:afterAutospacing="1" w:line="360" w:lineRule="auto"/>
@@ -9770,7 +10052,7 @@
         <w:widowControl/>
         <w:numPr>
           <w:ilvl w:val="0"/>
-          <w:numId w:val="3"/>
+          <w:numId w:val="2"/>
         </w:numPr>
         <w:suppressLineNumbers w:val="0"/>
         <w:spacing w:before="0" w:beforeAutospacing="1" w:after="0" w:afterAutospacing="1" w:line="360" w:lineRule="auto"/>
@@ -9920,7 +10202,7 @@
         <w:widowControl/>
         <w:numPr>
           <w:ilvl w:val="0"/>
-          <w:numId w:val="3"/>
+          <w:numId w:val="2"/>
         </w:numPr>
         <w:suppressLineNumbers w:val="0"/>
         <w:spacing w:before="0" w:beforeAutospacing="1" w:after="0" w:afterAutospacing="1" w:line="360" w:lineRule="auto"/>
@@ -9957,7 +10239,7 @@
         <w:widowControl/>
         <w:numPr>
           <w:ilvl w:val="0"/>
-          <w:numId w:val="3"/>
+          <w:numId w:val="2"/>
         </w:numPr>
         <w:suppressLineNumbers w:val="0"/>
         <w:spacing w:before="0" w:beforeAutospacing="1" w:after="0" w:afterAutospacing="1" w:line="360" w:lineRule="auto"/>
@@ -9994,7 +10276,7 @@
         <w:widowControl/>
         <w:numPr>
           <w:ilvl w:val="0"/>
-          <w:numId w:val="3"/>
+          <w:numId w:val="2"/>
         </w:numPr>
         <w:suppressLineNumbers w:val="0"/>
         <w:spacing w:before="0" w:beforeAutospacing="1" w:after="0" w:afterAutospacing="1" w:line="360" w:lineRule="auto"/>
@@ -10031,7 +10313,7 @@
         <w:widowControl/>
         <w:numPr>
           <w:ilvl w:val="0"/>
-          <w:numId w:val="3"/>
+          <w:numId w:val="2"/>
         </w:numPr>
         <w:suppressLineNumbers w:val="0"/>
         <w:spacing w:before="0" w:beforeAutospacing="1" w:after="0" w:afterAutospacing="1" w:line="360" w:lineRule="auto"/>
@@ -10068,7 +10350,7 @@
         <w:widowControl/>
         <w:numPr>
           <w:ilvl w:val="0"/>
-          <w:numId w:val="3"/>
+          <w:numId w:val="2"/>
         </w:numPr>
         <w:suppressLineNumbers w:val="0"/>
         <w:spacing w:before="0" w:beforeAutospacing="1" w:after="0" w:afterAutospacing="1" w:line="360" w:lineRule="auto"/>
@@ -10184,7 +10466,7 @@
         <w:widowControl/>
         <w:numPr>
           <w:ilvl w:val="0"/>
-          <w:numId w:val="3"/>
+          <w:numId w:val="2"/>
         </w:numPr>
         <w:suppressLineNumbers w:val="0"/>
         <w:spacing w:before="0" w:beforeAutospacing="1" w:after="0" w:afterAutospacing="1" w:line="360" w:lineRule="auto"/>
@@ -10212,7 +10494,7 @@
         <w:widowControl/>
         <w:numPr>
           <w:ilvl w:val="0"/>
-          <w:numId w:val="3"/>
+          <w:numId w:val="2"/>
         </w:numPr>
         <w:suppressLineNumbers w:val="0"/>
         <w:spacing w:before="0" w:beforeAutospacing="1" w:after="0" w:afterAutospacing="1" w:line="360" w:lineRule="auto"/>
@@ -10240,7 +10522,7 @@
         <w:widowControl/>
         <w:numPr>
           <w:ilvl w:val="0"/>
-          <w:numId w:val="3"/>
+          <w:numId w:val="2"/>
         </w:numPr>
         <w:suppressLineNumbers w:val="0"/>
         <w:spacing w:before="0" w:beforeAutospacing="1" w:after="0" w:afterAutospacing="1" w:line="360" w:lineRule="auto"/>
@@ -10268,7 +10550,7 @@
         <w:widowControl/>
         <w:numPr>
           <w:ilvl w:val="0"/>
-          <w:numId w:val="3"/>
+          <w:numId w:val="2"/>
         </w:numPr>
         <w:suppressLineNumbers w:val="0"/>
         <w:spacing w:before="0" w:beforeAutospacing="1" w:after="0" w:afterAutospacing="1" w:line="360" w:lineRule="auto"/>
@@ -10296,7 +10578,7 @@
         <w:widowControl/>
         <w:numPr>
           <w:ilvl w:val="0"/>
-          <w:numId w:val="3"/>
+          <w:numId w:val="2"/>
         </w:numPr>
         <w:suppressLineNumbers w:val="0"/>
         <w:spacing w:before="0" w:beforeAutospacing="1" w:after="0" w:afterAutospacing="1" w:line="360" w:lineRule="auto"/>
@@ -10403,7 +10685,7 @@
         <w:widowControl/>
         <w:numPr>
           <w:ilvl w:val="0"/>
-          <w:numId w:val="3"/>
+          <w:numId w:val="2"/>
         </w:numPr>
         <w:suppressLineNumbers w:val="0"/>
         <w:spacing w:before="0" w:beforeAutospacing="1" w:after="0" w:afterAutospacing="1" w:line="360" w:lineRule="auto"/>
@@ -10440,7 +10722,7 @@
         <w:widowControl/>
         <w:numPr>
           <w:ilvl w:val="0"/>
-          <w:numId w:val="3"/>
+          <w:numId w:val="2"/>
         </w:numPr>
         <w:suppressLineNumbers w:val="0"/>
         <w:spacing w:before="0" w:beforeAutospacing="1" w:after="0" w:afterAutospacing="1" w:line="360" w:lineRule="auto"/>
@@ -10477,7 +10759,7 @@
         <w:widowControl/>
         <w:numPr>
           <w:ilvl w:val="0"/>
-          <w:numId w:val="3"/>
+          <w:numId w:val="2"/>
         </w:numPr>
         <w:suppressLineNumbers w:val="0"/>
         <w:spacing w:before="0" w:beforeAutospacing="1" w:after="0" w:afterAutospacing="1" w:line="360" w:lineRule="auto"/>
@@ -10514,7 +10796,7 @@
         <w:widowControl/>
         <w:numPr>
           <w:ilvl w:val="0"/>
-          <w:numId w:val="3"/>
+          <w:numId w:val="2"/>
         </w:numPr>
         <w:suppressLineNumbers w:val="0"/>
         <w:spacing w:before="0" w:beforeAutospacing="1" w:after="0" w:afterAutospacing="1" w:line="360" w:lineRule="auto"/>
@@ -10606,7 +10888,7 @@
         <w:widowControl/>
         <w:numPr>
           <w:ilvl w:val="0"/>
-          <w:numId w:val="3"/>
+          <w:numId w:val="2"/>
         </w:numPr>
         <w:suppressLineNumbers w:val="0"/>
         <w:spacing w:before="0" w:beforeAutospacing="1" w:after="0" w:afterAutospacing="1" w:line="360" w:lineRule="auto"/>
@@ -10634,7 +10916,7 @@
         <w:widowControl/>
         <w:numPr>
           <w:ilvl w:val="0"/>
-          <w:numId w:val="3"/>
+          <w:numId w:val="2"/>
         </w:numPr>
         <w:suppressLineNumbers w:val="0"/>
         <w:spacing w:before="0" w:beforeAutospacing="1" w:after="0" w:afterAutospacing="1" w:line="360" w:lineRule="auto"/>
@@ -10662,7 +10944,7 @@
         <w:widowControl/>
         <w:numPr>
           <w:ilvl w:val="0"/>
-          <w:numId w:val="3"/>
+          <w:numId w:val="2"/>
         </w:numPr>
         <w:suppressLineNumbers w:val="0"/>
         <w:spacing w:before="0" w:beforeAutospacing="1" w:after="0" w:afterAutospacing="1" w:line="360" w:lineRule="auto"/>
@@ -10690,7 +10972,7 @@
         <w:widowControl/>
         <w:numPr>
           <w:ilvl w:val="0"/>
-          <w:numId w:val="3"/>
+          <w:numId w:val="2"/>
         </w:numPr>
         <w:suppressLineNumbers w:val="0"/>
         <w:spacing w:before="0" w:beforeAutospacing="1" w:after="0" w:afterAutospacing="1" w:line="360" w:lineRule="auto"/>
@@ -10826,9 +11108,9 @@
           <w:szCs w:val="28"/>
         </w:rPr>
       </w:pPr>
-      <w:bookmarkStart w:id="71" w:name="_Toc8585"/>
-      <w:bookmarkStart w:id="72" w:name="_Toc23877"/>
-      <w:bookmarkStart w:id="73" w:name="_Toc18628"/>
+      <w:bookmarkStart w:id="71" w:name="_Toc23877"/>
+      <w:bookmarkStart w:id="72" w:name="_Toc18628"/>
+      <w:bookmarkStart w:id="73" w:name="_Toc8585"/>
       <w:r>
         <w:rPr>
           <w:rFonts w:hint="default" w:ascii="Times New Roman" w:hAnsi="Times New Roman" w:cs="Times New Roman"/>
@@ -11067,7 +11349,7 @@
         <w:widowControl/>
         <w:numPr>
           <w:ilvl w:val="0"/>
-          <w:numId w:val="3"/>
+          <w:numId w:val="2"/>
         </w:numPr>
         <w:suppressLineNumbers w:val="0"/>
         <w:spacing w:before="0" w:beforeAutospacing="1" w:after="0" w:afterAutospacing="1" w:line="360" w:lineRule="auto"/>
@@ -11104,7 +11386,7 @@
         <w:widowControl/>
         <w:numPr>
           <w:ilvl w:val="0"/>
-          <w:numId w:val="3"/>
+          <w:numId w:val="2"/>
         </w:numPr>
         <w:suppressLineNumbers w:val="0"/>
         <w:spacing w:before="0" w:beforeAutospacing="1" w:after="0" w:afterAutospacing="1" w:line="360" w:lineRule="auto"/>
@@ -11141,7 +11423,7 @@
         <w:widowControl/>
         <w:numPr>
           <w:ilvl w:val="0"/>
-          <w:numId w:val="3"/>
+          <w:numId w:val="2"/>
         </w:numPr>
         <w:suppressLineNumbers w:val="0"/>
         <w:spacing w:before="0" w:beforeAutospacing="1" w:after="0" w:afterAutospacing="1" w:line="360" w:lineRule="auto"/>
@@ -11178,7 +11460,7 @@
         <w:widowControl/>
         <w:numPr>
           <w:ilvl w:val="0"/>
-          <w:numId w:val="3"/>
+          <w:numId w:val="2"/>
         </w:numPr>
         <w:suppressLineNumbers w:val="0"/>
         <w:spacing w:before="0" w:beforeAutospacing="1" w:after="0" w:afterAutospacing="1" w:line="360" w:lineRule="auto"/>
@@ -11215,7 +11497,7 @@
         <w:widowControl/>
         <w:numPr>
           <w:ilvl w:val="0"/>
-          <w:numId w:val="3"/>
+          <w:numId w:val="2"/>
         </w:numPr>
         <w:suppressLineNumbers w:val="0"/>
         <w:spacing w:before="0" w:beforeAutospacing="1" w:after="0" w:afterAutospacing="1" w:line="360" w:lineRule="auto"/>
@@ -11252,7 +11534,7 @@
         <w:widowControl/>
         <w:numPr>
           <w:ilvl w:val="0"/>
-          <w:numId w:val="3"/>
+          <w:numId w:val="2"/>
         </w:numPr>
         <w:suppressLineNumbers w:val="0"/>
         <w:spacing w:before="0" w:beforeAutospacing="1" w:after="0" w:afterAutospacing="1" w:line="360" w:lineRule="auto"/>
@@ -11394,7 +11676,7 @@
         <w:widowControl/>
         <w:numPr>
           <w:ilvl w:val="0"/>
-          <w:numId w:val="3"/>
+          <w:numId w:val="2"/>
         </w:numPr>
         <w:suppressLineNumbers w:val="0"/>
         <w:spacing w:before="0" w:beforeAutospacing="1" w:after="0" w:afterAutospacing="1" w:line="360" w:lineRule="auto"/>
@@ -11431,7 +11713,7 @@
         <w:widowControl/>
         <w:numPr>
           <w:ilvl w:val="0"/>
-          <w:numId w:val="3"/>
+          <w:numId w:val="2"/>
         </w:numPr>
         <w:suppressLineNumbers w:val="0"/>
         <w:spacing w:before="0" w:beforeAutospacing="1" w:after="0" w:afterAutospacing="1" w:line="360" w:lineRule="auto"/>
@@ -11468,7 +11750,7 @@
         <w:widowControl/>
         <w:numPr>
           <w:ilvl w:val="0"/>
-          <w:numId w:val="3"/>
+          <w:numId w:val="2"/>
         </w:numPr>
         <w:suppressLineNumbers w:val="0"/>
         <w:spacing w:before="0" w:beforeAutospacing="1" w:after="0" w:afterAutospacing="1" w:line="360" w:lineRule="auto"/>
@@ -11505,7 +11787,7 @@
         <w:widowControl/>
         <w:numPr>
           <w:ilvl w:val="0"/>
-          <w:numId w:val="3"/>
+          <w:numId w:val="2"/>
         </w:numPr>
         <w:suppressLineNumbers w:val="0"/>
         <w:spacing w:before="0" w:beforeAutospacing="1" w:after="0" w:afterAutospacing="1" w:line="360" w:lineRule="auto"/>
@@ -11542,7 +11824,7 @@
         <w:widowControl/>
         <w:numPr>
           <w:ilvl w:val="0"/>
-          <w:numId w:val="3"/>
+          <w:numId w:val="2"/>
         </w:numPr>
         <w:suppressLineNumbers w:val="0"/>
         <w:spacing w:before="0" w:beforeAutospacing="1" w:after="0" w:afterAutospacing="1" w:line="360" w:lineRule="auto"/>
@@ -11579,7 +11861,7 @@
         <w:widowControl/>
         <w:numPr>
           <w:ilvl w:val="0"/>
-          <w:numId w:val="3"/>
+          <w:numId w:val="2"/>
         </w:numPr>
         <w:suppressLineNumbers w:val="0"/>
         <w:spacing w:before="0" w:beforeAutospacing="1" w:after="0" w:afterAutospacing="1" w:line="360" w:lineRule="auto"/>
@@ -11722,7 +12004,7 @@
         <w:widowControl/>
         <w:numPr>
           <w:ilvl w:val="0"/>
-          <w:numId w:val="3"/>
+          <w:numId w:val="2"/>
         </w:numPr>
         <w:suppressLineNumbers w:val="0"/>
         <w:spacing w:line="360" w:lineRule="auto"/>
@@ -11759,7 +12041,7 @@
         <w:widowControl/>
         <w:numPr>
           <w:ilvl w:val="0"/>
-          <w:numId w:val="3"/>
+          <w:numId w:val="2"/>
         </w:numPr>
         <w:suppressLineNumbers w:val="0"/>
         <w:spacing w:before="0" w:beforeAutospacing="1" w:after="0" w:afterAutospacing="1" w:line="360" w:lineRule="auto"/>
@@ -11796,7 +12078,7 @@
         <w:widowControl/>
         <w:numPr>
           <w:ilvl w:val="0"/>
-          <w:numId w:val="3"/>
+          <w:numId w:val="2"/>
         </w:numPr>
         <w:suppressLineNumbers w:val="0"/>
         <w:spacing w:before="0" w:beforeAutospacing="1" w:after="0" w:afterAutospacing="1" w:line="360" w:lineRule="auto"/>
@@ -11833,7 +12115,7 @@
         <w:widowControl/>
         <w:numPr>
           <w:ilvl w:val="0"/>
-          <w:numId w:val="3"/>
+          <w:numId w:val="2"/>
         </w:numPr>
         <w:suppressLineNumbers w:val="0"/>
         <w:spacing w:before="0" w:beforeAutospacing="1" w:after="0" w:afterAutospacing="1" w:line="360" w:lineRule="auto"/>
@@ -11870,7 +12152,7 @@
         <w:widowControl/>
         <w:numPr>
           <w:ilvl w:val="0"/>
-          <w:numId w:val="3"/>
+          <w:numId w:val="2"/>
         </w:numPr>
         <w:suppressLineNumbers w:val="0"/>
         <w:spacing w:before="0" w:beforeAutospacing="1" w:after="0" w:afterAutospacing="1" w:line="360" w:lineRule="auto"/>
@@ -12012,7 +12294,7 @@
         <w:widowControl/>
         <w:numPr>
           <w:ilvl w:val="0"/>
-          <w:numId w:val="3"/>
+          <w:numId w:val="2"/>
         </w:numPr>
         <w:suppressLineNumbers w:val="0"/>
         <w:spacing w:before="0" w:beforeAutospacing="1" w:after="0" w:afterAutospacing="1" w:line="360" w:lineRule="auto"/>
@@ -12049,7 +12331,7 @@
         <w:widowControl/>
         <w:numPr>
           <w:ilvl w:val="0"/>
-          <w:numId w:val="3"/>
+          <w:numId w:val="2"/>
         </w:numPr>
         <w:suppressLineNumbers w:val="0"/>
         <w:spacing w:before="0" w:beforeAutospacing="1" w:after="0" w:afterAutospacing="1" w:line="360" w:lineRule="auto"/>
@@ -12086,7 +12368,7 @@
         <w:widowControl/>
         <w:numPr>
           <w:ilvl w:val="0"/>
-          <w:numId w:val="3"/>
+          <w:numId w:val="2"/>
         </w:numPr>
         <w:suppressLineNumbers w:val="0"/>
         <w:spacing w:before="0" w:beforeAutospacing="1" w:after="0" w:afterAutospacing="1" w:line="360" w:lineRule="auto"/>
@@ -12123,7 +12405,7 @@
         <w:widowControl/>
         <w:numPr>
           <w:ilvl w:val="0"/>
-          <w:numId w:val="3"/>
+          <w:numId w:val="2"/>
         </w:numPr>
         <w:suppressLineNumbers w:val="0"/>
         <w:spacing w:before="0" w:beforeAutospacing="1" w:after="0" w:afterAutospacing="1" w:line="360" w:lineRule="auto"/>
@@ -12160,7 +12442,7 @@
         <w:widowControl/>
         <w:numPr>
           <w:ilvl w:val="0"/>
-          <w:numId w:val="3"/>
+          <w:numId w:val="2"/>
         </w:numPr>
         <w:suppressLineNumbers w:val="0"/>
         <w:spacing w:before="0" w:beforeAutospacing="1" w:after="0" w:afterAutospacing="1" w:line="360" w:lineRule="auto"/>
@@ -12197,7 +12479,7 @@
         <w:widowControl/>
         <w:numPr>
           <w:ilvl w:val="0"/>
-          <w:numId w:val="3"/>
+          <w:numId w:val="2"/>
         </w:numPr>
         <w:suppressLineNumbers w:val="0"/>
         <w:spacing w:before="0" w:beforeAutospacing="1" w:after="0" w:afterAutospacing="1" w:line="360" w:lineRule="auto"/>
@@ -12339,7 +12621,7 @@
         <w:widowControl/>
         <w:numPr>
           <w:ilvl w:val="0"/>
-          <w:numId w:val="3"/>
+          <w:numId w:val="2"/>
         </w:numPr>
         <w:suppressLineNumbers w:val="0"/>
         <w:spacing w:before="0" w:beforeAutospacing="1" w:after="0" w:afterAutospacing="1" w:line="360" w:lineRule="auto"/>
@@ -12376,7 +12658,7 @@
         <w:widowControl/>
         <w:numPr>
           <w:ilvl w:val="0"/>
-          <w:numId w:val="3"/>
+          <w:numId w:val="2"/>
         </w:numPr>
         <w:suppressLineNumbers w:val="0"/>
         <w:spacing w:before="0" w:beforeAutospacing="1" w:after="0" w:afterAutospacing="1" w:line="360" w:lineRule="auto"/>
@@ -12413,7 +12695,7 @@
         <w:widowControl/>
         <w:numPr>
           <w:ilvl w:val="0"/>
-          <w:numId w:val="3"/>
+          <w:numId w:val="2"/>
         </w:numPr>
         <w:suppressLineNumbers w:val="0"/>
         <w:spacing w:before="0" w:beforeAutospacing="1" w:after="0" w:afterAutospacing="1" w:line="360" w:lineRule="auto"/>
@@ -12450,7 +12732,7 @@
         <w:widowControl/>
         <w:numPr>
           <w:ilvl w:val="0"/>
-          <w:numId w:val="3"/>
+          <w:numId w:val="2"/>
         </w:numPr>
         <w:suppressLineNumbers w:val="0"/>
         <w:spacing w:before="0" w:beforeAutospacing="1" w:after="0" w:afterAutospacing="1" w:line="360" w:lineRule="auto"/>
@@ -12487,7 +12769,7 @@
         <w:widowControl/>
         <w:numPr>
           <w:ilvl w:val="0"/>
-          <w:numId w:val="3"/>
+          <w:numId w:val="2"/>
         </w:numPr>
         <w:suppressLineNumbers w:val="0"/>
         <w:spacing w:before="0" w:beforeAutospacing="1" w:after="0" w:afterAutospacing="1" w:line="360" w:lineRule="auto"/>
@@ -12629,7 +12911,7 @@
         <w:widowControl/>
         <w:numPr>
           <w:ilvl w:val="0"/>
-          <w:numId w:val="3"/>
+          <w:numId w:val="2"/>
         </w:numPr>
         <w:suppressLineNumbers w:val="0"/>
         <w:spacing w:before="0" w:beforeAutospacing="1" w:after="0" w:afterAutospacing="1" w:line="360" w:lineRule="auto"/>
@@ -12666,7 +12948,7 @@
         <w:widowControl/>
         <w:numPr>
           <w:ilvl w:val="0"/>
-          <w:numId w:val="3"/>
+          <w:numId w:val="2"/>
         </w:numPr>
         <w:suppressLineNumbers w:val="0"/>
         <w:spacing w:before="0" w:beforeAutospacing="1" w:after="0" w:afterAutospacing="1" w:line="360" w:lineRule="auto"/>
@@ -12703,7 +12985,7 @@
         <w:widowControl/>
         <w:numPr>
           <w:ilvl w:val="0"/>
-          <w:numId w:val="3"/>
+          <w:numId w:val="2"/>
         </w:numPr>
         <w:suppressLineNumbers w:val="0"/>
         <w:spacing w:before="0" w:beforeAutospacing="1" w:after="0" w:afterAutospacing="1" w:line="360" w:lineRule="auto"/>
@@ -12740,7 +13022,7 @@
         <w:widowControl/>
         <w:numPr>
           <w:ilvl w:val="0"/>
-          <w:numId w:val="3"/>
+          <w:numId w:val="2"/>
         </w:numPr>
         <w:suppressLineNumbers w:val="0"/>
         <w:spacing w:before="0" w:beforeAutospacing="1" w:after="0" w:afterAutospacing="1" w:line="360" w:lineRule="auto"/>
@@ -12777,7 +13059,7 @@
         <w:widowControl/>
         <w:numPr>
           <w:ilvl w:val="0"/>
-          <w:numId w:val="3"/>
+          <w:numId w:val="2"/>
         </w:numPr>
         <w:suppressLineNumbers w:val="0"/>
         <w:spacing w:before="0" w:beforeAutospacing="1" w:after="0" w:afterAutospacing="1" w:line="360" w:lineRule="auto"/>
@@ -12814,7 +13096,7 @@
         <w:widowControl/>
         <w:numPr>
           <w:ilvl w:val="0"/>
-          <w:numId w:val="3"/>
+          <w:numId w:val="2"/>
         </w:numPr>
         <w:suppressLineNumbers w:val="0"/>
         <w:spacing w:before="0" w:beforeAutospacing="1" w:after="0" w:afterAutospacing="1" w:line="360" w:lineRule="auto"/>
@@ -12931,7 +13213,7 @@
         <w:widowControl/>
         <w:numPr>
           <w:ilvl w:val="0"/>
-          <w:numId w:val="3"/>
+          <w:numId w:val="2"/>
         </w:numPr>
         <w:suppressLineNumbers w:val="0"/>
         <w:spacing w:before="0" w:beforeAutospacing="1" w:after="0" w:afterAutospacing="1" w:line="360" w:lineRule="auto"/>
@@ -12959,7 +13241,7 @@
         <w:widowControl/>
         <w:numPr>
           <w:ilvl w:val="0"/>
-          <w:numId w:val="3"/>
+          <w:numId w:val="2"/>
         </w:numPr>
         <w:suppressLineNumbers w:val="0"/>
         <w:spacing w:before="0" w:beforeAutospacing="1" w:after="0" w:afterAutospacing="1" w:line="360" w:lineRule="auto"/>
@@ -12987,7 +13269,7 @@
         <w:widowControl/>
         <w:numPr>
           <w:ilvl w:val="0"/>
-          <w:numId w:val="3"/>
+          <w:numId w:val="2"/>
         </w:numPr>
         <w:suppressLineNumbers w:val="0"/>
         <w:spacing w:before="0" w:beforeAutospacing="1" w:after="0" w:afterAutospacing="1" w:line="360" w:lineRule="auto"/>
@@ -13095,7 +13377,7 @@
         <w:widowControl/>
         <w:numPr>
           <w:ilvl w:val="0"/>
-          <w:numId w:val="3"/>
+          <w:numId w:val="2"/>
         </w:numPr>
         <w:suppressLineNumbers w:val="0"/>
         <w:spacing w:before="0" w:beforeAutospacing="1" w:after="0" w:afterAutospacing="1" w:line="360" w:lineRule="auto"/>
@@ -13123,7 +13405,7 @@
         <w:widowControl/>
         <w:numPr>
           <w:ilvl w:val="0"/>
-          <w:numId w:val="3"/>
+          <w:numId w:val="2"/>
         </w:numPr>
         <w:suppressLineNumbers w:val="0"/>
         <w:spacing w:before="0" w:beforeAutospacing="1" w:after="0" w:afterAutospacing="1" w:line="360" w:lineRule="auto"/>
@@ -13151,7 +13433,7 @@
         <w:widowControl/>
         <w:numPr>
           <w:ilvl w:val="0"/>
-          <w:numId w:val="3"/>
+          <w:numId w:val="2"/>
         </w:numPr>
         <w:suppressLineNumbers w:val="0"/>
         <w:spacing w:before="0" w:beforeAutospacing="1" w:after="0" w:afterAutospacing="1" w:line="360" w:lineRule="auto"/>
@@ -13259,7 +13541,7 @@
         <w:widowControl/>
         <w:numPr>
           <w:ilvl w:val="0"/>
-          <w:numId w:val="3"/>
+          <w:numId w:val="2"/>
         </w:numPr>
         <w:suppressLineNumbers w:val="0"/>
         <w:spacing w:before="0" w:beforeAutospacing="1" w:after="0" w:afterAutospacing="1" w:line="360" w:lineRule="auto"/>
@@ -13287,7 +13569,7 @@
         <w:widowControl/>
         <w:numPr>
           <w:ilvl w:val="0"/>
-          <w:numId w:val="3"/>
+          <w:numId w:val="2"/>
         </w:numPr>
         <w:suppressLineNumbers w:val="0"/>
         <w:spacing w:before="0" w:beforeAutospacing="1" w:after="0" w:afterAutospacing="1" w:line="360" w:lineRule="auto"/>
@@ -13315,7 +13597,7 @@
         <w:widowControl/>
         <w:numPr>
           <w:ilvl w:val="0"/>
-          <w:numId w:val="3"/>
+          <w:numId w:val="2"/>
         </w:numPr>
         <w:suppressLineNumbers w:val="0"/>
         <w:spacing w:before="0" w:beforeAutospacing="1" w:after="0" w:afterAutospacing="1" w:line="360" w:lineRule="auto"/>
@@ -13343,7 +13625,7 @@
         <w:widowControl/>
         <w:numPr>
           <w:ilvl w:val="0"/>
-          <w:numId w:val="3"/>
+          <w:numId w:val="2"/>
         </w:numPr>
         <w:suppressLineNumbers w:val="0"/>
         <w:spacing w:before="0" w:beforeAutospacing="1" w:after="0" w:afterAutospacing="1" w:line="360" w:lineRule="auto"/>
@@ -13670,7 +13952,7 @@
         <w:widowControl/>
         <w:numPr>
           <w:ilvl w:val="0"/>
-          <w:numId w:val="3"/>
+          <w:numId w:val="2"/>
         </w:numPr>
         <w:suppressLineNumbers w:val="0"/>
         <w:spacing w:before="0" w:beforeAutospacing="1" w:after="0" w:afterAutospacing="1" w:line="360" w:lineRule="auto"/>
@@ -13698,7 +13980,7 @@
         <w:widowControl/>
         <w:numPr>
           <w:ilvl w:val="0"/>
-          <w:numId w:val="3"/>
+          <w:numId w:val="2"/>
         </w:numPr>
         <w:suppressLineNumbers w:val="0"/>
         <w:spacing w:before="0" w:beforeAutospacing="1" w:after="0" w:afterAutospacing="1" w:line="360" w:lineRule="auto"/>
@@ -13726,7 +14008,7 @@
         <w:widowControl/>
         <w:numPr>
           <w:ilvl w:val="0"/>
-          <w:numId w:val="3"/>
+          <w:numId w:val="2"/>
         </w:numPr>
         <w:suppressLineNumbers w:val="0"/>
         <w:spacing w:before="0" w:beforeAutospacing="1" w:after="0" w:afterAutospacing="1" w:line="360" w:lineRule="auto"/>
@@ -13754,7 +14036,7 @@
         <w:widowControl/>
         <w:numPr>
           <w:ilvl w:val="0"/>
-          <w:numId w:val="3"/>
+          <w:numId w:val="2"/>
         </w:numPr>
         <w:suppressLineNumbers w:val="0"/>
         <w:spacing w:before="0" w:beforeAutospacing="1" w:after="0" w:afterAutospacing="1" w:line="360" w:lineRule="auto"/>
@@ -13862,7 +14144,7 @@
         <w:widowControl/>
         <w:numPr>
           <w:ilvl w:val="0"/>
-          <w:numId w:val="3"/>
+          <w:numId w:val="2"/>
         </w:numPr>
         <w:suppressLineNumbers w:val="0"/>
         <w:spacing w:before="0" w:beforeAutospacing="1" w:after="0" w:afterAutospacing="1" w:line="360" w:lineRule="auto"/>
@@ -13899,7 +14181,7 @@
         <w:widowControl/>
         <w:numPr>
           <w:ilvl w:val="0"/>
-          <w:numId w:val="3"/>
+          <w:numId w:val="2"/>
         </w:numPr>
         <w:suppressLineNumbers w:val="0"/>
         <w:spacing w:before="0" w:beforeAutospacing="1" w:after="0" w:afterAutospacing="1" w:line="360" w:lineRule="auto"/>
@@ -13936,7 +14218,7 @@
         <w:widowControl/>
         <w:numPr>
           <w:ilvl w:val="0"/>
-          <w:numId w:val="3"/>
+          <w:numId w:val="2"/>
         </w:numPr>
         <w:suppressLineNumbers w:val="0"/>
         <w:spacing w:before="0" w:beforeAutospacing="1" w:after="0" w:afterAutospacing="1" w:line="360" w:lineRule="auto"/>
@@ -14078,7 +14360,7 @@
         <w:widowControl/>
         <w:numPr>
           <w:ilvl w:val="0"/>
-          <w:numId w:val="3"/>
+          <w:numId w:val="2"/>
         </w:numPr>
         <w:suppressLineNumbers w:val="0"/>
         <w:spacing w:before="0" w:beforeAutospacing="1" w:after="0" w:afterAutospacing="1" w:line="360" w:lineRule="auto"/>
@@ -14106,7 +14388,7 @@
         <w:widowControl/>
         <w:numPr>
           <w:ilvl w:val="0"/>
-          <w:numId w:val="3"/>
+          <w:numId w:val="2"/>
         </w:numPr>
         <w:suppressLineNumbers w:val="0"/>
         <w:spacing w:before="0" w:beforeAutospacing="1" w:after="0" w:afterAutospacing="1" w:line="360" w:lineRule="auto"/>
@@ -14134,7 +14416,7 @@
         <w:widowControl/>
         <w:numPr>
           <w:ilvl w:val="0"/>
-          <w:numId w:val="3"/>
+          <w:numId w:val="2"/>
         </w:numPr>
         <w:suppressLineNumbers w:val="0"/>
         <w:spacing w:before="0" w:beforeAutospacing="1" w:after="0" w:afterAutospacing="1" w:line="360" w:lineRule="auto"/>
@@ -14162,7 +14444,7 @@
         <w:widowControl/>
         <w:numPr>
           <w:ilvl w:val="0"/>
-          <w:numId w:val="3"/>
+          <w:numId w:val="2"/>
         </w:numPr>
         <w:suppressLineNumbers w:val="0"/>
         <w:spacing w:before="0" w:beforeAutospacing="1" w:after="0" w:afterAutospacing="1" w:line="360" w:lineRule="auto"/>
@@ -14295,7 +14577,7 @@
         <w:widowControl/>
         <w:numPr>
           <w:ilvl w:val="0"/>
-          <w:numId w:val="3"/>
+          <w:numId w:val="2"/>
         </w:numPr>
         <w:suppressLineNumbers w:val="0"/>
         <w:spacing w:before="0" w:beforeAutospacing="1" w:after="0" w:afterAutospacing="1" w:line="360" w:lineRule="auto"/>
@@ -14323,7 +14605,7 @@
         <w:widowControl/>
         <w:numPr>
           <w:ilvl w:val="0"/>
-          <w:numId w:val="3"/>
+          <w:numId w:val="2"/>
         </w:numPr>
         <w:suppressLineNumbers w:val="0"/>
         <w:spacing w:before="0" w:beforeAutospacing="1" w:after="0" w:afterAutospacing="1" w:line="360" w:lineRule="auto"/>
@@ -14351,7 +14633,7 @@
         <w:widowControl/>
         <w:numPr>
           <w:ilvl w:val="0"/>
-          <w:numId w:val="3"/>
+          <w:numId w:val="2"/>
         </w:numPr>
         <w:suppressLineNumbers w:val="0"/>
         <w:spacing w:before="0" w:beforeAutospacing="1" w:after="0" w:afterAutospacing="1" w:line="360" w:lineRule="auto"/>
@@ -14379,7 +14661,7 @@
         <w:widowControl/>
         <w:numPr>
           <w:ilvl w:val="0"/>
-          <w:numId w:val="3"/>
+          <w:numId w:val="2"/>
         </w:numPr>
         <w:suppressLineNumbers w:val="0"/>
         <w:spacing w:before="0" w:beforeAutospacing="1" w:after="0" w:afterAutospacing="1" w:line="360" w:lineRule="auto"/>
@@ -14512,7 +14794,7 @@
         <w:widowControl/>
         <w:numPr>
           <w:ilvl w:val="0"/>
-          <w:numId w:val="3"/>
+          <w:numId w:val="2"/>
         </w:numPr>
         <w:suppressLineNumbers w:val="0"/>
         <w:spacing w:before="0" w:beforeAutospacing="1" w:after="0" w:afterAutospacing="1" w:line="360" w:lineRule="auto"/>
@@ -14540,7 +14822,7 @@
         <w:widowControl/>
         <w:numPr>
           <w:ilvl w:val="0"/>
-          <w:numId w:val="3"/>
+          <w:numId w:val="2"/>
         </w:numPr>
         <w:suppressLineNumbers w:val="0"/>
         <w:spacing w:before="0" w:beforeAutospacing="1" w:after="0" w:afterAutospacing="1" w:line="360" w:lineRule="auto"/>
@@ -14568,7 +14850,7 @@
         <w:widowControl/>
         <w:numPr>
           <w:ilvl w:val="0"/>
-          <w:numId w:val="3"/>
+          <w:numId w:val="2"/>
         </w:numPr>
         <w:suppressLineNumbers w:val="0"/>
         <w:spacing w:before="0" w:beforeAutospacing="1" w:after="0" w:afterAutospacing="1" w:line="360" w:lineRule="auto"/>
@@ -14596,7 +14878,7 @@
         <w:widowControl/>
         <w:numPr>
           <w:ilvl w:val="0"/>
-          <w:numId w:val="3"/>
+          <w:numId w:val="2"/>
         </w:numPr>
         <w:suppressLineNumbers w:val="0"/>
         <w:spacing w:before="0" w:beforeAutospacing="1" w:after="0" w:afterAutospacing="1" w:line="360" w:lineRule="auto"/>
@@ -14729,7 +15011,7 @@
         <w:widowControl/>
         <w:numPr>
           <w:ilvl w:val="0"/>
-          <w:numId w:val="3"/>
+          <w:numId w:val="2"/>
         </w:numPr>
         <w:suppressLineNumbers w:val="0"/>
         <w:spacing w:before="0" w:beforeAutospacing="1" w:after="0" w:afterAutospacing="1" w:line="360" w:lineRule="auto"/>
@@ -14757,7 +15039,7 @@
         <w:widowControl/>
         <w:numPr>
           <w:ilvl w:val="0"/>
-          <w:numId w:val="3"/>
+          <w:numId w:val="2"/>
         </w:numPr>
         <w:suppressLineNumbers w:val="0"/>
         <w:spacing w:before="0" w:beforeAutospacing="1" w:after="0" w:afterAutospacing="1" w:line="360" w:lineRule="auto"/>
@@ -14785,7 +15067,7 @@
         <w:widowControl/>
         <w:numPr>
           <w:ilvl w:val="0"/>
-          <w:numId w:val="3"/>
+          <w:numId w:val="2"/>
         </w:numPr>
         <w:suppressLineNumbers w:val="0"/>
         <w:spacing w:before="0" w:beforeAutospacing="1" w:after="0" w:afterAutospacing="1" w:line="360" w:lineRule="auto"/>
@@ -14893,7 +15175,7 @@
         <w:widowControl/>
         <w:numPr>
           <w:ilvl w:val="0"/>
-          <w:numId w:val="3"/>
+          <w:numId w:val="2"/>
         </w:numPr>
         <w:suppressLineNumbers w:val="0"/>
         <w:spacing w:before="0" w:beforeAutospacing="1" w:after="0" w:afterAutospacing="1" w:line="360" w:lineRule="auto"/>
@@ -14921,7 +15203,7 @@
         <w:widowControl/>
         <w:numPr>
           <w:ilvl w:val="0"/>
-          <w:numId w:val="3"/>
+          <w:numId w:val="2"/>
         </w:numPr>
         <w:suppressLineNumbers w:val="0"/>
         <w:spacing w:before="0" w:beforeAutospacing="1" w:after="0" w:afterAutospacing="1" w:line="360" w:lineRule="auto"/>
@@ -14949,7 +15231,7 @@
         <w:widowControl/>
         <w:numPr>
           <w:ilvl w:val="0"/>
-          <w:numId w:val="3"/>
+          <w:numId w:val="2"/>
         </w:numPr>
         <w:suppressLineNumbers w:val="0"/>
         <w:spacing w:before="0" w:beforeAutospacing="1" w:after="0" w:afterAutospacing="1" w:line="360" w:lineRule="auto"/>
@@ -14977,7 +15259,7 @@
         <w:widowControl/>
         <w:numPr>
           <w:ilvl w:val="0"/>
-          <w:numId w:val="3"/>
+          <w:numId w:val="2"/>
         </w:numPr>
         <w:suppressLineNumbers w:val="0"/>
         <w:spacing w:before="0" w:beforeAutospacing="1" w:after="0" w:afterAutospacing="1" w:line="360" w:lineRule="auto"/>
@@ -15085,7 +15367,7 @@
         <w:widowControl/>
         <w:numPr>
           <w:ilvl w:val="0"/>
-          <w:numId w:val="3"/>
+          <w:numId w:val="2"/>
         </w:numPr>
         <w:suppressLineNumbers w:val="0"/>
         <w:spacing w:before="0" w:beforeAutospacing="1" w:after="0" w:afterAutospacing="1" w:line="360" w:lineRule="auto"/>
@@ -15113,7 +15395,7 @@
         <w:widowControl/>
         <w:numPr>
           <w:ilvl w:val="0"/>
-          <w:numId w:val="3"/>
+          <w:numId w:val="2"/>
         </w:numPr>
         <w:suppressLineNumbers w:val="0"/>
         <w:spacing w:before="0" w:beforeAutospacing="1" w:after="0" w:afterAutospacing="1" w:line="360" w:lineRule="auto"/>
@@ -15141,7 +15423,7 @@
         <w:widowControl/>
         <w:numPr>
           <w:ilvl w:val="0"/>
-          <w:numId w:val="3"/>
+          <w:numId w:val="2"/>
         </w:numPr>
         <w:suppressLineNumbers w:val="0"/>
         <w:spacing w:before="0" w:beforeAutospacing="1" w:after="0" w:afterAutospacing="1" w:line="360" w:lineRule="auto"/>
@@ -15169,7 +15451,7 @@
         <w:widowControl/>
         <w:numPr>
           <w:ilvl w:val="0"/>
-          <w:numId w:val="3"/>
+          <w:numId w:val="2"/>
         </w:numPr>
         <w:suppressLineNumbers w:val="0"/>
         <w:spacing w:before="0" w:beforeAutospacing="1" w:after="0" w:afterAutospacing="1" w:line="360" w:lineRule="auto"/>
@@ -15197,7 +15479,7 @@
         <w:widowControl/>
         <w:numPr>
           <w:ilvl w:val="0"/>
-          <w:numId w:val="3"/>
+          <w:numId w:val="2"/>
         </w:numPr>
         <w:suppressLineNumbers w:val="0"/>
         <w:spacing w:before="0" w:beforeAutospacing="1" w:after="0" w:afterAutospacing="1" w:line="360" w:lineRule="auto"/>
@@ -15254,10 +15536,10 @@
           <w:szCs w:val="28"/>
         </w:rPr>
       </w:pPr>
-      <w:bookmarkStart w:id="95" w:name="_Toc762"/>
-      <w:bookmarkStart w:id="96" w:name="_Toc21221"/>
-      <w:bookmarkStart w:id="97" w:name="_Toc23685"/>
-      <w:bookmarkStart w:id="98" w:name="_Toc23924"/>
+      <w:bookmarkStart w:id="95" w:name="_Toc23924"/>
+      <w:bookmarkStart w:id="96" w:name="_Toc762"/>
+      <w:bookmarkStart w:id="97" w:name="_Toc21221"/>
+      <w:bookmarkStart w:id="98" w:name="_Toc23685"/>
       <w:bookmarkStart w:id="99" w:name="_Toc28417"/>
       <w:r>
         <w:rPr>
@@ -15440,7 +15722,7 @@
         <w:widowControl/>
         <w:numPr>
           <w:ilvl w:val="0"/>
-          <w:numId w:val="3"/>
+          <w:numId w:val="2"/>
         </w:numPr>
         <w:suppressLineNumbers w:val="0"/>
         <w:spacing w:before="0" w:beforeAutospacing="1" w:after="0" w:afterAutospacing="1" w:line="360" w:lineRule="auto"/>
@@ -15477,7 +15759,7 @@
         <w:widowControl/>
         <w:numPr>
           <w:ilvl w:val="0"/>
-          <w:numId w:val="3"/>
+          <w:numId w:val="2"/>
         </w:numPr>
         <w:suppressLineNumbers w:val="0"/>
         <w:spacing w:before="0" w:beforeAutospacing="1" w:after="0" w:afterAutospacing="1" w:line="360" w:lineRule="auto"/>
@@ -15514,7 +15796,7 @@
         <w:widowControl/>
         <w:numPr>
           <w:ilvl w:val="0"/>
-          <w:numId w:val="3"/>
+          <w:numId w:val="2"/>
         </w:numPr>
         <w:suppressLineNumbers w:val="0"/>
         <w:spacing w:before="0" w:beforeAutospacing="1" w:after="0" w:afterAutospacing="1" w:line="360" w:lineRule="auto"/>
@@ -15626,7 +15908,7 @@
         <w:widowControl/>
         <w:numPr>
           <w:ilvl w:val="0"/>
-          <w:numId w:val="3"/>
+          <w:numId w:val="2"/>
         </w:numPr>
         <w:suppressLineNumbers w:val="0"/>
         <w:spacing w:before="0" w:beforeAutospacing="1" w:after="0" w:afterAutospacing="1" w:line="360" w:lineRule="auto"/>
@@ -15654,7 +15936,7 @@
         <w:widowControl/>
         <w:numPr>
           <w:ilvl w:val="0"/>
-          <w:numId w:val="3"/>
+          <w:numId w:val="2"/>
         </w:numPr>
         <w:suppressLineNumbers w:val="0"/>
         <w:spacing w:before="0" w:beforeAutospacing="1" w:after="0" w:afterAutospacing="1" w:line="360" w:lineRule="auto"/>
@@ -15682,7 +15964,7 @@
         <w:widowControl/>
         <w:numPr>
           <w:ilvl w:val="0"/>
-          <w:numId w:val="3"/>
+          <w:numId w:val="2"/>
         </w:numPr>
         <w:suppressLineNumbers w:val="0"/>
         <w:spacing w:before="0" w:beforeAutospacing="1" w:after="0" w:afterAutospacing="1" w:line="360" w:lineRule="auto"/>
@@ -15710,7 +15992,7 @@
         <w:widowControl/>
         <w:numPr>
           <w:ilvl w:val="0"/>
-          <w:numId w:val="3"/>
+          <w:numId w:val="2"/>
         </w:numPr>
         <w:suppressLineNumbers w:val="0"/>
         <w:spacing w:before="0" w:beforeAutospacing="1" w:after="0" w:afterAutospacing="1" w:line="360" w:lineRule="auto"/>
@@ -15813,7 +16095,7 @@
         <w:widowControl/>
         <w:numPr>
           <w:ilvl w:val="0"/>
-          <w:numId w:val="3"/>
+          <w:numId w:val="2"/>
         </w:numPr>
         <w:suppressLineNumbers w:val="0"/>
         <w:spacing w:before="0" w:beforeAutospacing="1" w:after="0" w:afterAutospacing="1" w:line="360" w:lineRule="auto"/>
@@ -15841,7 +16123,7 @@
         <w:widowControl/>
         <w:numPr>
           <w:ilvl w:val="0"/>
-          <w:numId w:val="3"/>
+          <w:numId w:val="2"/>
         </w:numPr>
         <w:suppressLineNumbers w:val="0"/>
         <w:spacing w:before="0" w:beforeAutospacing="1" w:after="0" w:afterAutospacing="1" w:line="360" w:lineRule="auto"/>
@@ -15869,7 +16151,7 @@
         <w:widowControl/>
         <w:numPr>
           <w:ilvl w:val="0"/>
-          <w:numId w:val="3"/>
+          <w:numId w:val="2"/>
         </w:numPr>
         <w:suppressLineNumbers w:val="0"/>
         <w:spacing w:before="0" w:beforeAutospacing="1" w:after="0" w:afterAutospacing="1" w:line="360" w:lineRule="auto"/>
@@ -15972,7 +16254,7 @@
         <w:widowControl/>
         <w:numPr>
           <w:ilvl w:val="0"/>
-          <w:numId w:val="3"/>
+          <w:numId w:val="2"/>
         </w:numPr>
         <w:suppressLineNumbers w:val="0"/>
         <w:spacing w:before="0" w:beforeAutospacing="1" w:after="0" w:afterAutospacing="1" w:line="360" w:lineRule="auto"/>
@@ -16000,7 +16282,7 @@
         <w:widowControl/>
         <w:numPr>
           <w:ilvl w:val="0"/>
-          <w:numId w:val="3"/>
+          <w:numId w:val="2"/>
         </w:numPr>
         <w:suppressLineNumbers w:val="0"/>
         <w:spacing w:before="0" w:beforeAutospacing="1" w:after="0" w:afterAutospacing="1" w:line="360" w:lineRule="auto"/>
@@ -16028,7 +16310,7 @@
         <w:widowControl/>
         <w:numPr>
           <w:ilvl w:val="0"/>
-          <w:numId w:val="3"/>
+          <w:numId w:val="2"/>
         </w:numPr>
         <w:suppressLineNumbers w:val="0"/>
         <w:spacing w:before="0" w:beforeAutospacing="1" w:after="0" w:afterAutospacing="1" w:line="360" w:lineRule="auto"/>
@@ -16728,7 +17010,7 @@
         <w:widowControl/>
         <w:numPr>
           <w:ilvl w:val="0"/>
-          <w:numId w:val="3"/>
+          <w:numId w:val="2"/>
         </w:numPr>
         <w:suppressLineNumbers w:val="0"/>
         <w:spacing w:before="0" w:beforeAutospacing="1" w:after="0" w:afterAutospacing="1" w:line="360" w:lineRule="auto"/>
@@ -16756,7 +17038,7 @@
         <w:widowControl/>
         <w:numPr>
           <w:ilvl w:val="0"/>
-          <w:numId w:val="3"/>
+          <w:numId w:val="2"/>
         </w:numPr>
         <w:suppressLineNumbers w:val="0"/>
         <w:spacing w:before="0" w:beforeAutospacing="1" w:after="0" w:afterAutospacing="1" w:line="360" w:lineRule="auto"/>
@@ -16784,7 +17066,7 @@
         <w:widowControl/>
         <w:numPr>
           <w:ilvl w:val="0"/>
-          <w:numId w:val="3"/>
+          <w:numId w:val="2"/>
         </w:numPr>
         <w:suppressLineNumbers w:val="0"/>
         <w:spacing w:before="0" w:beforeAutospacing="1" w:after="0" w:afterAutospacing="1" w:line="360" w:lineRule="auto"/>
@@ -16917,7 +17199,7 @@
         <w:widowControl/>
         <w:numPr>
           <w:ilvl w:val="0"/>
-          <w:numId w:val="3"/>
+          <w:numId w:val="2"/>
         </w:numPr>
         <w:suppressLineNumbers w:val="0"/>
         <w:spacing w:before="0" w:beforeAutospacing="1" w:after="0" w:afterAutospacing="1" w:line="360" w:lineRule="auto"/>
@@ -16945,7 +17227,7 @@
         <w:widowControl/>
         <w:numPr>
           <w:ilvl w:val="0"/>
-          <w:numId w:val="3"/>
+          <w:numId w:val="2"/>
         </w:numPr>
         <w:suppressLineNumbers w:val="0"/>
         <w:spacing w:before="0" w:beforeAutospacing="1" w:after="0" w:afterAutospacing="1" w:line="360" w:lineRule="auto"/>
@@ -16973,7 +17255,7 @@
         <w:widowControl/>
         <w:numPr>
           <w:ilvl w:val="0"/>
-          <w:numId w:val="3"/>
+          <w:numId w:val="2"/>
         </w:numPr>
         <w:suppressLineNumbers w:val="0"/>
         <w:spacing w:before="0" w:beforeAutospacing="1" w:after="0" w:afterAutospacing="1" w:line="360" w:lineRule="auto"/>
@@ -17081,7 +17363,7 @@
         <w:widowControl/>
         <w:numPr>
           <w:ilvl w:val="0"/>
-          <w:numId w:val="3"/>
+          <w:numId w:val="2"/>
         </w:numPr>
         <w:suppressLineNumbers w:val="0"/>
         <w:spacing w:before="0" w:beforeAutospacing="1" w:after="0" w:afterAutospacing="1" w:line="360" w:lineRule="auto"/>
@@ -17109,7 +17391,7 @@
         <w:widowControl/>
         <w:numPr>
           <w:ilvl w:val="0"/>
-          <w:numId w:val="3"/>
+          <w:numId w:val="2"/>
         </w:numPr>
         <w:suppressLineNumbers w:val="0"/>
         <w:spacing w:before="0" w:beforeAutospacing="1" w:after="0" w:afterAutospacing="1" w:line="360" w:lineRule="auto"/>
@@ -17137,7 +17419,7 @@
         <w:widowControl/>
         <w:numPr>
           <w:ilvl w:val="0"/>
-          <w:numId w:val="3"/>
+          <w:numId w:val="2"/>
         </w:numPr>
         <w:suppressLineNumbers w:val="0"/>
         <w:spacing w:before="0" w:beforeAutospacing="1" w:after="0" w:afterAutospacing="1" w:line="360" w:lineRule="auto"/>
@@ -17245,7 +17527,7 @@
         <w:widowControl/>
         <w:numPr>
           <w:ilvl w:val="0"/>
-          <w:numId w:val="3"/>
+          <w:numId w:val="2"/>
         </w:numPr>
         <w:suppressLineNumbers w:val="0"/>
         <w:spacing w:before="0" w:beforeAutospacing="1" w:after="0" w:afterAutospacing="1" w:line="360" w:lineRule="auto"/>
@@ -17273,7 +17555,7 @@
         <w:widowControl/>
         <w:numPr>
           <w:ilvl w:val="0"/>
-          <w:numId w:val="3"/>
+          <w:numId w:val="2"/>
         </w:numPr>
         <w:suppressLineNumbers w:val="0"/>
         <w:spacing w:before="0" w:beforeAutospacing="1" w:after="0" w:afterAutospacing="1" w:line="360" w:lineRule="auto"/>
@@ -17301,7 +17583,7 @@
         <w:widowControl/>
         <w:numPr>
           <w:ilvl w:val="0"/>
-          <w:numId w:val="3"/>
+          <w:numId w:val="2"/>
         </w:numPr>
         <w:suppressLineNumbers w:val="0"/>
         <w:spacing w:before="0" w:beforeAutospacing="1" w:after="0" w:afterAutospacing="1" w:line="360" w:lineRule="auto"/>
@@ -17460,7 +17742,7 @@
         <w:widowControl/>
         <w:numPr>
           <w:ilvl w:val="0"/>
-          <w:numId w:val="3"/>
+          <w:numId w:val="2"/>
         </w:numPr>
         <w:suppressLineNumbers w:val="0"/>
         <w:spacing w:before="0" w:beforeAutospacing="1" w:after="0" w:afterAutospacing="1" w:line="360" w:lineRule="auto"/>
@@ -17488,7 +17770,7 @@
         <w:widowControl/>
         <w:numPr>
           <w:ilvl w:val="0"/>
-          <w:numId w:val="3"/>
+          <w:numId w:val="2"/>
         </w:numPr>
         <w:suppressLineNumbers w:val="0"/>
         <w:spacing w:before="0" w:beforeAutospacing="1" w:after="0" w:afterAutospacing="1" w:line="360" w:lineRule="auto"/>
@@ -17516,7 +17798,7 @@
         <w:widowControl/>
         <w:numPr>
           <w:ilvl w:val="0"/>
-          <w:numId w:val="3"/>
+          <w:numId w:val="2"/>
         </w:numPr>
         <w:suppressLineNumbers w:val="0"/>
         <w:spacing w:before="0" w:beforeAutospacing="1" w:after="0" w:afterAutospacing="1" w:line="360" w:lineRule="auto"/>
@@ -17544,7 +17826,7 @@
         <w:widowControl/>
         <w:numPr>
           <w:ilvl w:val="0"/>
-          <w:numId w:val="3"/>
+          <w:numId w:val="2"/>
         </w:numPr>
         <w:suppressLineNumbers w:val="0"/>
         <w:spacing w:before="0" w:beforeAutospacing="1" w:after="0" w:afterAutospacing="1" w:line="360" w:lineRule="auto"/>
@@ -17652,7 +17934,7 @@
         <w:widowControl/>
         <w:numPr>
           <w:ilvl w:val="0"/>
-          <w:numId w:val="3"/>
+          <w:numId w:val="2"/>
         </w:numPr>
         <w:suppressLineNumbers w:val="0"/>
         <w:spacing w:before="0" w:beforeAutospacing="1" w:after="0" w:afterAutospacing="1" w:line="360" w:lineRule="auto"/>
@@ -17680,7 +17962,7 @@
         <w:widowControl/>
         <w:numPr>
           <w:ilvl w:val="0"/>
-          <w:numId w:val="3"/>
+          <w:numId w:val="2"/>
         </w:numPr>
         <w:suppressLineNumbers w:val="0"/>
         <w:spacing w:before="0" w:beforeAutospacing="1" w:after="0" w:afterAutospacing="1" w:line="360" w:lineRule="auto"/>
@@ -17708,7 +17990,7 @@
         <w:widowControl/>
         <w:numPr>
           <w:ilvl w:val="0"/>
-          <w:numId w:val="3"/>
+          <w:numId w:val="2"/>
         </w:numPr>
         <w:suppressLineNumbers w:val="0"/>
         <w:spacing w:before="0" w:beforeAutospacing="1" w:after="0" w:afterAutospacing="1" w:line="360" w:lineRule="auto"/>
@@ -17736,7 +18018,7 @@
         <w:widowControl/>
         <w:numPr>
           <w:ilvl w:val="0"/>
-          <w:numId w:val="3"/>
+          <w:numId w:val="2"/>
         </w:numPr>
         <w:suppressLineNumbers w:val="0"/>
         <w:spacing w:before="0" w:beforeAutospacing="1" w:after="0" w:afterAutospacing="1" w:line="360" w:lineRule="auto"/>
@@ -17954,7 +18236,7 @@
         <w:widowControl/>
         <w:numPr>
           <w:ilvl w:val="0"/>
-          <w:numId w:val="3"/>
+          <w:numId w:val="2"/>
         </w:numPr>
         <w:suppressLineNumbers w:val="0"/>
         <w:spacing w:before="0" w:beforeAutospacing="1" w:after="0" w:afterAutospacing="1" w:line="360" w:lineRule="auto"/>
@@ -17982,7 +18264,7 @@
         <w:widowControl/>
         <w:numPr>
           <w:ilvl w:val="0"/>
-          <w:numId w:val="3"/>
+          <w:numId w:val="2"/>
         </w:numPr>
         <w:suppressLineNumbers w:val="0"/>
         <w:spacing w:before="0" w:beforeAutospacing="1" w:after="0" w:afterAutospacing="1" w:line="360" w:lineRule="auto"/>
@@ -18010,7 +18292,7 @@
         <w:widowControl/>
         <w:numPr>
           <w:ilvl w:val="0"/>
-          <w:numId w:val="3"/>
+          <w:numId w:val="2"/>
         </w:numPr>
         <w:suppressLineNumbers w:val="0"/>
         <w:spacing w:before="0" w:beforeAutospacing="1" w:after="0" w:afterAutospacing="1" w:line="360" w:lineRule="auto"/>
@@ -18038,7 +18320,7 @@
         <w:widowControl/>
         <w:numPr>
           <w:ilvl w:val="0"/>
-          <w:numId w:val="3"/>
+          <w:numId w:val="2"/>
         </w:numPr>
         <w:suppressLineNumbers w:val="0"/>
         <w:spacing w:before="0" w:beforeAutospacing="1" w:after="0" w:afterAutospacing="1" w:line="360" w:lineRule="auto"/>
@@ -18124,9 +18406,9 @@
           <w:szCs w:val="28"/>
         </w:rPr>
       </w:pPr>
-      <w:bookmarkStart w:id="121" w:name="_Toc19420"/>
+      <w:bookmarkStart w:id="121" w:name="_Toc29565"/>
       <w:bookmarkStart w:id="122" w:name="_Toc12116"/>
-      <w:bookmarkStart w:id="123" w:name="_Toc29565"/>
+      <w:bookmarkStart w:id="123" w:name="_Toc19420"/>
       <w:r>
         <w:rPr>
           <w:rFonts w:hint="default" w:ascii="Times New Roman" w:hAnsi="Times New Roman" w:cs="Times New Roman"/>
@@ -18251,7 +18533,7 @@
         <w:widowControl/>
         <w:numPr>
           <w:ilvl w:val="0"/>
-          <w:numId w:val="3"/>
+          <w:numId w:val="2"/>
         </w:numPr>
         <w:suppressLineNumbers w:val="0"/>
         <w:spacing w:before="0" w:beforeAutospacing="1" w:after="0" w:afterAutospacing="1" w:line="360" w:lineRule="auto"/>
@@ -18279,7 +18561,7 @@
         <w:widowControl/>
         <w:numPr>
           <w:ilvl w:val="0"/>
-          <w:numId w:val="3"/>
+          <w:numId w:val="2"/>
         </w:numPr>
         <w:suppressLineNumbers w:val="0"/>
         <w:spacing w:before="0" w:beforeAutospacing="1" w:after="0" w:afterAutospacing="1" w:line="360" w:lineRule="auto"/>
@@ -18307,7 +18589,7 @@
         <w:widowControl/>
         <w:numPr>
           <w:ilvl w:val="0"/>
-          <w:numId w:val="3"/>
+          <w:numId w:val="2"/>
         </w:numPr>
         <w:suppressLineNumbers w:val="0"/>
         <w:spacing w:before="0" w:beforeAutospacing="1" w:after="0" w:afterAutospacing="1" w:line="360" w:lineRule="auto"/>
@@ -18335,7 +18617,7 @@
         <w:widowControl/>
         <w:numPr>
           <w:ilvl w:val="0"/>
-          <w:numId w:val="3"/>
+          <w:numId w:val="2"/>
         </w:numPr>
         <w:suppressLineNumbers w:val="0"/>
         <w:spacing w:before="0" w:beforeAutospacing="1" w:after="0" w:afterAutospacing="1" w:line="360" w:lineRule="auto"/>
@@ -18363,7 +18645,7 @@
         <w:widowControl/>
         <w:numPr>
           <w:ilvl w:val="0"/>
-          <w:numId w:val="3"/>
+          <w:numId w:val="2"/>
         </w:numPr>
         <w:suppressLineNumbers w:val="0"/>
         <w:spacing w:before="0" w:beforeAutospacing="1" w:after="0" w:afterAutospacing="1" w:line="360" w:lineRule="auto"/>
@@ -18391,7 +18673,7 @@
         <w:widowControl/>
         <w:numPr>
           <w:ilvl w:val="0"/>
-          <w:numId w:val="3"/>
+          <w:numId w:val="2"/>
         </w:numPr>
         <w:suppressLineNumbers w:val="0"/>
         <w:spacing w:before="0" w:beforeAutospacing="1" w:after="0" w:afterAutospacing="1" w:line="360" w:lineRule="auto"/>
@@ -18524,7 +18806,7 @@
         <w:widowControl/>
         <w:numPr>
           <w:ilvl w:val="0"/>
-          <w:numId w:val="3"/>
+          <w:numId w:val="2"/>
         </w:numPr>
         <w:suppressLineNumbers w:val="0"/>
         <w:spacing w:before="0" w:beforeAutospacing="1" w:after="0" w:afterAutospacing="1" w:line="360" w:lineRule="auto"/>
@@ -18552,7 +18834,7 @@
         <w:widowControl/>
         <w:numPr>
           <w:ilvl w:val="0"/>
-          <w:numId w:val="3"/>
+          <w:numId w:val="2"/>
         </w:numPr>
         <w:suppressLineNumbers w:val="0"/>
         <w:spacing w:before="0" w:beforeAutospacing="1" w:after="0" w:afterAutospacing="1" w:line="360" w:lineRule="auto"/>
@@ -18580,7 +18862,7 @@
         <w:widowControl/>
         <w:numPr>
           <w:ilvl w:val="0"/>
-          <w:numId w:val="3"/>
+          <w:numId w:val="2"/>
         </w:numPr>
         <w:suppressLineNumbers w:val="0"/>
         <w:spacing w:before="0" w:beforeAutospacing="1" w:after="0" w:afterAutospacing="1" w:line="360" w:lineRule="auto"/>
@@ -18713,7 +18995,7 @@
         <w:widowControl/>
         <w:numPr>
           <w:ilvl w:val="0"/>
-          <w:numId w:val="3"/>
+          <w:numId w:val="2"/>
         </w:numPr>
         <w:suppressLineNumbers w:val="0"/>
         <w:spacing w:before="0" w:beforeAutospacing="1" w:after="0" w:afterAutospacing="1" w:line="360" w:lineRule="auto"/>
@@ -18741,7 +19023,7 @@
         <w:widowControl/>
         <w:numPr>
           <w:ilvl w:val="0"/>
-          <w:numId w:val="3"/>
+          <w:numId w:val="2"/>
         </w:numPr>
         <w:suppressLineNumbers w:val="0"/>
         <w:spacing w:before="0" w:beforeAutospacing="1" w:after="0" w:afterAutospacing="1" w:line="360" w:lineRule="auto"/>
@@ -18769,7 +19051,7 @@
         <w:widowControl/>
         <w:numPr>
           <w:ilvl w:val="0"/>
-          <w:numId w:val="3"/>
+          <w:numId w:val="2"/>
         </w:numPr>
         <w:suppressLineNumbers w:val="0"/>
         <w:spacing w:before="0" w:beforeAutospacing="1" w:after="0" w:afterAutospacing="1" w:line="360" w:lineRule="auto"/>
@@ -18797,7 +19079,7 @@
         <w:widowControl/>
         <w:numPr>
           <w:ilvl w:val="0"/>
-          <w:numId w:val="3"/>
+          <w:numId w:val="2"/>
         </w:numPr>
         <w:suppressLineNumbers w:val="0"/>
         <w:spacing w:before="0" w:beforeAutospacing="1" w:after="0" w:afterAutospacing="1" w:line="360" w:lineRule="auto"/>
@@ -18930,7 +19212,7 @@
         <w:widowControl/>
         <w:numPr>
           <w:ilvl w:val="0"/>
-          <w:numId w:val="3"/>
+          <w:numId w:val="2"/>
         </w:numPr>
         <w:suppressLineNumbers w:val="0"/>
         <w:spacing w:before="0" w:beforeAutospacing="1" w:after="0" w:afterAutospacing="1" w:line="360" w:lineRule="auto"/>
@@ -18958,7 +19240,7 @@
         <w:widowControl/>
         <w:numPr>
           <w:ilvl w:val="0"/>
-          <w:numId w:val="3"/>
+          <w:numId w:val="2"/>
         </w:numPr>
         <w:suppressLineNumbers w:val="0"/>
         <w:spacing w:before="0" w:beforeAutospacing="1" w:after="0" w:afterAutospacing="1" w:line="360" w:lineRule="auto"/>
@@ -18986,7 +19268,7 @@
         <w:widowControl/>
         <w:numPr>
           <w:ilvl w:val="0"/>
-          <w:numId w:val="3"/>
+          <w:numId w:val="2"/>
         </w:numPr>
         <w:suppressLineNumbers w:val="0"/>
         <w:spacing w:before="0" w:beforeAutospacing="1" w:after="0" w:afterAutospacing="1" w:line="360" w:lineRule="auto"/>
@@ -19014,7 +19296,7 @@
         <w:widowControl/>
         <w:numPr>
           <w:ilvl w:val="0"/>
-          <w:numId w:val="3"/>
+          <w:numId w:val="2"/>
         </w:numPr>
         <w:suppressLineNumbers w:val="0"/>
         <w:spacing w:before="0" w:beforeAutospacing="1" w:after="0" w:afterAutospacing="1" w:line="360" w:lineRule="auto"/>
@@ -19147,7 +19429,7 @@
         <w:widowControl/>
         <w:numPr>
           <w:ilvl w:val="0"/>
-          <w:numId w:val="3"/>
+          <w:numId w:val="2"/>
         </w:numPr>
         <w:suppressLineNumbers w:val="0"/>
         <w:spacing w:before="0" w:beforeAutospacing="1" w:after="0" w:afterAutospacing="1" w:line="360" w:lineRule="auto"/>
@@ -19175,7 +19457,7 @@
         <w:widowControl/>
         <w:numPr>
           <w:ilvl w:val="0"/>
-          <w:numId w:val="3"/>
+          <w:numId w:val="2"/>
         </w:numPr>
         <w:suppressLineNumbers w:val="0"/>
         <w:spacing w:before="0" w:beforeAutospacing="1" w:after="0" w:afterAutospacing="1" w:line="360" w:lineRule="auto"/>
@@ -19203,7 +19485,7 @@
         <w:widowControl/>
         <w:numPr>
           <w:ilvl w:val="0"/>
-          <w:numId w:val="3"/>
+          <w:numId w:val="2"/>
         </w:numPr>
         <w:suppressLineNumbers w:val="0"/>
         <w:spacing w:before="0" w:beforeAutospacing="1" w:after="0" w:afterAutospacing="1" w:line="360" w:lineRule="auto"/>
@@ -19416,7 +19698,7 @@
         <w:widowControl/>
         <w:numPr>
           <w:ilvl w:val="0"/>
-          <w:numId w:val="3"/>
+          <w:numId w:val="2"/>
         </w:numPr>
         <w:suppressLineNumbers w:val="0"/>
         <w:spacing w:before="0" w:beforeAutospacing="1" w:after="0" w:afterAutospacing="1" w:line="360" w:lineRule="auto"/>
@@ -19444,7 +19726,7 @@
         <w:widowControl/>
         <w:numPr>
           <w:ilvl w:val="0"/>
-          <w:numId w:val="3"/>
+          <w:numId w:val="2"/>
         </w:numPr>
         <w:suppressLineNumbers w:val="0"/>
         <w:spacing w:before="0" w:beforeAutospacing="1" w:after="0" w:afterAutospacing="1" w:line="360" w:lineRule="auto"/>
@@ -19472,7 +19754,7 @@
         <w:widowControl/>
         <w:numPr>
           <w:ilvl w:val="0"/>
-          <w:numId w:val="3"/>
+          <w:numId w:val="2"/>
         </w:numPr>
         <w:suppressLineNumbers w:val="0"/>
         <w:spacing w:before="0" w:beforeAutospacing="1" w:after="0" w:afterAutospacing="1" w:line="360" w:lineRule="auto"/>
@@ -19935,8 +20217,8 @@
       </w:pPr>
       <w:bookmarkStart w:id="133" w:name="_Toc17538"/>
       <w:bookmarkStart w:id="134" w:name="_Toc1107"/>
-      <w:bookmarkStart w:id="135" w:name="_Toc12702"/>
-      <w:bookmarkStart w:id="136" w:name="_Toc8030"/>
+      <w:bookmarkStart w:id="135" w:name="_Toc8030"/>
+      <w:bookmarkStart w:id="136" w:name="_Toc12702"/>
       <w:bookmarkStart w:id="137" w:name="_Toc1466"/>
       <w:r>
         <w:rPr>
@@ -19959,8 +20241,8 @@
           <w:szCs w:val="28"/>
         </w:rPr>
       </w:pPr>
-      <w:bookmarkStart w:id="138" w:name="_Toc30814"/>
-      <w:bookmarkStart w:id="139" w:name="_Toc21782"/>
+      <w:bookmarkStart w:id="138" w:name="_Toc21782"/>
+      <w:bookmarkStart w:id="139" w:name="_Toc30814"/>
       <w:r>
         <w:rPr>
           <w:rFonts w:hint="default" w:ascii="Times New Roman" w:hAnsi="Times New Roman" w:cs="Times New Roman"/>
@@ -20286,8 +20568,8 @@
         </w:rPr>
       </w:pPr>
       <w:bookmarkStart w:id="140" w:name="_Toc16197"/>
-      <w:bookmarkStart w:id="141" w:name="_Toc14984"/>
-      <w:bookmarkStart w:id="142" w:name="_Toc31172"/>
+      <w:bookmarkStart w:id="141" w:name="_Toc31172"/>
+      <w:bookmarkStart w:id="142" w:name="_Toc14984"/>
       <w:bookmarkStart w:id="143" w:name="_Toc27570"/>
       <w:bookmarkStart w:id="144" w:name="_Toc21591"/>
       <w:r>
@@ -20334,7 +20616,7 @@
         <w:widowControl/>
         <w:numPr>
           <w:ilvl w:val="0"/>
-          <w:numId w:val="4"/>
+          <w:numId w:val="3"/>
         </w:numPr>
         <w:suppressLineNumbers w:val="0"/>
         <w:spacing w:line="360" w:lineRule="auto"/>
@@ -20379,7 +20661,7 @@
         <w:widowControl/>
         <w:numPr>
           <w:ilvl w:val="0"/>
-          <w:numId w:val="4"/>
+          <w:numId w:val="3"/>
         </w:numPr>
         <w:suppressLineNumbers w:val="0"/>
         <w:spacing w:line="360" w:lineRule="auto"/>
@@ -20424,7 +20706,7 @@
         <w:widowControl/>
         <w:numPr>
           <w:ilvl w:val="0"/>
-          <w:numId w:val="4"/>
+          <w:numId w:val="3"/>
         </w:numPr>
         <w:suppressLineNumbers w:val="0"/>
         <w:spacing w:line="360" w:lineRule="auto"/>
@@ -20469,7 +20751,7 @@
         <w:widowControl/>
         <w:numPr>
           <w:ilvl w:val="0"/>
-          <w:numId w:val="4"/>
+          <w:numId w:val="3"/>
         </w:numPr>
         <w:suppressLineNumbers w:val="0"/>
         <w:spacing w:line="360" w:lineRule="auto"/>
@@ -20514,7 +20796,7 @@
         <w:widowControl/>
         <w:numPr>
           <w:ilvl w:val="0"/>
-          <w:numId w:val="4"/>
+          <w:numId w:val="3"/>
         </w:numPr>
         <w:suppressLineNumbers w:val="0"/>
         <w:spacing w:line="360" w:lineRule="auto"/>
@@ -20559,7 +20841,7 @@
         <w:widowControl/>
         <w:numPr>
           <w:ilvl w:val="0"/>
-          <w:numId w:val="4"/>
+          <w:numId w:val="3"/>
         </w:numPr>
         <w:suppressLineNumbers w:val="0"/>
         <w:spacing w:line="360" w:lineRule="auto"/>
@@ -20604,7 +20886,7 @@
         <w:widowControl/>
         <w:numPr>
           <w:ilvl w:val="0"/>
-          <w:numId w:val="4"/>
+          <w:numId w:val="3"/>
         </w:numPr>
         <w:suppressLineNumbers w:val="0"/>
         <w:spacing w:line="360" w:lineRule="auto"/>
@@ -20649,7 +20931,7 @@
         <w:widowControl/>
         <w:numPr>
           <w:ilvl w:val="0"/>
-          <w:numId w:val="4"/>
+          <w:numId w:val="3"/>
         </w:numPr>
         <w:suppressLineNumbers w:val="0"/>
         <w:spacing w:line="360" w:lineRule="auto"/>
@@ -20694,7 +20976,7 @@
         <w:widowControl/>
         <w:numPr>
           <w:ilvl w:val="0"/>
-          <w:numId w:val="4"/>
+          <w:numId w:val="3"/>
         </w:numPr>
         <w:suppressLineNumbers w:val="0"/>
         <w:spacing w:line="360" w:lineRule="auto"/>
@@ -20739,7 +21021,7 @@
         <w:widowControl/>
         <w:numPr>
           <w:ilvl w:val="0"/>
-          <w:numId w:val="4"/>
+          <w:numId w:val="3"/>
         </w:numPr>
         <w:suppressLineNumbers w:val="0"/>
         <w:spacing w:line="360" w:lineRule="auto"/>
@@ -20784,7 +21066,7 @@
         <w:widowControl/>
         <w:numPr>
           <w:ilvl w:val="0"/>
-          <w:numId w:val="4"/>
+          <w:numId w:val="3"/>
         </w:numPr>
         <w:suppressLineNumbers w:val="0"/>
         <w:spacing w:line="360" w:lineRule="auto"/>
@@ -20829,7 +21111,7 @@
         <w:widowControl/>
         <w:numPr>
           <w:ilvl w:val="0"/>
-          <w:numId w:val="4"/>
+          <w:numId w:val="3"/>
         </w:numPr>
         <w:suppressLineNumbers w:val="0"/>
         <w:spacing w:line="360" w:lineRule="auto"/>
@@ -21221,26 +21503,6 @@
     </w:lvl>
   </w:abstractNum>
   <w:abstractNum w:abstractNumId="2">
-    <w:nsid w:val="202EFBA7"/>
-    <w:multiLevelType w:val="singleLevel"/>
-    <w:tmpl w:val="202EFBA7"/>
-    <w:lvl w:ilvl="0" w:tentative="0">
-      <w:start w:val="1"/>
-      <w:numFmt w:val="bullet"/>
-      <w:lvlText w:val=""/>
-      <w:lvlJc w:val="left"/>
-      <w:pPr>
-        <w:tabs>
-          <w:tab w:val="left" w:pos="420"/>
-        </w:tabs>
-        <w:ind w:left="420" w:leftChars="0" w:hanging="420" w:firstLineChars="0"/>
-      </w:pPr>
-      <w:rPr>
-        <w:rFonts w:hint="default" w:ascii="Wingdings" w:hAnsi="Wingdings"/>
-      </w:rPr>
-    </w:lvl>
-  </w:abstractNum>
-  <w:abstractNum w:abstractNumId="3">
     <w:nsid w:val="608A82F5"/>
     <w:multiLevelType w:val="multilevel"/>
     <w:tmpl w:val="608A82F5"/>
@@ -21366,12 +21628,9 @@
     <w:abstractNumId w:val="2"/>
   </w:num>
   <w:num w:numId="2">
-    <w:abstractNumId w:val="3"/>
+    <w:abstractNumId w:val="0"/>
   </w:num>
   <w:num w:numId="3">
-    <w:abstractNumId w:val="0"/>
-  </w:num>
-  <w:num w:numId="4">
     <w:abstractNumId w:val="1"/>
   </w:num>
 </w:numbering>
@@ -21419,8 +21678,8 @@
     <w:lsdException w:unhideWhenUsed="0" w:uiPriority="0" w:semiHidden="0" w:name="Normal Indent"/>
     <w:lsdException w:unhideWhenUsed="0" w:uiPriority="0" w:semiHidden="0" w:name="footnote text"/>
     <w:lsdException w:unhideWhenUsed="0" w:uiPriority="0" w:semiHidden="0" w:name="annotation text"/>
-    <w:lsdException w:unhideWhenUsed="0" w:uiPriority="0" w:semiHidden="0" w:name="header"/>
-    <w:lsdException w:unhideWhenUsed="0" w:uiPriority="0" w:semiHidden="0" w:name="footer"/>
+    <w:lsdException w:qFormat="1" w:unhideWhenUsed="0" w:uiPriority="0" w:semiHidden="0" w:name="header"/>
+    <w:lsdException w:qFormat="1" w:unhideWhenUsed="0" w:uiPriority="0" w:semiHidden="0" w:name="footer"/>
     <w:lsdException w:unhideWhenUsed="0" w:uiPriority="0" w:semiHidden="0" w:name="index heading"/>
     <w:lsdException w:qFormat="1" w:uiPriority="0" w:name="caption"/>
     <w:lsdException w:unhideWhenUsed="0" w:uiPriority="0" w:semiHidden="0" w:name="table of figures"/>
@@ -21473,7 +21732,7 @@
     <w:lsdException w:unhideWhenUsed="0" w:uiPriority="0" w:semiHidden="0" w:name="Body Text Indent 2"/>
     <w:lsdException w:unhideWhenUsed="0" w:uiPriority="0" w:semiHidden="0" w:name="Body Text Indent 3"/>
     <w:lsdException w:unhideWhenUsed="0" w:uiPriority="0" w:semiHidden="0" w:name="Block Text"/>
-    <w:lsdException w:unhideWhenUsed="0" w:uiPriority="0" w:semiHidden="0" w:name="Hyperlink"/>
+    <w:lsdException w:qFormat="1" w:unhideWhenUsed="0" w:uiPriority="0" w:semiHidden="0" w:name="Hyperlink"/>
     <w:lsdException w:unhideWhenUsed="0" w:uiPriority="0" w:semiHidden="0" w:name="FollowedHyperlink"/>
     <w:lsdException w:qFormat="1" w:unhideWhenUsed="0" w:uiPriority="0" w:semiHidden="0" w:name="Strong"/>
     <w:lsdException w:qFormat="1" w:unhideWhenUsed="0" w:uiPriority="0" w:semiHidden="0" w:name="Emphasis"/>
@@ -21484,14 +21743,14 @@
     <w:lsdException w:unhideWhenUsed="0" w:uiPriority="0" w:semiHidden="0" w:name="HTML Acronym"/>
     <w:lsdException w:unhideWhenUsed="0" w:uiPriority="0" w:semiHidden="0" w:name="HTML Address"/>
     <w:lsdException w:unhideWhenUsed="0" w:uiPriority="0" w:semiHidden="0" w:name="HTML Cite"/>
-    <w:lsdException w:unhideWhenUsed="0" w:uiPriority="0" w:semiHidden="0" w:name="HTML Code"/>
+    <w:lsdException w:qFormat="1" w:unhideWhenUsed="0" w:uiPriority="0" w:semiHidden="0" w:name="HTML Code"/>
     <w:lsdException w:unhideWhenUsed="0" w:uiPriority="0" w:semiHidden="0" w:name="HTML Definition"/>
     <w:lsdException w:unhideWhenUsed="0" w:uiPriority="0" w:semiHidden="0" w:name="HTML Keyboard"/>
     <w:lsdException w:unhideWhenUsed="0" w:uiPriority="0" w:semiHidden="0" w:name="HTML Preformatted"/>
     <w:lsdException w:unhideWhenUsed="0" w:uiPriority="0" w:semiHidden="0" w:name="HTML Sample"/>
     <w:lsdException w:unhideWhenUsed="0" w:uiPriority="0" w:semiHidden="0" w:name="HTML Typewriter"/>
     <w:lsdException w:unhideWhenUsed="0" w:uiPriority="0" w:semiHidden="0" w:name="HTML Variable"/>
-    <w:lsdException w:unhideWhenUsed="0" w:uiPriority="0" w:name="Normal Table"/>
+    <w:lsdException w:qFormat="1" w:unhideWhenUsed="0" w:uiPriority="0" w:name="Normal Table"/>
     <w:lsdException w:unhideWhenUsed="0" w:uiPriority="0" w:semiHidden="0" w:name="annotation subject"/>
     <w:lsdException w:unhideWhenUsed="0" w:uiPriority="0" w:semiHidden="0" w:name="Table Simple 1"/>
     <w:lsdException w:unhideWhenUsed="0" w:uiPriority="0" w:semiHidden="0" w:name="Table Simple 2"/>
@@ -21715,6 +21974,7 @@
   <w:style w:type="table" w:default="1" w:styleId="6">
     <w:name w:val="Normal Table"/>
     <w:semiHidden/>
+    <w:qFormat/>
     <w:uiPriority w:val="0"/>
     <w:tblPr>
       <w:tblCellMar>
@@ -21738,6 +21998,7 @@
   <w:style w:type="paragraph" w:styleId="8">
     <w:name w:val="footer"/>
     <w:basedOn w:val="1"/>
+    <w:qFormat/>
     <w:uiPriority w:val="0"/>
     <w:pPr>
       <w:tabs>
@@ -21755,6 +22016,7 @@
   <w:style w:type="paragraph" w:styleId="9">
     <w:name w:val="header"/>
     <w:basedOn w:val="1"/>
+    <w:qFormat/>
     <w:uiPriority w:val="0"/>
     <w:pPr>
       <w:tabs>
@@ -21771,6 +22033,7 @@
   <w:style w:type="character" w:styleId="10">
     <w:name w:val="HTML Code"/>
     <w:basedOn w:val="5"/>
+    <w:qFormat/>
     <w:uiPriority w:val="0"/>
     <w:rPr>
       <w:rFonts w:ascii="Courier New" w:hAnsi="Courier New" w:cs="Courier New"/>
@@ -21781,6 +22044,7 @@
   <w:style w:type="character" w:styleId="11">
     <w:name w:val="Hyperlink"/>
     <w:basedOn w:val="5"/>
+    <w:qFormat/>
     <w:uiPriority w:val="0"/>
     <w:rPr>
       <w:color w:val="0000FF"/>

</xml_diff>

<commit_message>
Update DOCX and add PDF version
Modified the Word document 'tuman maktablarida masofaviy talim platformalarini informatika darslarida tashkil etishni o'rganish.docx' and added a new PDF export of the same document for distribution/printing convenience.
</commit_message>
<xml_diff>
--- a/tuman maktablarida masofaviy talim platformalarini informatika darslarida tashkil etishni o'rganish.docx
+++ b/tuman maktablarida masofaviy talim platformalarini informatika darslarida tashkil etishni o'rganish.docx
@@ -16,11 +16,11 @@
           <w:szCs w:val="28"/>
         </w:rPr>
       </w:pPr>
-      <w:bookmarkStart w:id="0" w:name="_Toc11431"/>
+      <w:bookmarkStart w:id="0" w:name="_Toc32418"/>
       <w:bookmarkStart w:id="1" w:name="_Toc19517"/>
-      <w:bookmarkStart w:id="2" w:name="_Toc14432"/>
-      <w:bookmarkStart w:id="3" w:name="_Toc22473"/>
-      <w:bookmarkStart w:id="4" w:name="_Toc32418"/>
+      <w:bookmarkStart w:id="2" w:name="_Toc11431"/>
+      <w:bookmarkStart w:id="3" w:name="_Toc14432"/>
+      <w:bookmarkStart w:id="4" w:name="_Toc22473"/>
       <w:r>
         <w:rPr>
           <w:rFonts w:hint="default" w:ascii="Times New Roman" w:hAnsi="Times New Roman" w:cs="Times New Roman"/>
@@ -264,7 +264,7 @@
           <w:sz w:val="28"/>
           <w:szCs w:val="28"/>
         </w:rPr>
-        <w:t>7</w:t>
+        <w:t>10</w:t>
       </w:r>
       <w:r>
         <w:rPr>
@@ -389,7 +389,7 @@
           <w:sz w:val="28"/>
           <w:szCs w:val="28"/>
         </w:rPr>
-        <w:t>7</w:t>
+        <w:t>10</w:t>
       </w:r>
       <w:r>
         <w:rPr>
@@ -514,7 +514,7 @@
           <w:sz w:val="28"/>
           <w:szCs w:val="28"/>
         </w:rPr>
-        <w:t>10</w:t>
+        <w:t>13</w:t>
       </w:r>
       <w:r>
         <w:rPr>
@@ -639,7 +639,7 @@
           <w:sz w:val="28"/>
           <w:szCs w:val="28"/>
         </w:rPr>
-        <w:t>13</w:t>
+        <w:t>16</w:t>
       </w:r>
       <w:r>
         <w:rPr>
@@ -764,7 +764,7 @@
           <w:sz w:val="28"/>
           <w:szCs w:val="28"/>
         </w:rPr>
-        <w:t>17</w:t>
+        <w:t>20</w:t>
       </w:r>
       <w:r>
         <w:rPr>
@@ -889,7 +889,7 @@
           <w:sz w:val="28"/>
           <w:szCs w:val="28"/>
         </w:rPr>
-        <w:t>17</w:t>
+        <w:t>20</w:t>
       </w:r>
       <w:r>
         <w:rPr>
@@ -1014,7 +1014,7 @@
           <w:sz w:val="28"/>
           <w:szCs w:val="28"/>
         </w:rPr>
-        <w:t>20</w:t>
+        <w:t>23</w:t>
       </w:r>
       <w:r>
         <w:rPr>
@@ -1139,7 +1139,7 @@
           <w:sz w:val="28"/>
           <w:szCs w:val="28"/>
         </w:rPr>
-        <w:t>23</w:t>
+        <w:t>26</w:t>
       </w:r>
       <w:r>
         <w:rPr>
@@ -1264,7 +1264,7 @@
           <w:sz w:val="28"/>
           <w:szCs w:val="28"/>
         </w:rPr>
-        <w:t>26</w:t>
+        <w:t>29</w:t>
       </w:r>
       <w:r>
         <w:rPr>
@@ -1389,7 +1389,7 @@
           <w:sz w:val="28"/>
           <w:szCs w:val="28"/>
         </w:rPr>
-        <w:t>31</w:t>
+        <w:t>34</w:t>
       </w:r>
       <w:r>
         <w:rPr>
@@ -1514,7 +1514,7 @@
           <w:sz w:val="28"/>
           <w:szCs w:val="28"/>
         </w:rPr>
-        <w:t>31</w:t>
+        <w:t>34</w:t>
       </w:r>
       <w:r>
         <w:rPr>
@@ -1639,7 +1639,7 @@
           <w:sz w:val="28"/>
           <w:szCs w:val="28"/>
         </w:rPr>
-        <w:t>35</w:t>
+        <w:t>38</w:t>
       </w:r>
       <w:r>
         <w:rPr>
@@ -1764,7 +1764,7 @@
           <w:sz w:val="28"/>
           <w:szCs w:val="28"/>
         </w:rPr>
-        <w:t>39</w:t>
+        <w:t>42</w:t>
       </w:r>
       <w:r>
         <w:rPr>
@@ -1889,7 +1889,7 @@
           <w:sz w:val="28"/>
           <w:szCs w:val="28"/>
         </w:rPr>
-        <w:t>44</w:t>
+        <w:t>47</w:t>
       </w:r>
       <w:r>
         <w:rPr>
@@ -2014,7 +2014,7 @@
           <w:sz w:val="28"/>
           <w:szCs w:val="28"/>
         </w:rPr>
-        <w:t>50</w:t>
+        <w:t>53</w:t>
       </w:r>
       <w:r>
         <w:rPr>
@@ -2139,7 +2139,7 @@
           <w:sz w:val="28"/>
           <w:szCs w:val="28"/>
         </w:rPr>
-        <w:t>50</w:t>
+        <w:t>53</w:t>
       </w:r>
       <w:r>
         <w:rPr>
@@ -2264,7 +2264,7 @@
           <w:sz w:val="28"/>
           <w:szCs w:val="28"/>
         </w:rPr>
-        <w:t>53</w:t>
+        <w:t>58</w:t>
       </w:r>
       <w:r>
         <w:rPr>
@@ -2389,7 +2389,7 @@
           <w:sz w:val="28"/>
           <w:szCs w:val="28"/>
         </w:rPr>
-        <w:t>55</w:t>
+        <w:t>62</w:t>
       </w:r>
       <w:r>
         <w:rPr>
@@ -2514,7 +2514,7 @@
           <w:sz w:val="28"/>
           <w:szCs w:val="28"/>
         </w:rPr>
-        <w:t>59</w:t>
+        <w:t>67</w:t>
       </w:r>
       <w:r>
         <w:rPr>
@@ -2639,7 +2639,7 @@
           <w:sz w:val="28"/>
           <w:szCs w:val="28"/>
         </w:rPr>
-        <w:t>66</w:t>
+        <w:t>76</w:t>
       </w:r>
       <w:r>
         <w:rPr>
@@ -2764,7 +2764,7 @@
           <w:sz w:val="28"/>
           <w:szCs w:val="28"/>
         </w:rPr>
-        <w:t>69</w:t>
+        <w:t>79</w:t>
       </w:r>
       <w:r>
         <w:rPr>
@@ -2824,11 +2824,531 @@
     </w:p>
     <w:p>
       <w:pPr>
+        <w:pStyle w:val="4"/>
+        <w:keepNext w:val="0"/>
+        <w:keepLines w:val="0"/>
+        <w:widowControl/>
+        <w:suppressLineNumbers w:val="0"/>
+        <w:spacing w:line="360" w:lineRule="auto"/>
+        <w:jc w:val="both"/>
+        <w:rPr>
+          <w:rFonts w:hint="default" w:ascii="Times New Roman" w:hAnsi="Times New Roman" w:cs="Times New Roman"/>
+          <w:sz w:val="28"/>
+          <w:szCs w:val="28"/>
+        </w:rPr>
+      </w:pPr>
+      <w:bookmarkStart w:id="5" w:name="_Toc27613"/>
+      <w:bookmarkStart w:id="6" w:name="_Toc10430"/>
+      <w:r>
+        <w:rPr>
+          <w:rFonts w:hint="default" w:ascii="Times New Roman" w:hAnsi="Times New Roman" w:cs="Times New Roman"/>
+          <w:sz w:val="28"/>
+          <w:szCs w:val="28"/>
+        </w:rPr>
+        <w:t>ANNOTATSIYA</w:t>
+      </w:r>
+    </w:p>
+    <w:p>
+      <w:pPr>
+        <w:pStyle w:val="12"/>
+        <w:keepNext w:val="0"/>
+        <w:keepLines w:val="0"/>
+        <w:widowControl/>
+        <w:suppressLineNumbers w:val="0"/>
+        <w:spacing w:line="360" w:lineRule="auto"/>
+        <w:jc w:val="both"/>
+        <w:rPr>
+          <w:rFonts w:hint="default" w:ascii="Times New Roman" w:hAnsi="Times New Roman" w:cs="Times New Roman"/>
+          <w:sz w:val="28"/>
+          <w:szCs w:val="28"/>
+        </w:rPr>
+      </w:pPr>
+      <w:r>
+        <w:rPr>
+          <w:rFonts w:hint="default" w:ascii="Times New Roman" w:hAnsi="Times New Roman" w:cs="Times New Roman"/>
+          <w:sz w:val="28"/>
+          <w:szCs w:val="28"/>
+        </w:rPr>
+        <w:t>Mazkur diplom ishida tuman maktablarida masofaviy ta’lim platformalarini informatika darslarida tashkil etishning nazariy va amaliy asoslari o‘rganilgan. Hozirgi kunda axborot-kommunikatsiya texnologiyalarining jadal rivojlanishi ta’lim tizimiga zamonaviy yondashuvlarni joriy etishni talab qilmoqda. Shu sababli masofaviy ta’lim platformalaridan foydalanish o‘quv jarayonining samaradorligini oshirishda muhim omillardan biri hisoblanadi.</w:t>
+      </w:r>
+      <w:bookmarkStart w:id="147" w:name="_GoBack"/>
+      <w:bookmarkEnd w:id="147"/>
+    </w:p>
+    <w:p>
+      <w:pPr>
+        <w:pStyle w:val="12"/>
+        <w:keepNext w:val="0"/>
+        <w:keepLines w:val="0"/>
+        <w:widowControl/>
+        <w:suppressLineNumbers w:val="0"/>
+        <w:spacing w:line="360" w:lineRule="auto"/>
+        <w:jc w:val="both"/>
+        <w:rPr>
+          <w:rFonts w:hint="default" w:ascii="Times New Roman" w:hAnsi="Times New Roman" w:cs="Times New Roman"/>
+          <w:sz w:val="28"/>
+          <w:szCs w:val="28"/>
+        </w:rPr>
+      </w:pPr>
+      <w:r>
+        <w:rPr>
+          <w:rFonts w:hint="default" w:ascii="Times New Roman" w:hAnsi="Times New Roman" w:cs="Times New Roman"/>
+          <w:sz w:val="28"/>
+          <w:szCs w:val="28"/>
+        </w:rPr>
+        <w:t>Tadqiqot davomida masofaviy ta’limning mazmuni, afzalliklari, imkoniyatlari hamda informatika fanini o‘qitishda qo‘llash usullari tahlil qilindi. Shuningdek, Google Classroom, Moodle, Zoom, Microsoft Teams kabi platformalarning imkoniyatlari o‘rganilib, ularni informatika darslariga mos ravishda tashkil etish metodikasi ishlab chiqildi.</w:t>
+      </w:r>
+    </w:p>
+    <w:p>
+      <w:pPr>
+        <w:pStyle w:val="12"/>
+        <w:keepNext w:val="0"/>
+        <w:keepLines w:val="0"/>
+        <w:widowControl/>
+        <w:suppressLineNumbers w:val="0"/>
+        <w:spacing w:line="360" w:lineRule="auto"/>
+        <w:jc w:val="both"/>
+        <w:rPr>
+          <w:rFonts w:hint="default" w:ascii="Times New Roman" w:hAnsi="Times New Roman" w:cs="Times New Roman"/>
+          <w:sz w:val="28"/>
+          <w:szCs w:val="28"/>
+        </w:rPr>
+      </w:pPr>
+      <w:r>
+        <w:rPr>
+          <w:rFonts w:hint="default" w:ascii="Times New Roman" w:hAnsi="Times New Roman" w:cs="Times New Roman"/>
+          <w:sz w:val="28"/>
+          <w:szCs w:val="28"/>
+        </w:rPr>
+        <w:t>Diplom ishida o‘quvchilarning mustaqil ishlash ko‘nikmalarini rivojlantirish, elektron ta’lim resurslaridan samarali foydalanish hamda interaktiv metodlarni qo‘llash masalalariga alohida e’tibor qaratilgan. Tadqiqot natijasida masofaviy ta’lim platformalaridan foydalanish informatika fanini o‘qitish sifatini oshirishi, o‘quvchilarning bilim olishga bo‘lgan qiziqishini kuchaytirishi va zamonaviy raqamli kompetensiyalarini rivojlantirishi aniqlandi.</w:t>
+      </w:r>
+    </w:p>
+    <w:p>
+      <w:pPr>
+        <w:pStyle w:val="12"/>
+        <w:keepNext w:val="0"/>
+        <w:keepLines w:val="0"/>
+        <w:widowControl/>
+        <w:suppressLineNumbers w:val="0"/>
+        <w:spacing w:line="360" w:lineRule="auto"/>
+        <w:jc w:val="both"/>
+        <w:rPr>
+          <w:rFonts w:hint="default" w:ascii="Times New Roman" w:hAnsi="Times New Roman" w:cs="Times New Roman"/>
+          <w:sz w:val="28"/>
+          <w:szCs w:val="28"/>
+        </w:rPr>
+      </w:pPr>
+      <w:r>
+        <w:rPr>
+          <w:rFonts w:hint="default" w:ascii="Times New Roman" w:hAnsi="Times New Roman" w:cs="Times New Roman"/>
+          <w:sz w:val="28"/>
+          <w:szCs w:val="28"/>
+        </w:rPr>
+        <w:t>Mazkur ish natijalaridan umumta’lim maktablarida informatika fanini o‘qitishda, masofaviy ta’limni tashkil etishda hamda elektron ta’lim resurslarini yaratishda foydalanish mumkin.</w:t>
+      </w:r>
+    </w:p>
+    <w:p>
+      <w:pPr>
+        <w:pStyle w:val="12"/>
+        <w:keepNext w:val="0"/>
+        <w:keepLines w:val="0"/>
+        <w:widowControl/>
+        <w:suppressLineNumbers w:val="0"/>
+        <w:spacing w:line="360" w:lineRule="auto"/>
+        <w:jc w:val="both"/>
+        <w:rPr>
+          <w:rFonts w:hint="default" w:ascii="Times New Roman" w:hAnsi="Times New Roman" w:cs="Times New Roman"/>
+          <w:sz w:val="28"/>
+          <w:szCs w:val="28"/>
+        </w:rPr>
+      </w:pPr>
+      <w:r>
+        <w:rPr>
+          <w:rStyle w:val="13"/>
+          <w:rFonts w:hint="default" w:ascii="Times New Roman" w:hAnsi="Times New Roman" w:cs="Times New Roman"/>
+          <w:sz w:val="28"/>
+          <w:szCs w:val="28"/>
+        </w:rPr>
+        <w:t>Kalit so‘zlar:</w:t>
+      </w:r>
+      <w:r>
+        <w:rPr>
+          <w:rFonts w:hint="default" w:ascii="Times New Roman" w:hAnsi="Times New Roman" w:cs="Times New Roman"/>
+          <w:sz w:val="28"/>
+          <w:szCs w:val="28"/>
+        </w:rPr>
+        <w:t xml:space="preserve"> masofaviy ta’lim, informatika, ta’lim platformalari, AKT, elektron ta’lim, Google Classroom, Moodle, Zoom, interaktiv metodlar, raqamli texnologiyalar.</w:t>
+      </w:r>
+    </w:p>
+    <w:p>
+      <w:pPr>
+        <w:rPr>
+          <w:rFonts w:hint="default" w:ascii="Times New Roman" w:hAnsi="Times New Roman" w:cs="Times New Roman"/>
+          <w:sz w:val="28"/>
+          <w:szCs w:val="28"/>
+        </w:rPr>
+      </w:pPr>
+      <w:r>
+        <w:rPr>
+          <w:rFonts w:hint="default" w:ascii="Times New Roman" w:hAnsi="Times New Roman" w:cs="Times New Roman"/>
+          <w:sz w:val="28"/>
+          <w:szCs w:val="28"/>
+        </w:rPr>
+        <w:br w:type="page"/>
+      </w:r>
+    </w:p>
+    <w:p>
+      <w:pPr>
+        <w:pStyle w:val="4"/>
+        <w:keepNext w:val="0"/>
+        <w:keepLines w:val="0"/>
+        <w:widowControl/>
+        <w:suppressLineNumbers w:val="0"/>
+        <w:spacing w:line="360" w:lineRule="auto"/>
+        <w:jc w:val="both"/>
+        <w:rPr>
+          <w:rFonts w:hint="default" w:ascii="Times New Roman" w:hAnsi="Times New Roman" w:cs="Times New Roman"/>
+          <w:sz w:val="28"/>
+          <w:szCs w:val="28"/>
+        </w:rPr>
+      </w:pPr>
+      <w:r>
+        <w:rPr>
+          <w:rFonts w:hint="default" w:ascii="Times New Roman" w:hAnsi="Times New Roman" w:cs="Times New Roman"/>
+          <w:sz w:val="28"/>
+          <w:szCs w:val="28"/>
+        </w:rPr>
+        <w:t>АННОТАЦИЯ</w:t>
+      </w:r>
+    </w:p>
+    <w:p>
+      <w:pPr>
+        <w:pStyle w:val="12"/>
+        <w:keepNext w:val="0"/>
+        <w:keepLines w:val="0"/>
+        <w:widowControl/>
+        <w:suppressLineNumbers w:val="0"/>
+        <w:spacing w:line="360" w:lineRule="auto"/>
+        <w:jc w:val="both"/>
+        <w:rPr>
+          <w:rFonts w:hint="default" w:ascii="Times New Roman" w:hAnsi="Times New Roman" w:cs="Times New Roman"/>
+          <w:sz w:val="28"/>
+          <w:szCs w:val="28"/>
+        </w:rPr>
+      </w:pPr>
+      <w:r>
+        <w:rPr>
+          <w:rFonts w:hint="default" w:ascii="Times New Roman" w:hAnsi="Times New Roman" w:cs="Times New Roman"/>
+          <w:sz w:val="28"/>
+          <w:szCs w:val="28"/>
+        </w:rPr>
+        <w:t>В данной дипломной работе изучены теоретические и практические основы организации платформ дистанционного обучения на уроках информатики в районных школах. В настоящее время стремительное развитие информационно-коммуникационных технологий требует внедрения современных подходов в систему образования. В связи с этим использование платформ дистанционного обучения является одним из важных факторов повышения эффективности образовательного процесса.</w:t>
+      </w:r>
+    </w:p>
+    <w:p>
+      <w:pPr>
+        <w:pStyle w:val="12"/>
+        <w:keepNext w:val="0"/>
+        <w:keepLines w:val="0"/>
+        <w:widowControl/>
+        <w:suppressLineNumbers w:val="0"/>
+        <w:spacing w:line="360" w:lineRule="auto"/>
+        <w:jc w:val="both"/>
+        <w:rPr>
+          <w:rFonts w:hint="default" w:ascii="Times New Roman" w:hAnsi="Times New Roman" w:cs="Times New Roman"/>
+          <w:sz w:val="28"/>
+          <w:szCs w:val="28"/>
+        </w:rPr>
+      </w:pPr>
+      <w:r>
+        <w:rPr>
+          <w:rFonts w:hint="default" w:ascii="Times New Roman" w:hAnsi="Times New Roman" w:cs="Times New Roman"/>
+          <w:sz w:val="28"/>
+          <w:szCs w:val="28"/>
+        </w:rPr>
+        <w:t>В ходе исследования были проанализированы сущность дистанционного обучения, его преимущества, возможности и методы применения при преподавании информатики. Также были изучены возможности таких платформ, как Google Classroom, Moodle, Zoom и Microsoft Teams, и разработана методика их использования в процессе обучения информатике.</w:t>
+      </w:r>
+    </w:p>
+    <w:p>
+      <w:pPr>
+        <w:pStyle w:val="12"/>
+        <w:keepNext w:val="0"/>
+        <w:keepLines w:val="0"/>
+        <w:widowControl/>
+        <w:suppressLineNumbers w:val="0"/>
+        <w:spacing w:line="360" w:lineRule="auto"/>
+        <w:jc w:val="both"/>
+        <w:rPr>
+          <w:rFonts w:hint="default" w:ascii="Times New Roman" w:hAnsi="Times New Roman" w:cs="Times New Roman"/>
+          <w:sz w:val="28"/>
+          <w:szCs w:val="28"/>
+        </w:rPr>
+      </w:pPr>
+      <w:r>
+        <w:rPr>
+          <w:rFonts w:hint="default" w:ascii="Times New Roman" w:hAnsi="Times New Roman" w:cs="Times New Roman"/>
+          <w:sz w:val="28"/>
+          <w:szCs w:val="28"/>
+        </w:rPr>
+        <w:t>В дипломной работе особое внимание уделено развитию навыков самостоятельной работы учащихся, эффективному использованию электронных образовательных ресурсов и применению интерактивных методов обучения. В результате исследования установлено, что использование платформ дистанционного обучения способствует повышению качества преподавания информатики, усиливает интерес учащихся к обучению и развивает их современные цифровые компетенции.</w:t>
+      </w:r>
+    </w:p>
+    <w:p>
+      <w:pPr>
+        <w:pStyle w:val="12"/>
+        <w:keepNext w:val="0"/>
+        <w:keepLines w:val="0"/>
+        <w:widowControl/>
+        <w:suppressLineNumbers w:val="0"/>
+        <w:spacing w:line="360" w:lineRule="auto"/>
+        <w:jc w:val="both"/>
+        <w:rPr>
+          <w:rFonts w:hint="default" w:ascii="Times New Roman" w:hAnsi="Times New Roman" w:cs="Times New Roman"/>
+          <w:sz w:val="28"/>
+          <w:szCs w:val="28"/>
+        </w:rPr>
+      </w:pPr>
+      <w:r>
+        <w:rPr>
+          <w:rFonts w:hint="default" w:ascii="Times New Roman" w:hAnsi="Times New Roman" w:cs="Times New Roman"/>
+          <w:sz w:val="28"/>
+          <w:szCs w:val="28"/>
+        </w:rPr>
+        <w:t>Результаты данной работы могут быть использованы в общеобразовательных школах при преподавании информатики, организации дистанционного обучения и создании электронных образовательных ресурсов.</w:t>
+      </w:r>
+    </w:p>
+    <w:p>
+      <w:pPr>
+        <w:pStyle w:val="12"/>
+        <w:keepNext w:val="0"/>
+        <w:keepLines w:val="0"/>
+        <w:widowControl/>
+        <w:suppressLineNumbers w:val="0"/>
+        <w:spacing w:line="360" w:lineRule="auto"/>
+        <w:jc w:val="both"/>
+        <w:rPr>
+          <w:rFonts w:hint="default" w:ascii="Times New Roman" w:hAnsi="Times New Roman" w:cs="Times New Roman"/>
+          <w:sz w:val="28"/>
+          <w:szCs w:val="28"/>
+        </w:rPr>
+      </w:pPr>
+      <w:r>
+        <w:rPr>
+          <w:rStyle w:val="13"/>
+          <w:rFonts w:hint="default" w:ascii="Times New Roman" w:hAnsi="Times New Roman" w:cs="Times New Roman"/>
+          <w:sz w:val="28"/>
+          <w:szCs w:val="28"/>
+        </w:rPr>
+        <w:t>Ключевые слова:</w:t>
+      </w:r>
+      <w:r>
+        <w:rPr>
+          <w:rFonts w:hint="default" w:ascii="Times New Roman" w:hAnsi="Times New Roman" w:cs="Times New Roman"/>
+          <w:sz w:val="28"/>
+          <w:szCs w:val="28"/>
+        </w:rPr>
+        <w:t xml:space="preserve"> дистанционное обучение, информатика, образовательные платформы, ИКТ, электронное обучение, Google Classroom, Moodle, Zoom, интерактивные методы, цифровые технологии.</w:t>
+      </w:r>
+    </w:p>
+    <w:p>
+      <w:pPr>
+        <w:rPr>
+          <w:rFonts w:hint="default" w:ascii="Times New Roman" w:hAnsi="Times New Roman" w:cs="Times New Roman"/>
+          <w:sz w:val="28"/>
+          <w:szCs w:val="28"/>
+        </w:rPr>
+      </w:pPr>
+      <w:r>
+        <w:rPr>
+          <w:rFonts w:hint="default" w:ascii="Times New Roman" w:hAnsi="Times New Roman" w:cs="Times New Roman"/>
+          <w:sz w:val="28"/>
+          <w:szCs w:val="28"/>
+        </w:rPr>
+        <w:br w:type="page"/>
+      </w:r>
+    </w:p>
+    <w:p>
+      <w:pPr>
+        <w:pStyle w:val="4"/>
+        <w:keepNext w:val="0"/>
+        <w:keepLines w:val="0"/>
+        <w:widowControl/>
+        <w:suppressLineNumbers w:val="0"/>
+        <w:spacing w:line="360" w:lineRule="auto"/>
+        <w:jc w:val="both"/>
+        <w:rPr>
+          <w:rFonts w:hint="default" w:ascii="Times New Roman" w:hAnsi="Times New Roman" w:cs="Times New Roman"/>
+          <w:sz w:val="28"/>
+          <w:szCs w:val="28"/>
+        </w:rPr>
+      </w:pPr>
+      <w:r>
+        <w:rPr>
+          <w:rFonts w:hint="default" w:ascii="Times New Roman" w:hAnsi="Times New Roman" w:cs="Times New Roman"/>
+          <w:sz w:val="28"/>
+          <w:szCs w:val="28"/>
+        </w:rPr>
+        <w:t>ABSTRACT</w:t>
+      </w:r>
+    </w:p>
+    <w:p>
+      <w:pPr>
+        <w:pStyle w:val="12"/>
+        <w:keepNext w:val="0"/>
+        <w:keepLines w:val="0"/>
+        <w:widowControl/>
+        <w:suppressLineNumbers w:val="0"/>
+        <w:spacing w:line="360" w:lineRule="auto"/>
+        <w:jc w:val="both"/>
+        <w:rPr>
+          <w:rFonts w:hint="default" w:ascii="Times New Roman" w:hAnsi="Times New Roman" w:cs="Times New Roman"/>
+          <w:sz w:val="28"/>
+          <w:szCs w:val="28"/>
+        </w:rPr>
+      </w:pPr>
+      <w:r>
+        <w:rPr>
+          <w:rFonts w:hint="default" w:ascii="Times New Roman" w:hAnsi="Times New Roman" w:cs="Times New Roman"/>
+          <w:sz w:val="28"/>
+          <w:szCs w:val="28"/>
+        </w:rPr>
+        <w:t>This diploma work studies the theoretical and practical foundations of organizing distance learning platforms in computer science lessons at district schools. Nowadays, the rapid development of information and communication technologies requires the introduction of modern approaches into the education system. Therefore, the use of distance learning platforms is considered one of the important factors in improving the efficiency of the educational process.</w:t>
+      </w:r>
+    </w:p>
+    <w:p>
+      <w:pPr>
+        <w:pStyle w:val="12"/>
+        <w:keepNext w:val="0"/>
+        <w:keepLines w:val="0"/>
+        <w:widowControl/>
+        <w:suppressLineNumbers w:val="0"/>
+        <w:spacing w:line="360" w:lineRule="auto"/>
+        <w:jc w:val="both"/>
+        <w:rPr>
+          <w:rFonts w:hint="default" w:ascii="Times New Roman" w:hAnsi="Times New Roman" w:cs="Times New Roman"/>
+          <w:sz w:val="28"/>
+          <w:szCs w:val="28"/>
+        </w:rPr>
+      </w:pPr>
+      <w:r>
+        <w:rPr>
+          <w:rFonts w:hint="default" w:ascii="Times New Roman" w:hAnsi="Times New Roman" w:cs="Times New Roman"/>
+          <w:sz w:val="28"/>
+          <w:szCs w:val="28"/>
+        </w:rPr>
+        <w:t>During the research, the essence of distance learning, its advantages, opportunities, and methods of application in teaching computer science were analyzed. In addition, the capabilities of platforms such as Google Classroom, Moodle, Zoom, and Microsoft Teams were studied, and a methodology for their effective use in computer science lessons was developed.</w:t>
+      </w:r>
+    </w:p>
+    <w:p>
+      <w:pPr>
+        <w:pStyle w:val="12"/>
+        <w:keepNext w:val="0"/>
+        <w:keepLines w:val="0"/>
+        <w:widowControl/>
+        <w:suppressLineNumbers w:val="0"/>
+        <w:spacing w:line="360" w:lineRule="auto"/>
+        <w:jc w:val="both"/>
+        <w:rPr>
+          <w:rFonts w:hint="default" w:ascii="Times New Roman" w:hAnsi="Times New Roman" w:cs="Times New Roman"/>
+          <w:sz w:val="28"/>
+          <w:szCs w:val="28"/>
+        </w:rPr>
+      </w:pPr>
+      <w:r>
+        <w:rPr>
+          <w:rFonts w:hint="default" w:ascii="Times New Roman" w:hAnsi="Times New Roman" w:cs="Times New Roman"/>
+          <w:sz w:val="28"/>
+          <w:szCs w:val="28"/>
+        </w:rPr>
+        <w:t>Special attention in the diploma work was paid to the development of students’ independent learning skills, the effective use of electronic educational resources, and the application of interactive teaching methods. The results of the research showed that the use of distance learning platforms improves the quality of teaching computer science, increases students’ interest in learning, and develops their modern digital competencies.</w:t>
+      </w:r>
+    </w:p>
+    <w:p>
+      <w:pPr>
+        <w:pStyle w:val="12"/>
+        <w:keepNext w:val="0"/>
+        <w:keepLines w:val="0"/>
+        <w:widowControl/>
+        <w:suppressLineNumbers w:val="0"/>
+        <w:spacing w:line="360" w:lineRule="auto"/>
+        <w:jc w:val="both"/>
+        <w:rPr>
+          <w:rFonts w:hint="default" w:ascii="Times New Roman" w:hAnsi="Times New Roman" w:cs="Times New Roman"/>
+          <w:sz w:val="28"/>
+          <w:szCs w:val="28"/>
+        </w:rPr>
+      </w:pPr>
+      <w:r>
+        <w:rPr>
+          <w:rFonts w:hint="default" w:ascii="Times New Roman" w:hAnsi="Times New Roman" w:cs="Times New Roman"/>
+          <w:sz w:val="28"/>
+          <w:szCs w:val="28"/>
+        </w:rPr>
+        <w:t>The results of this research can be used in secondary schools for teaching computer science, organizing distance education, and creating electronic educational resources.</w:t>
+      </w:r>
+    </w:p>
+    <w:p>
+      <w:pPr>
+        <w:pStyle w:val="12"/>
+        <w:keepNext w:val="0"/>
+        <w:keepLines w:val="0"/>
+        <w:widowControl/>
+        <w:suppressLineNumbers w:val="0"/>
+        <w:spacing w:line="360" w:lineRule="auto"/>
+        <w:jc w:val="both"/>
+        <w:rPr>
+          <w:rFonts w:hint="default" w:ascii="Times New Roman" w:hAnsi="Times New Roman" w:cs="Times New Roman"/>
+          <w:sz w:val="28"/>
+          <w:szCs w:val="28"/>
+        </w:rPr>
+      </w:pPr>
+      <w:r>
+        <w:rPr>
+          <w:rStyle w:val="13"/>
+          <w:rFonts w:hint="default" w:ascii="Times New Roman" w:hAnsi="Times New Roman" w:cs="Times New Roman"/>
+          <w:sz w:val="28"/>
+          <w:szCs w:val="28"/>
+        </w:rPr>
+        <w:t>Keywords:</w:t>
+      </w:r>
+      <w:r>
+        <w:rPr>
+          <w:rFonts w:hint="default" w:ascii="Times New Roman" w:hAnsi="Times New Roman" w:cs="Times New Roman"/>
+          <w:sz w:val="28"/>
+          <w:szCs w:val="28"/>
+        </w:rPr>
+        <w:t xml:space="preserve"> distance learning, computer science, educational platforms, ICT, e-learning, Google Classroom, Moodle, Zoom, interactive methods, digital technologies.</w:t>
+      </w:r>
+    </w:p>
+    <w:p>
+      <w:pPr>
+        <w:spacing w:line="360" w:lineRule="auto"/>
+        <w:jc w:val="both"/>
+        <w:rPr>
+          <w:rStyle w:val="13"/>
+          <w:rFonts w:hint="default" w:ascii="Times New Roman" w:hAnsi="Times New Roman" w:cs="Times New Roman"/>
+          <w:b/>
+          <w:bCs/>
+          <w:sz w:val="28"/>
+          <w:szCs w:val="28"/>
+        </w:rPr>
+      </w:pPr>
+      <w:r>
+        <w:rPr>
+          <w:rStyle w:val="13"/>
+          <w:rFonts w:hint="default" w:ascii="Times New Roman" w:hAnsi="Times New Roman" w:cs="Times New Roman"/>
+          <w:b/>
+          <w:bCs/>
+          <w:sz w:val="28"/>
+          <w:szCs w:val="28"/>
+        </w:rPr>
+        <w:br w:type="page"/>
+      </w:r>
+    </w:p>
+    <w:p>
+      <w:pPr>
         <w:pStyle w:val="2"/>
         <w:bidi w:val="0"/>
       </w:pPr>
-      <w:bookmarkStart w:id="5" w:name="_Toc27613"/>
-      <w:bookmarkStart w:id="6" w:name="_Toc10430"/>
       <w:r>
         <w:rPr>
           <w:rStyle w:val="13"/>
@@ -2847,45 +3367,35 @@
       <w:bookmarkEnd w:id="4"/>
       <w:bookmarkEnd w:id="5"/>
       <w:bookmarkEnd w:id="6"/>
-      <w:bookmarkStart w:id="7" w:name="_Toc22652"/>
-      <w:bookmarkStart w:id="8" w:name="_Toc13329"/>
-      <w:bookmarkStart w:id="9" w:name="_Toc4640"/>
-      <w:bookmarkStart w:id="10" w:name="_Toc9986"/>
-      <w:bookmarkStart w:id="11" w:name="_Toc5295"/>
-    </w:p>
-    <w:p>
-      <w:pPr>
-        <w:pStyle w:val="12"/>
-        <w:keepNext w:val="0"/>
-        <w:keepLines w:val="0"/>
-        <w:widowControl/>
-        <w:suppressLineNumbers w:val="0"/>
-        <w:spacing w:line="360" w:lineRule="auto"/>
-        <w:ind w:firstLine="720" w:firstLineChars="0"/>
-        <w:jc w:val="both"/>
-        <w:rPr>
-          <w:rFonts w:hint="default" w:ascii="Times New Roman" w:hAnsi="Times New Roman" w:cs="Times New Roman"/>
-          <w:sz w:val="28"/>
-          <w:szCs w:val="28"/>
-        </w:rPr>
-      </w:pPr>
-      <w:r>
-        <w:rPr>
-          <w:rFonts w:hint="default" w:ascii="Times New Roman" w:hAnsi="Times New Roman" w:cs="Times New Roman"/>
-          <w:sz w:val="28"/>
-          <w:szCs w:val="28"/>
-        </w:rPr>
-        <w:t>Hozirgi globallashuv va raqamli texnologiyalar jadal rivojlanayotgan davrda ta’lim tizimini modernizatsiya qilish muhim ahamiyat kasb etmoqda. Axborot-kommunikatsiya texnologiyalar</w:t>
-      </w:r>
-      <w:bookmarkStart w:id="147" w:name="_GoBack"/>
-      <w:bookmarkEnd w:id="147"/>
-      <w:r>
-        <w:rPr>
-          <w:rFonts w:hint="default" w:ascii="Times New Roman" w:hAnsi="Times New Roman" w:cs="Times New Roman"/>
-          <w:sz w:val="28"/>
-          <w:szCs w:val="28"/>
-        </w:rPr>
-        <w:t>ining (AKT) keng joriy etilishi ta’lim jarayoniga yangicha yondashuvlarni olib kirib, o‘qitishning samaradorligini oshirishga xizmat qilmoqda. Ayniqsa, masofaviy ta’lim tizimlari zamonaviy ta’limning ajralmas qismiga aylanib bormoqda. Bu esa o‘z navbatida umumta’lim maktablarida, xususan, tuman maktablarida ham masofaviy ta’lim platformalarini joriy etish zaruratini yuzaga keltirmoqda.</w:t>
+      <w:bookmarkStart w:id="7" w:name="_Toc5295"/>
+      <w:bookmarkStart w:id="8" w:name="_Toc4640"/>
+      <w:bookmarkStart w:id="9" w:name="_Toc9986"/>
+      <w:bookmarkStart w:id="10" w:name="_Toc22652"/>
+      <w:bookmarkStart w:id="11" w:name="_Toc13329"/>
+    </w:p>
+    <w:p>
+      <w:pPr>
+        <w:pStyle w:val="12"/>
+        <w:keepNext w:val="0"/>
+        <w:keepLines w:val="0"/>
+        <w:widowControl/>
+        <w:suppressLineNumbers w:val="0"/>
+        <w:spacing w:line="360" w:lineRule="auto"/>
+        <w:ind w:firstLine="720" w:firstLineChars="0"/>
+        <w:jc w:val="both"/>
+        <w:rPr>
+          <w:rFonts w:hint="default" w:ascii="Times New Roman" w:hAnsi="Times New Roman" w:cs="Times New Roman"/>
+          <w:sz w:val="28"/>
+          <w:szCs w:val="28"/>
+        </w:rPr>
+      </w:pPr>
+      <w:r>
+        <w:rPr>
+          <w:rFonts w:hint="default" w:ascii="Times New Roman" w:hAnsi="Times New Roman" w:cs="Times New Roman"/>
+          <w:sz w:val="28"/>
+          <w:szCs w:val="28"/>
+        </w:rPr>
+        <w:t>Hozirgi globallashuv va raqamli texnologiyalar jadal rivojlanayotgan davrda ta’lim tizimini modernizatsiya qilish muhim ahamiyat kasb etmoqda. Axborot-kommunikatsiya texnologiyalarining (AKT) keng joriy etilishi ta’lim jarayoniga yangicha yondashuvlarni olib kirib, o‘qitishning samaradorligini oshirishga xizmat qilmoqda. Ayniqsa, masofaviy ta’lim tizimlari zamonaviy ta’limning ajralmas qismiga aylanib bormoqda. Bu esa o‘z navbatida umumta’lim maktablarida, xususan, tuman maktablarida ham masofaviy ta’lim platformalarini joriy etish zaruratini yuzaga keltirmoqda.</w:t>
       </w:r>
     </w:p>
     <w:p>
@@ -3686,10 +4196,10 @@
           <w:szCs w:val="28"/>
         </w:rPr>
       </w:pPr>
-      <w:bookmarkStart w:id="14" w:name="_Toc3836"/>
-      <w:bookmarkStart w:id="15" w:name="_Toc8819"/>
+      <w:bookmarkStart w:id="14" w:name="_Toc8819"/>
+      <w:bookmarkStart w:id="15" w:name="_Toc23775"/>
       <w:bookmarkStart w:id="16" w:name="_Toc19546"/>
-      <w:bookmarkStart w:id="17" w:name="_Toc23775"/>
+      <w:bookmarkStart w:id="17" w:name="_Toc3836"/>
       <w:r>
         <w:rPr>
           <w:rFonts w:hint="default" w:ascii="Times New Roman" w:hAnsi="Times New Roman" w:cs="Times New Roman"/>
@@ -4059,9 +4569,9 @@
           <w:szCs w:val="28"/>
         </w:rPr>
       </w:pPr>
-      <w:bookmarkStart w:id="18" w:name="_Toc15461"/>
-      <w:bookmarkStart w:id="19" w:name="_Toc15444"/>
-      <w:bookmarkStart w:id="20" w:name="_Toc22329"/>
+      <w:bookmarkStart w:id="18" w:name="_Toc15444"/>
+      <w:bookmarkStart w:id="19" w:name="_Toc22329"/>
+      <w:bookmarkStart w:id="20" w:name="_Toc15461"/>
       <w:r>
         <w:rPr>
           <w:rFonts w:hint="default" w:ascii="Times New Roman" w:hAnsi="Times New Roman" w:cs="Times New Roman"/>
@@ -4421,8 +4931,8 @@
           <w:szCs w:val="28"/>
         </w:rPr>
       </w:pPr>
-      <w:bookmarkStart w:id="21" w:name="_Toc761"/>
-      <w:bookmarkStart w:id="22" w:name="_Toc13838"/>
+      <w:bookmarkStart w:id="21" w:name="_Toc13838"/>
+      <w:bookmarkStart w:id="22" w:name="_Toc761"/>
       <w:bookmarkStart w:id="23" w:name="_Toc15565"/>
       <w:r>
         <w:rPr>
@@ -4545,11 +5055,6 @@
         <w:suppressLineNumbers w:val="0"/>
         <w:spacing w:line="360" w:lineRule="auto"/>
         <w:jc w:val="both"/>
-        <w:rPr>
-          <w:rFonts w:hint="default" w:ascii="Times New Roman" w:hAnsi="Times New Roman" w:cs="Times New Roman"/>
-          <w:sz w:val="28"/>
-          <w:szCs w:val="28"/>
-        </w:rPr>
       </w:pPr>
       <w:r>
         <w:drawing>
@@ -4603,6 +5108,36 @@
         <w:widowControl/>
         <w:suppressLineNumbers w:val="0"/>
         <w:spacing w:line="360" w:lineRule="auto"/>
+        <w:jc w:val="center"/>
+        <w:rPr>
+          <w:rFonts w:hint="default"/>
+          <w:b/>
+          <w:bCs/>
+          <w:sz w:val="28"/>
+          <w:szCs w:val="28"/>
+          <w:lang w:val="en-GB"/>
+        </w:rPr>
+      </w:pPr>
+      <w:r>
+        <w:rPr>
+          <w:rFonts w:hint="default"/>
+          <w:b/>
+          <w:bCs/>
+          <w:sz w:val="28"/>
+          <w:szCs w:val="28"/>
+          <w:lang w:val="en-GB"/>
+        </w:rPr>
+        <w:t>1.3 - rasm: Fanni platforma bilan bog’lanishi</w:t>
+      </w:r>
+    </w:p>
+    <w:p>
+      <w:pPr>
+        <w:pStyle w:val="12"/>
+        <w:keepNext w:val="0"/>
+        <w:keepLines w:val="0"/>
+        <w:widowControl/>
+        <w:suppressLineNumbers w:val="0"/>
+        <w:spacing w:line="360" w:lineRule="auto"/>
         <w:ind w:firstLine="720" w:firstLineChars="0"/>
         <w:jc w:val="both"/>
         <w:rPr>
@@ -4807,10 +5342,10 @@
         </w:rPr>
       </w:pPr>
       <w:bookmarkStart w:id="24" w:name="_Toc11355"/>
-      <w:bookmarkStart w:id="25" w:name="_Toc2611"/>
-      <w:bookmarkStart w:id="26" w:name="_Toc1023"/>
-      <w:bookmarkStart w:id="27" w:name="_Toc3724"/>
-      <w:bookmarkStart w:id="28" w:name="_Toc19090"/>
+      <w:bookmarkStart w:id="25" w:name="_Toc3724"/>
+      <w:bookmarkStart w:id="26" w:name="_Toc19090"/>
+      <w:bookmarkStart w:id="27" w:name="_Toc1023"/>
+      <w:bookmarkStart w:id="28" w:name="_Toc2611"/>
       <w:r>
         <w:rPr>
           <w:rStyle w:val="13"/>
@@ -4871,8 +5406,8 @@
         </w:rPr>
       </w:pPr>
       <w:bookmarkStart w:id="31" w:name="_Toc611"/>
-      <w:bookmarkStart w:id="32" w:name="_Toc2393"/>
-      <w:bookmarkStart w:id="33" w:name="_Toc32523"/>
+      <w:bookmarkStart w:id="32" w:name="_Toc32523"/>
+      <w:bookmarkStart w:id="33" w:name="_Toc2393"/>
       <w:r>
         <w:rPr>
           <w:rFonts w:hint="default" w:ascii="Times New Roman" w:hAnsi="Times New Roman" w:cs="Times New Roman"/>
@@ -4995,9 +5530,9 @@
         <w:spacing w:line="360" w:lineRule="auto"/>
         <w:jc w:val="both"/>
         <w:rPr>
-          <w:rFonts w:hint="default" w:ascii="Times New Roman" w:hAnsi="Times New Roman" w:cs="Times New Roman"/>
-          <w:sz w:val="28"/>
-          <w:szCs w:val="28"/>
+          <w:rFonts w:ascii="SimSun" w:hAnsi="SimSun" w:eastAsia="SimSun" w:cs="SimSun"/>
+          <w:sz w:val="24"/>
+          <w:szCs w:val="24"/>
         </w:rPr>
       </w:pPr>
       <w:r>
@@ -5057,6 +5592,36 @@
         <w:widowControl/>
         <w:suppressLineNumbers w:val="0"/>
         <w:spacing w:line="360" w:lineRule="auto"/>
+        <w:jc w:val="center"/>
+        <w:rPr>
+          <w:rFonts w:hint="default" w:ascii="Times New Roman" w:hAnsi="Times New Roman" w:eastAsia="SimSun" w:cs="Times New Roman"/>
+          <w:b/>
+          <w:bCs/>
+          <w:sz w:val="28"/>
+          <w:szCs w:val="28"/>
+          <w:lang w:val="en-GB"/>
+        </w:rPr>
+      </w:pPr>
+      <w:r>
+        <w:rPr>
+          <w:rFonts w:hint="default" w:ascii="Times New Roman" w:hAnsi="Times New Roman" w:cs="Times New Roman"/>
+          <w:b/>
+          <w:bCs/>
+          <w:sz w:val="28"/>
+          <w:szCs w:val="28"/>
+          <w:lang w:val="en-GB"/>
+        </w:rPr>
+        <w:t>2.1 - rasm. Fanlar bo’yicha diagrammalar</w:t>
+      </w:r>
+    </w:p>
+    <w:p>
+      <w:pPr>
+        <w:pStyle w:val="12"/>
+        <w:keepNext w:val="0"/>
+        <w:keepLines w:val="0"/>
+        <w:widowControl/>
+        <w:suppressLineNumbers w:val="0"/>
+        <w:spacing w:line="360" w:lineRule="auto"/>
         <w:ind w:firstLine="720" w:firstLineChars="0"/>
         <w:jc w:val="both"/>
         <w:rPr>
@@ -5374,9 +5939,9 @@
           <w:szCs w:val="28"/>
         </w:rPr>
       </w:pPr>
-      <w:bookmarkStart w:id="34" w:name="_Toc25202"/>
-      <w:bookmarkStart w:id="35" w:name="_Toc12989"/>
-      <w:bookmarkStart w:id="36" w:name="_Toc10882"/>
+      <w:bookmarkStart w:id="34" w:name="_Toc12989"/>
+      <w:bookmarkStart w:id="35" w:name="_Toc10882"/>
+      <w:bookmarkStart w:id="36" w:name="_Toc25202"/>
       <w:r>
         <w:rPr>
           <w:rFonts w:hint="default" w:ascii="Times New Roman" w:hAnsi="Times New Roman" w:cs="Times New Roman"/>
@@ -5660,9 +6225,9 @@
         <w:spacing w:line="360" w:lineRule="auto"/>
         <w:jc w:val="both"/>
         <w:rPr>
-          <w:rFonts w:hint="default" w:ascii="Times New Roman" w:hAnsi="Times New Roman" w:cs="Times New Roman"/>
-          <w:sz w:val="28"/>
-          <w:szCs w:val="28"/>
+          <w:rFonts w:ascii="SimSun" w:hAnsi="SimSun" w:eastAsia="SimSun" w:cs="SimSun"/>
+          <w:sz w:val="24"/>
+          <w:szCs w:val="24"/>
         </w:rPr>
       </w:pPr>
       <w:r>
@@ -5722,6 +6287,36 @@
         <w:widowControl/>
         <w:suppressLineNumbers w:val="0"/>
         <w:spacing w:line="360" w:lineRule="auto"/>
+        <w:jc w:val="center"/>
+        <w:rPr>
+          <w:rFonts w:hint="default" w:ascii="Times New Roman" w:hAnsi="Times New Roman" w:eastAsia="SimSun" w:cs="Times New Roman"/>
+          <w:b/>
+          <w:bCs/>
+          <w:sz w:val="28"/>
+          <w:szCs w:val="28"/>
+          <w:lang w:val="en-GB"/>
+        </w:rPr>
+      </w:pPr>
+      <w:r>
+        <w:rPr>
+          <w:rFonts w:hint="default" w:ascii="Times New Roman" w:hAnsi="Times New Roman" w:cs="Times New Roman"/>
+          <w:b/>
+          <w:bCs/>
+          <w:sz w:val="28"/>
+          <w:szCs w:val="28"/>
+          <w:lang w:val="en-GB"/>
+        </w:rPr>
+        <w:t>2.2 rasm. Maqsadga erishish ketma-ketligi</w:t>
+      </w:r>
+    </w:p>
+    <w:p>
+      <w:pPr>
+        <w:pStyle w:val="12"/>
+        <w:keepNext w:val="0"/>
+        <w:keepLines w:val="0"/>
+        <w:widowControl/>
+        <w:suppressLineNumbers w:val="0"/>
+        <w:spacing w:line="360" w:lineRule="auto"/>
         <w:ind w:firstLine="720" w:firstLineChars="0"/>
         <w:jc w:val="both"/>
         <w:rPr>
@@ -6168,8 +6763,8 @@
           <w:szCs w:val="28"/>
         </w:rPr>
       </w:pPr>
-      <w:bookmarkStart w:id="37" w:name="_Toc2967"/>
-      <w:bookmarkStart w:id="38" w:name="_Toc11591"/>
+      <w:bookmarkStart w:id="37" w:name="_Toc11591"/>
+      <w:bookmarkStart w:id="38" w:name="_Toc2967"/>
       <w:bookmarkStart w:id="39" w:name="_Toc13550"/>
       <w:r>
         <w:rPr>
@@ -6441,21 +7036,21 @@
         <w:spacing w:line="360" w:lineRule="auto"/>
         <w:jc w:val="both"/>
         <w:rPr>
-          <w:rFonts w:hint="default" w:ascii="Times New Roman" w:hAnsi="Times New Roman" w:cs="Times New Roman"/>
-          <w:sz w:val="28"/>
-          <w:szCs w:val="28"/>
-        </w:rPr>
-      </w:pPr>
-      <w:r>
-        <w:rPr>
           <w:rFonts w:ascii="SimSun" w:hAnsi="SimSun" w:eastAsia="SimSun" w:cs="SimSun"/>
           <w:sz w:val="24"/>
           <w:szCs w:val="24"/>
         </w:rPr>
+      </w:pPr>
+      <w:r>
+        <w:rPr>
+          <w:rFonts w:ascii="SimSun" w:hAnsi="SimSun" w:eastAsia="SimSun" w:cs="SimSun"/>
+          <w:sz w:val="24"/>
+          <w:szCs w:val="24"/>
+        </w:rPr>
         <w:drawing>
           <wp:inline distT="0" distB="0" distL="114300" distR="114300">
-            <wp:extent cx="5930265" cy="3387725"/>
-            <wp:effectExtent l="0" t="0" r="13335" b="3175"/>
+            <wp:extent cx="5549265" cy="3169920"/>
+            <wp:effectExtent l="0" t="0" r="13335" b="11430"/>
             <wp:docPr id="7" name="Picture 3" descr="IMG_256"/>
             <wp:cNvGraphicFramePr>
               <a:graphicFrameLocks xmlns:a="http://schemas.openxmlformats.org/drawingml/2006/main" noChangeAspect="1"/>
@@ -6478,7 +7073,7 @@
                   <pic:spPr>
                     <a:xfrm>
                       <a:off x="0" y="0"/>
-                      <a:ext cx="5930265" cy="3387725"/>
+                      <a:ext cx="5549265" cy="3169920"/>
                     </a:xfrm>
                     <a:prstGeom prst="rect">
                       <a:avLst/>
@@ -6503,6 +7098,36 @@
         <w:widowControl/>
         <w:suppressLineNumbers w:val="0"/>
         <w:spacing w:line="360" w:lineRule="auto"/>
+        <w:jc w:val="center"/>
+        <w:rPr>
+          <w:rFonts w:hint="default" w:ascii="Times New Roman" w:hAnsi="Times New Roman" w:eastAsia="SimSun" w:cs="Times New Roman"/>
+          <w:b/>
+          <w:bCs/>
+          <w:sz w:val="28"/>
+          <w:szCs w:val="28"/>
+          <w:lang w:val="en-GB"/>
+        </w:rPr>
+      </w:pPr>
+      <w:r>
+        <w:rPr>
+          <w:rFonts w:hint="default" w:ascii="Times New Roman" w:hAnsi="Times New Roman" w:cs="Times New Roman"/>
+          <w:b/>
+          <w:bCs/>
+          <w:sz w:val="28"/>
+          <w:szCs w:val="28"/>
+          <w:lang w:val="en-GB"/>
+        </w:rPr>
+        <w:t>2.3 rasm. Elektron o’rganish skli</w:t>
+      </w:r>
+    </w:p>
+    <w:p>
+      <w:pPr>
+        <w:pStyle w:val="12"/>
+        <w:keepNext w:val="0"/>
+        <w:keepLines w:val="0"/>
+        <w:widowControl/>
+        <w:suppressLineNumbers w:val="0"/>
+        <w:spacing w:line="360" w:lineRule="auto"/>
         <w:ind w:firstLine="720" w:firstLineChars="0"/>
         <w:jc w:val="both"/>
         <w:rPr>
@@ -6705,9 +7330,9 @@
           <w:szCs w:val="28"/>
         </w:rPr>
       </w:pPr>
-      <w:bookmarkStart w:id="40" w:name="_Toc10099"/>
+      <w:bookmarkStart w:id="40" w:name="_Toc15853"/>
       <w:bookmarkStart w:id="41" w:name="_Toc5804"/>
-      <w:bookmarkStart w:id="42" w:name="_Toc15853"/>
+      <w:bookmarkStart w:id="42" w:name="_Toc10099"/>
       <w:r>
         <w:rPr>
           <w:rFonts w:hint="default" w:ascii="Times New Roman" w:hAnsi="Times New Roman" w:cs="Times New Roman"/>
@@ -6966,21 +7591,21 @@
         <w:spacing w:line="360" w:lineRule="auto"/>
         <w:jc w:val="both"/>
         <w:rPr>
-          <w:rFonts w:hint="default" w:ascii="Times New Roman" w:hAnsi="Times New Roman" w:cs="Times New Roman"/>
-          <w:sz w:val="28"/>
-          <w:szCs w:val="28"/>
-        </w:rPr>
-      </w:pPr>
-      <w:r>
-        <w:rPr>
           <w:rFonts w:ascii="SimSun" w:hAnsi="SimSun" w:eastAsia="SimSun" w:cs="SimSun"/>
           <w:sz w:val="24"/>
           <w:szCs w:val="24"/>
         </w:rPr>
+      </w:pPr>
+      <w:r>
+        <w:rPr>
+          <w:rFonts w:ascii="SimSun" w:hAnsi="SimSun" w:eastAsia="SimSun" w:cs="SimSun"/>
+          <w:sz w:val="24"/>
+          <w:szCs w:val="24"/>
+        </w:rPr>
         <w:drawing>
           <wp:inline distT="0" distB="0" distL="114300" distR="114300">
-            <wp:extent cx="4324350" cy="5105400"/>
-            <wp:effectExtent l="0" t="0" r="0" b="0"/>
+            <wp:extent cx="3996690" cy="4718685"/>
+            <wp:effectExtent l="0" t="0" r="3810" b="5715"/>
             <wp:docPr id="8" name="Picture 4" descr="IMG_256"/>
             <wp:cNvGraphicFramePr>
               <a:graphicFrameLocks xmlns:a="http://schemas.openxmlformats.org/drawingml/2006/main" noChangeAspect="1"/>
@@ -7003,7 +7628,7 @@
                   <pic:spPr>
                     <a:xfrm>
                       <a:off x="0" y="0"/>
-                      <a:ext cx="4324350" cy="5105400"/>
+                      <a:ext cx="3996690" cy="4718685"/>
                     </a:xfrm>
                     <a:prstGeom prst="rect">
                       <a:avLst/>
@@ -7028,6 +7653,36 @@
         <w:widowControl/>
         <w:suppressLineNumbers w:val="0"/>
         <w:spacing w:line="360" w:lineRule="auto"/>
+        <w:jc w:val="center"/>
+        <w:rPr>
+          <w:rFonts w:hint="default" w:ascii="Times New Roman" w:hAnsi="Times New Roman" w:eastAsia="SimSun" w:cs="Times New Roman"/>
+          <w:b/>
+          <w:bCs/>
+          <w:sz w:val="28"/>
+          <w:szCs w:val="28"/>
+          <w:lang w:val="en-GB"/>
+        </w:rPr>
+      </w:pPr>
+      <w:r>
+        <w:rPr>
+          <w:rFonts w:hint="default" w:ascii="Times New Roman" w:hAnsi="Times New Roman" w:cs="Times New Roman"/>
+          <w:b/>
+          <w:bCs/>
+          <w:sz w:val="28"/>
+          <w:szCs w:val="28"/>
+          <w:lang w:val="en-GB"/>
+        </w:rPr>
+        <w:t>2.4 rasm. Role bo’yicha ruxsatlar</w:t>
+      </w:r>
+    </w:p>
+    <w:p>
+      <w:pPr>
+        <w:pStyle w:val="12"/>
+        <w:keepNext w:val="0"/>
+        <w:keepLines w:val="0"/>
+        <w:widowControl/>
+        <w:suppressLineNumbers w:val="0"/>
+        <w:spacing w:line="360" w:lineRule="auto"/>
         <w:ind w:firstLine="720" w:firstLineChars="0"/>
         <w:jc w:val="both"/>
         <w:rPr>
@@ -7636,11 +8291,11 @@
           <w:szCs w:val="28"/>
         </w:rPr>
       </w:pPr>
-      <w:bookmarkStart w:id="43" w:name="_Toc26156"/>
-      <w:bookmarkStart w:id="44" w:name="_Toc28403"/>
-      <w:bookmarkStart w:id="45" w:name="_Toc13435"/>
-      <w:bookmarkStart w:id="46" w:name="_Toc1016"/>
-      <w:bookmarkStart w:id="47" w:name="_Toc32185"/>
+      <w:bookmarkStart w:id="43" w:name="_Toc13435"/>
+      <w:bookmarkStart w:id="44" w:name="_Toc32185"/>
+      <w:bookmarkStart w:id="45" w:name="_Toc28403"/>
+      <w:bookmarkStart w:id="46" w:name="_Toc26156"/>
+      <w:bookmarkStart w:id="47" w:name="_Toc1016"/>
       <w:r>
         <w:rPr>
           <w:rStyle w:val="13"/>
@@ -7700,9 +8355,9 @@
           <w:szCs w:val="28"/>
         </w:rPr>
       </w:pPr>
-      <w:bookmarkStart w:id="50" w:name="_Toc31402"/>
-      <w:bookmarkStart w:id="51" w:name="_Toc3547"/>
-      <w:bookmarkStart w:id="52" w:name="_Toc25382"/>
+      <w:bookmarkStart w:id="50" w:name="_Toc3547"/>
+      <w:bookmarkStart w:id="51" w:name="_Toc25382"/>
+      <w:bookmarkStart w:id="52" w:name="_Toc31402"/>
       <w:r>
         <w:rPr>
           <w:rFonts w:hint="default" w:ascii="Times New Roman" w:hAnsi="Times New Roman" w:cs="Times New Roman"/>
@@ -8009,9 +8664,9 @@
         <w:spacing w:line="360" w:lineRule="auto"/>
         <w:jc w:val="both"/>
         <w:rPr>
-          <w:rFonts w:hint="default" w:ascii="Times New Roman" w:hAnsi="Times New Roman" w:cs="Times New Roman"/>
-          <w:sz w:val="28"/>
-          <w:szCs w:val="28"/>
+          <w:rFonts w:ascii="SimSun" w:hAnsi="SimSun" w:eastAsia="SimSun" w:cs="SimSun"/>
+          <w:sz w:val="24"/>
+          <w:szCs w:val="24"/>
         </w:rPr>
       </w:pPr>
       <w:r>
@@ -8065,6 +8720,36 @@
     </w:p>
     <w:p>
       <w:pPr>
+        <w:pStyle w:val="12"/>
+        <w:keepNext w:val="0"/>
+        <w:keepLines w:val="0"/>
+        <w:widowControl/>
+        <w:suppressLineNumbers w:val="0"/>
+        <w:spacing w:line="360" w:lineRule="auto"/>
+        <w:jc w:val="center"/>
+        <w:rPr>
+          <w:rFonts w:hint="default" w:ascii="Times New Roman" w:hAnsi="Times New Roman" w:eastAsia="SimSun" w:cs="Times New Roman"/>
+          <w:b/>
+          <w:bCs/>
+          <w:sz w:val="28"/>
+          <w:szCs w:val="28"/>
+          <w:lang w:val="en-GB"/>
+        </w:rPr>
+      </w:pPr>
+      <w:r>
+        <w:rPr>
+          <w:rFonts w:hint="default" w:ascii="Times New Roman" w:hAnsi="Times New Roman" w:cs="Times New Roman"/>
+          <w:b/>
+          <w:bCs/>
+          <w:sz w:val="28"/>
+          <w:szCs w:val="28"/>
+          <w:lang w:val="en-GB"/>
+        </w:rPr>
+        <w:t>3.1 rasm. Sohalar bo’yicha texnologiyalar</w:t>
+      </w:r>
+    </w:p>
+    <w:p>
+      <w:pPr>
         <w:pStyle w:val="4"/>
         <w:keepNext w:val="0"/>
         <w:keepLines w:val="0"/>
@@ -9369,8 +10054,8 @@
           <w:szCs w:val="28"/>
         </w:rPr>
       </w:pPr>
-      <w:bookmarkStart w:id="61" w:name="_Toc12694"/>
-      <w:bookmarkStart w:id="62" w:name="_Toc9462"/>
+      <w:bookmarkStart w:id="61" w:name="_Toc9462"/>
+      <w:bookmarkStart w:id="62" w:name="_Toc12694"/>
       <w:bookmarkStart w:id="63" w:name="_Toc15447"/>
       <w:r>
         <w:rPr>
@@ -9681,9 +10366,9 @@
         <w:spacing w:line="360" w:lineRule="auto"/>
         <w:jc w:val="both"/>
         <w:rPr>
-          <w:rFonts w:hint="default" w:ascii="Times New Roman" w:hAnsi="Times New Roman" w:cs="Times New Roman"/>
-          <w:sz w:val="28"/>
-          <w:szCs w:val="28"/>
+          <w:rFonts w:ascii="SimSun" w:hAnsi="SimSun" w:eastAsia="SimSun" w:cs="SimSun"/>
+          <w:sz w:val="24"/>
+          <w:szCs w:val="24"/>
         </w:rPr>
       </w:pPr>
       <w:r>
@@ -9737,6 +10422,36 @@
     </w:p>
     <w:p>
       <w:pPr>
+        <w:pStyle w:val="12"/>
+        <w:keepNext w:val="0"/>
+        <w:keepLines w:val="0"/>
+        <w:widowControl/>
+        <w:suppressLineNumbers w:val="0"/>
+        <w:spacing w:line="360" w:lineRule="auto"/>
+        <w:jc w:val="center"/>
+        <w:rPr>
+          <w:rFonts w:hint="default" w:ascii="Times New Roman" w:hAnsi="Times New Roman" w:eastAsia="SimSun" w:cs="Times New Roman"/>
+          <w:b/>
+          <w:bCs/>
+          <w:sz w:val="28"/>
+          <w:szCs w:val="28"/>
+          <w:lang w:val="en-GB"/>
+        </w:rPr>
+      </w:pPr>
+      <w:r>
+        <w:rPr>
+          <w:rFonts w:hint="default" w:ascii="Times New Roman" w:hAnsi="Times New Roman" w:cs="Times New Roman"/>
+          <w:b/>
+          <w:bCs/>
+          <w:sz w:val="28"/>
+          <w:szCs w:val="28"/>
+          <w:lang w:val="en-GB"/>
+        </w:rPr>
+        <w:t>3.2 rasm. Client va databaseni bog’lanishi</w:t>
+      </w:r>
+    </w:p>
+    <w:p>
+      <w:pPr>
         <w:pStyle w:val="4"/>
         <w:keepNext w:val="0"/>
         <w:keepLines w:val="0"/>
@@ -11108,9 +11823,9 @@
           <w:szCs w:val="28"/>
         </w:rPr>
       </w:pPr>
-      <w:bookmarkStart w:id="71" w:name="_Toc23877"/>
-      <w:bookmarkStart w:id="72" w:name="_Toc18628"/>
-      <w:bookmarkStart w:id="73" w:name="_Toc8585"/>
+      <w:bookmarkStart w:id="71" w:name="_Toc18628"/>
+      <w:bookmarkStart w:id="72" w:name="_Toc8585"/>
+      <w:bookmarkStart w:id="73" w:name="_Toc23877"/>
       <w:r>
         <w:rPr>
           <w:rFonts w:hint="default" w:ascii="Times New Roman" w:hAnsi="Times New Roman" w:cs="Times New Roman"/>
@@ -11263,9 +11978,9 @@
         <w:spacing w:line="360" w:lineRule="auto"/>
         <w:jc w:val="both"/>
         <w:rPr>
-          <w:rFonts w:hint="default" w:ascii="Times New Roman" w:hAnsi="Times New Roman" w:cs="Times New Roman"/>
-          <w:sz w:val="28"/>
-          <w:szCs w:val="28"/>
+          <w:rFonts w:ascii="SimSun" w:hAnsi="SimSun" w:eastAsia="SimSun" w:cs="SimSun"/>
+          <w:sz w:val="24"/>
+          <w:szCs w:val="24"/>
         </w:rPr>
       </w:pPr>
       <w:r>
@@ -11325,6 +12040,36 @@
         <w:widowControl/>
         <w:suppressLineNumbers w:val="0"/>
         <w:spacing w:line="360" w:lineRule="auto"/>
+        <w:jc w:val="center"/>
+        <w:rPr>
+          <w:rFonts w:hint="default" w:ascii="Times New Roman" w:hAnsi="Times New Roman" w:eastAsia="SimSun" w:cs="Times New Roman"/>
+          <w:b/>
+          <w:bCs/>
+          <w:sz w:val="28"/>
+          <w:szCs w:val="28"/>
+          <w:lang w:val="en-GB"/>
+        </w:rPr>
+      </w:pPr>
+      <w:r>
+        <w:rPr>
+          <w:rFonts w:hint="default" w:ascii="Times New Roman" w:hAnsi="Times New Roman" w:cs="Times New Roman"/>
+          <w:b/>
+          <w:bCs/>
+          <w:sz w:val="28"/>
+          <w:szCs w:val="28"/>
+          <w:lang w:val="en-GB"/>
+        </w:rPr>
+        <w:t>3.3 rasm. Modellarni bog’lanishi</w:t>
+      </w:r>
+    </w:p>
+    <w:p>
+      <w:pPr>
+        <w:pStyle w:val="12"/>
+        <w:keepNext w:val="0"/>
+        <w:keepLines w:val="0"/>
+        <w:widowControl/>
+        <w:suppressLineNumbers w:val="0"/>
+        <w:spacing w:line="360" w:lineRule="auto"/>
         <w:ind w:firstLine="720" w:firstLineChars="0"/>
         <w:jc w:val="both"/>
         <w:rPr>
@@ -13737,8 +14482,8 @@
         </w:rPr>
       </w:pPr>
       <w:bookmarkStart w:id="84" w:name="_Toc25239"/>
-      <w:bookmarkStart w:id="85" w:name="_Toc11794"/>
-      <w:bookmarkStart w:id="86" w:name="_Toc1330"/>
+      <w:bookmarkStart w:id="85" w:name="_Toc1330"/>
+      <w:bookmarkStart w:id="86" w:name="_Toc11794"/>
       <w:r>
         <w:rPr>
           <w:rFonts w:hint="default" w:ascii="Times New Roman" w:hAnsi="Times New Roman" w:cs="Times New Roman"/>
@@ -13866,21 +14611,21 @@
         <w:spacing w:line="360" w:lineRule="auto"/>
         <w:jc w:val="both"/>
         <w:rPr>
-          <w:rFonts w:hint="default" w:ascii="Times New Roman" w:hAnsi="Times New Roman" w:cs="Times New Roman"/>
-          <w:sz w:val="28"/>
-          <w:szCs w:val="28"/>
-        </w:rPr>
-      </w:pPr>
-      <w:r>
-        <w:rPr>
           <w:rFonts w:ascii="SimSun" w:hAnsi="SimSun" w:eastAsia="SimSun" w:cs="SimSun"/>
           <w:sz w:val="24"/>
           <w:szCs w:val="24"/>
         </w:rPr>
+      </w:pPr>
+      <w:r>
+        <w:rPr>
+          <w:rFonts w:ascii="SimSun" w:hAnsi="SimSun" w:eastAsia="SimSun" w:cs="SimSun"/>
+          <w:sz w:val="24"/>
+          <w:szCs w:val="24"/>
+        </w:rPr>
         <w:drawing>
           <wp:inline distT="0" distB="0" distL="114300" distR="114300">
-            <wp:extent cx="5939790" cy="5939790"/>
-            <wp:effectExtent l="0" t="0" r="3810" b="3810"/>
+            <wp:extent cx="5939790" cy="4438650"/>
+            <wp:effectExtent l="0" t="0" r="0" b="0"/>
             <wp:docPr id="14" name="Picture 10" descr="IMG_256"/>
             <wp:cNvGraphicFramePr>
               <a:graphicFrameLocks xmlns:a="http://schemas.openxmlformats.org/drawingml/2006/main" noChangeAspect="1"/>
@@ -13896,6 +14641,7 @@
                   </pic:nvPicPr>
                   <pic:blipFill>
                     <a:blip r:embed="rId15"/>
+                    <a:srcRect t="7066" b="18206"/>
                     <a:stretch>
                       <a:fillRect/>
                     </a:stretch>
@@ -13903,7 +14649,7 @@
                   <pic:spPr>
                     <a:xfrm>
                       <a:off x="0" y="0"/>
-                      <a:ext cx="5939790" cy="5939790"/>
+                      <a:ext cx="5939790" cy="4438650"/>
                     </a:xfrm>
                     <a:prstGeom prst="rect">
                       <a:avLst/>
@@ -13928,6 +14674,36 @@
         <w:widowControl/>
         <w:suppressLineNumbers w:val="0"/>
         <w:spacing w:line="360" w:lineRule="auto"/>
+        <w:jc w:val="center"/>
+        <w:rPr>
+          <w:rFonts w:hint="default" w:ascii="Times New Roman" w:hAnsi="Times New Roman" w:eastAsia="SimSun" w:cs="Times New Roman"/>
+          <w:b/>
+          <w:bCs/>
+          <w:sz w:val="28"/>
+          <w:szCs w:val="28"/>
+          <w:lang w:val="en-GB"/>
+        </w:rPr>
+      </w:pPr>
+      <w:r>
+        <w:rPr>
+          <w:rFonts w:hint="default" w:ascii="Times New Roman" w:hAnsi="Times New Roman" w:cs="Times New Roman"/>
+          <w:b/>
+          <w:bCs/>
+          <w:sz w:val="28"/>
+          <w:szCs w:val="28"/>
+          <w:lang w:val="en-GB"/>
+        </w:rPr>
+        <w:t>3.4 rasm. Modellarni backendga ulanishi</w:t>
+      </w:r>
+    </w:p>
+    <w:p>
+      <w:pPr>
+        <w:pStyle w:val="12"/>
+        <w:keepNext w:val="0"/>
+        <w:keepLines w:val="0"/>
+        <w:widowControl/>
+        <w:suppressLineNumbers w:val="0"/>
+        <w:spacing w:line="360" w:lineRule="auto"/>
         <w:ind w:firstLine="720" w:firstLineChars="0"/>
         <w:jc w:val="both"/>
         <w:rPr>
@@ -15536,9 +16312,9 @@
           <w:szCs w:val="28"/>
         </w:rPr>
       </w:pPr>
-      <w:bookmarkStart w:id="95" w:name="_Toc23924"/>
-      <w:bookmarkStart w:id="96" w:name="_Toc762"/>
-      <w:bookmarkStart w:id="97" w:name="_Toc21221"/>
+      <w:bookmarkStart w:id="95" w:name="_Toc21221"/>
+      <w:bookmarkStart w:id="96" w:name="_Toc23924"/>
+      <w:bookmarkStart w:id="97" w:name="_Toc762"/>
       <w:bookmarkStart w:id="98" w:name="_Toc23685"/>
       <w:bookmarkStart w:id="99" w:name="_Toc28417"/>
       <w:r>
@@ -15569,8 +16345,8 @@
           <w:szCs w:val="28"/>
         </w:rPr>
       </w:pPr>
-      <w:bookmarkStart w:id="100" w:name="_Toc16267"/>
-      <w:bookmarkStart w:id="101" w:name="_Toc28091"/>
+      <w:bookmarkStart w:id="100" w:name="_Toc28091"/>
+      <w:bookmarkStart w:id="101" w:name="_Toc16267"/>
       <w:r>
         <w:rPr>
           <w:rStyle w:val="13"/>
@@ -15601,8 +16377,8 @@
         </w:rPr>
       </w:pPr>
       <w:bookmarkStart w:id="102" w:name="_Toc15112"/>
-      <w:bookmarkStart w:id="103" w:name="_Toc28104"/>
-      <w:bookmarkStart w:id="104" w:name="_Toc20948"/>
+      <w:bookmarkStart w:id="103" w:name="_Toc20948"/>
+      <w:bookmarkStart w:id="104" w:name="_Toc28104"/>
       <w:r>
         <w:rPr>
           <w:rFonts w:hint="default" w:ascii="Times New Roman" w:hAnsi="Times New Roman" w:cs="Times New Roman"/>
@@ -15638,6 +16414,90 @@
           <w:szCs w:val="28"/>
         </w:rPr>
         <w:t>Masofaviy ta’lim platformasining muvaffaqiyatli ishlashi nafaqat uning funksional imkoniyatlariga, balki foydalanuvchi interfeysi va foydalanuvchi tajribasiga (UI/UX) ham bevosita bog‘liqdir. UI (User Interface) — bu foydalanuvchi ko‘radigan vizual qism bo‘lsa, UX (User Experience) — bu foydalanuvchining tizim bilan ishlash jarayonidagi umumiy tajribasini anglatadi. To‘g‘ri ishlab chiqilgan UI/UX platformadan foydalanishni osonlashtiradi, foydalanuvchilarning qiziqishini oshiradi va ta’lim jarayonining samaradorligini ta’minlaydi.</w:t>
+      </w:r>
+    </w:p>
+    <w:p>
+      <w:pPr>
+        <w:pStyle w:val="12"/>
+        <w:keepNext w:val="0"/>
+        <w:keepLines w:val="0"/>
+        <w:widowControl/>
+        <w:suppressLineNumbers w:val="0"/>
+        <w:spacing w:line="360" w:lineRule="auto"/>
+        <w:jc w:val="both"/>
+      </w:pPr>
+      <w:r>
+        <w:drawing>
+          <wp:inline distT="0" distB="0" distL="114300" distR="114300">
+            <wp:extent cx="5932805" cy="3335655"/>
+            <wp:effectExtent l="0" t="0" r="10795" b="17145"/>
+            <wp:docPr id="9" name="Picture 1"/>
+            <wp:cNvGraphicFramePr>
+              <a:graphicFrameLocks xmlns:a="http://schemas.openxmlformats.org/drawingml/2006/main" noChangeAspect="1"/>
+            </wp:cNvGraphicFramePr>
+            <a:graphic xmlns:a="http://schemas.openxmlformats.org/drawingml/2006/main">
+              <a:graphicData uri="http://schemas.openxmlformats.org/drawingml/2006/picture">
+                <pic:pic xmlns:pic="http://schemas.openxmlformats.org/drawingml/2006/picture">
+                  <pic:nvPicPr>
+                    <pic:cNvPr id="9" name="Picture 1"/>
+                    <pic:cNvPicPr>
+                      <a:picLocks noChangeAspect="1"/>
+                    </pic:cNvPicPr>
+                  </pic:nvPicPr>
+                  <pic:blipFill>
+                    <a:blip r:embed="rId16"/>
+                    <a:stretch>
+                      <a:fillRect/>
+                    </a:stretch>
+                  </pic:blipFill>
+                  <pic:spPr>
+                    <a:xfrm>
+                      <a:off x="0" y="0"/>
+                      <a:ext cx="5932805" cy="3335655"/>
+                    </a:xfrm>
+                    <a:prstGeom prst="rect">
+                      <a:avLst/>
+                    </a:prstGeom>
+                    <a:noFill/>
+                    <a:ln>
+                      <a:noFill/>
+                    </a:ln>
+                  </pic:spPr>
+                </pic:pic>
+              </a:graphicData>
+            </a:graphic>
+          </wp:inline>
+        </w:drawing>
+      </w:r>
+    </w:p>
+    <w:p>
+      <w:pPr>
+        <w:pStyle w:val="12"/>
+        <w:keepNext w:val="0"/>
+        <w:keepLines w:val="0"/>
+        <w:widowControl/>
+        <w:suppressLineNumbers w:val="0"/>
+        <w:spacing w:line="360" w:lineRule="auto"/>
+        <w:jc w:val="center"/>
+        <w:rPr>
+          <w:rFonts w:hint="default"/>
+          <w:b/>
+          <w:bCs/>
+          <w:sz w:val="28"/>
+          <w:szCs w:val="28"/>
+          <w:lang w:val="en-GB"/>
+        </w:rPr>
+      </w:pPr>
+      <w:r>
+        <w:rPr>
+          <w:rFonts w:hint="default"/>
+          <w:b/>
+          <w:bCs/>
+          <w:sz w:val="28"/>
+          <w:szCs w:val="28"/>
+          <w:lang w:val="en-GB"/>
+        </w:rPr>
+        <w:t>4.1 rasm. Dashboard</w:t>
       </w:r>
     </w:p>
     <w:p>
@@ -16046,6 +16906,90 @@
         <w:widowControl/>
         <w:suppressLineNumbers w:val="0"/>
         <w:spacing w:line="360" w:lineRule="auto"/>
+        <w:jc w:val="both"/>
+      </w:pPr>
+      <w:r>
+        <w:drawing>
+          <wp:inline distT="0" distB="0" distL="114300" distR="114300">
+            <wp:extent cx="5932805" cy="3335655"/>
+            <wp:effectExtent l="0" t="0" r="10795" b="17145"/>
+            <wp:docPr id="10" name="Picture 2"/>
+            <wp:cNvGraphicFramePr>
+              <a:graphicFrameLocks xmlns:a="http://schemas.openxmlformats.org/drawingml/2006/main" noChangeAspect="1"/>
+            </wp:cNvGraphicFramePr>
+            <a:graphic xmlns:a="http://schemas.openxmlformats.org/drawingml/2006/main">
+              <a:graphicData uri="http://schemas.openxmlformats.org/drawingml/2006/picture">
+                <pic:pic xmlns:pic="http://schemas.openxmlformats.org/drawingml/2006/picture">
+                  <pic:nvPicPr>
+                    <pic:cNvPr id="10" name="Picture 2"/>
+                    <pic:cNvPicPr>
+                      <a:picLocks noChangeAspect="1"/>
+                    </pic:cNvPicPr>
+                  </pic:nvPicPr>
+                  <pic:blipFill>
+                    <a:blip r:embed="rId17"/>
+                    <a:stretch>
+                      <a:fillRect/>
+                    </a:stretch>
+                  </pic:blipFill>
+                  <pic:spPr>
+                    <a:xfrm>
+                      <a:off x="0" y="0"/>
+                      <a:ext cx="5932805" cy="3335655"/>
+                    </a:xfrm>
+                    <a:prstGeom prst="rect">
+                      <a:avLst/>
+                    </a:prstGeom>
+                    <a:noFill/>
+                    <a:ln>
+                      <a:noFill/>
+                    </a:ln>
+                  </pic:spPr>
+                </pic:pic>
+              </a:graphicData>
+            </a:graphic>
+          </wp:inline>
+        </w:drawing>
+      </w:r>
+    </w:p>
+    <w:p>
+      <w:pPr>
+        <w:pStyle w:val="12"/>
+        <w:keepNext w:val="0"/>
+        <w:keepLines w:val="0"/>
+        <w:widowControl/>
+        <w:suppressLineNumbers w:val="0"/>
+        <w:spacing w:line="360" w:lineRule="auto"/>
+        <w:jc w:val="center"/>
+        <w:rPr>
+          <w:rFonts w:hint="default"/>
+          <w:b/>
+          <w:bCs/>
+          <w:sz w:val="28"/>
+          <w:szCs w:val="28"/>
+          <w:lang w:val="en-GB"/>
+        </w:rPr>
+      </w:pPr>
+      <w:r>
+        <w:rPr>
+          <w:rFonts w:hint="default"/>
+          <w:b/>
+          <w:bCs/>
+          <w:sz w:val="28"/>
+          <w:szCs w:val="28"/>
+          <w:lang w:val="en-GB"/>
+        </w:rPr>
+        <w:t>4.2 rasm. Login</w:t>
+      </w:r>
+    </w:p>
+    <w:p>
+      <w:pPr>
+        <w:pStyle w:val="12"/>
+        <w:keepNext w:val="0"/>
+        <w:keepLines w:val="0"/>
+        <w:widowControl/>
+        <w:suppressLineNumbers w:val="0"/>
+        <w:spacing w:line="360" w:lineRule="auto"/>
         <w:ind w:firstLine="720" w:firstLineChars="0"/>
         <w:jc w:val="both"/>
         <w:rPr>
@@ -16230,6 +17174,90 @@
         <w:widowControl/>
         <w:suppressLineNumbers w:val="0"/>
         <w:spacing w:line="360" w:lineRule="auto"/>
+        <w:jc w:val="both"/>
+      </w:pPr>
+      <w:r>
+        <w:drawing>
+          <wp:inline distT="0" distB="0" distL="114300" distR="114300">
+            <wp:extent cx="5932805" cy="3335655"/>
+            <wp:effectExtent l="0" t="0" r="10795" b="17145"/>
+            <wp:docPr id="15" name="Picture 3"/>
+            <wp:cNvGraphicFramePr>
+              <a:graphicFrameLocks xmlns:a="http://schemas.openxmlformats.org/drawingml/2006/main" noChangeAspect="1"/>
+            </wp:cNvGraphicFramePr>
+            <a:graphic xmlns:a="http://schemas.openxmlformats.org/drawingml/2006/main">
+              <a:graphicData uri="http://schemas.openxmlformats.org/drawingml/2006/picture">
+                <pic:pic xmlns:pic="http://schemas.openxmlformats.org/drawingml/2006/picture">
+                  <pic:nvPicPr>
+                    <pic:cNvPr id="15" name="Picture 3"/>
+                    <pic:cNvPicPr>
+                      <a:picLocks noChangeAspect="1"/>
+                    </pic:cNvPicPr>
+                  </pic:nvPicPr>
+                  <pic:blipFill>
+                    <a:blip r:embed="rId18"/>
+                    <a:stretch>
+                      <a:fillRect/>
+                    </a:stretch>
+                  </pic:blipFill>
+                  <pic:spPr>
+                    <a:xfrm>
+                      <a:off x="0" y="0"/>
+                      <a:ext cx="5932805" cy="3335655"/>
+                    </a:xfrm>
+                    <a:prstGeom prst="rect">
+                      <a:avLst/>
+                    </a:prstGeom>
+                    <a:noFill/>
+                    <a:ln>
+                      <a:noFill/>
+                    </a:ln>
+                  </pic:spPr>
+                </pic:pic>
+              </a:graphicData>
+            </a:graphic>
+          </wp:inline>
+        </w:drawing>
+      </w:r>
+    </w:p>
+    <w:p>
+      <w:pPr>
+        <w:pStyle w:val="12"/>
+        <w:keepNext w:val="0"/>
+        <w:keepLines w:val="0"/>
+        <w:widowControl/>
+        <w:suppressLineNumbers w:val="0"/>
+        <w:spacing w:line="360" w:lineRule="auto"/>
+        <w:jc w:val="center"/>
+        <w:rPr>
+          <w:rFonts w:hint="default"/>
+          <w:b/>
+          <w:bCs/>
+          <w:sz w:val="28"/>
+          <w:szCs w:val="28"/>
+          <w:lang w:val="en-GB"/>
+        </w:rPr>
+      </w:pPr>
+      <w:r>
+        <w:rPr>
+          <w:rFonts w:hint="default"/>
+          <w:b/>
+          <w:bCs/>
+          <w:sz w:val="28"/>
+          <w:szCs w:val="28"/>
+          <w:lang w:val="en-GB"/>
+        </w:rPr>
+        <w:t>4.3 rasm. Ro’yxatdan o’tish</w:t>
+      </w:r>
+    </w:p>
+    <w:p>
+      <w:pPr>
+        <w:pStyle w:val="12"/>
+        <w:keepNext w:val="0"/>
+        <w:keepLines w:val="0"/>
+        <w:widowControl/>
+        <w:suppressLineNumbers w:val="0"/>
+        <w:spacing w:line="360" w:lineRule="auto"/>
         <w:ind w:firstLine="720" w:firstLineChars="0"/>
         <w:jc w:val="both"/>
         <w:rPr>
@@ -16389,6 +17417,90 @@
         <w:widowControl/>
         <w:suppressLineNumbers w:val="0"/>
         <w:spacing w:line="360" w:lineRule="auto"/>
+        <w:jc w:val="both"/>
+      </w:pPr>
+      <w:r>
+        <w:drawing>
+          <wp:inline distT="0" distB="0" distL="114300" distR="114300">
+            <wp:extent cx="5932805" cy="3335655"/>
+            <wp:effectExtent l="0" t="0" r="10795" b="17145"/>
+            <wp:docPr id="16" name="Picture 4"/>
+            <wp:cNvGraphicFramePr>
+              <a:graphicFrameLocks xmlns:a="http://schemas.openxmlformats.org/drawingml/2006/main" noChangeAspect="1"/>
+            </wp:cNvGraphicFramePr>
+            <a:graphic xmlns:a="http://schemas.openxmlformats.org/drawingml/2006/main">
+              <a:graphicData uri="http://schemas.openxmlformats.org/drawingml/2006/picture">
+                <pic:pic xmlns:pic="http://schemas.openxmlformats.org/drawingml/2006/picture">
+                  <pic:nvPicPr>
+                    <pic:cNvPr id="16" name="Picture 4"/>
+                    <pic:cNvPicPr>
+                      <a:picLocks noChangeAspect="1"/>
+                    </pic:cNvPicPr>
+                  </pic:nvPicPr>
+                  <pic:blipFill>
+                    <a:blip r:embed="rId19"/>
+                    <a:stretch>
+                      <a:fillRect/>
+                    </a:stretch>
+                  </pic:blipFill>
+                  <pic:spPr>
+                    <a:xfrm>
+                      <a:off x="0" y="0"/>
+                      <a:ext cx="5932805" cy="3335655"/>
+                    </a:xfrm>
+                    <a:prstGeom prst="rect">
+                      <a:avLst/>
+                    </a:prstGeom>
+                    <a:noFill/>
+                    <a:ln>
+                      <a:noFill/>
+                    </a:ln>
+                  </pic:spPr>
+                </pic:pic>
+              </a:graphicData>
+            </a:graphic>
+          </wp:inline>
+        </w:drawing>
+      </w:r>
+    </w:p>
+    <w:p>
+      <w:pPr>
+        <w:pStyle w:val="12"/>
+        <w:keepNext w:val="0"/>
+        <w:keepLines w:val="0"/>
+        <w:widowControl/>
+        <w:suppressLineNumbers w:val="0"/>
+        <w:spacing w:line="360" w:lineRule="auto"/>
+        <w:jc w:val="center"/>
+        <w:rPr>
+          <w:rFonts w:hint="default"/>
+          <w:b/>
+          <w:bCs/>
+          <w:sz w:val="28"/>
+          <w:szCs w:val="28"/>
+          <w:lang w:val="en-GB"/>
+        </w:rPr>
+      </w:pPr>
+      <w:r>
+        <w:rPr>
+          <w:rFonts w:hint="default"/>
+          <w:b/>
+          <w:bCs/>
+          <w:sz w:val="28"/>
+          <w:szCs w:val="28"/>
+          <w:lang w:val="en-GB"/>
+        </w:rPr>
+        <w:t>4.4 rasm. topshiriqlar</w:t>
+      </w:r>
+    </w:p>
+    <w:p>
+      <w:pPr>
+        <w:pStyle w:val="12"/>
+        <w:keepNext w:val="0"/>
+        <w:keepLines w:val="0"/>
+        <w:widowControl/>
+        <w:suppressLineNumbers w:val="0"/>
+        <w:spacing w:line="360" w:lineRule="auto"/>
         <w:ind w:firstLine="720" w:firstLineChars="0"/>
         <w:jc w:val="both"/>
         <w:rPr>
@@ -16416,9 +17528,9 @@
           <w:szCs w:val="28"/>
         </w:rPr>
       </w:pPr>
-      <w:bookmarkStart w:id="105" w:name="_Toc31092"/>
-      <w:bookmarkStart w:id="106" w:name="_Toc3170"/>
-      <w:bookmarkStart w:id="107" w:name="_Toc9948"/>
+      <w:bookmarkStart w:id="105" w:name="_Toc9948"/>
+      <w:bookmarkStart w:id="106" w:name="_Toc31092"/>
+      <w:bookmarkStart w:id="107" w:name="_Toc3170"/>
       <w:r>
         <w:rPr>
           <w:rFonts w:hint="default" w:ascii="Times New Roman" w:hAnsi="Times New Roman" w:cs="Times New Roman"/>
@@ -16514,6 +17626,90 @@
         <w:widowControl/>
         <w:suppressLineNumbers w:val="0"/>
         <w:spacing w:line="360" w:lineRule="auto"/>
+        <w:jc w:val="both"/>
+      </w:pPr>
+      <w:r>
+        <w:drawing>
+          <wp:inline distT="0" distB="0" distL="114300" distR="114300">
+            <wp:extent cx="5932805" cy="3335655"/>
+            <wp:effectExtent l="0" t="0" r="10795" b="17145"/>
+            <wp:docPr id="17" name="Picture 5"/>
+            <wp:cNvGraphicFramePr>
+              <a:graphicFrameLocks xmlns:a="http://schemas.openxmlformats.org/drawingml/2006/main" noChangeAspect="1"/>
+            </wp:cNvGraphicFramePr>
+            <a:graphic xmlns:a="http://schemas.openxmlformats.org/drawingml/2006/main">
+              <a:graphicData uri="http://schemas.openxmlformats.org/drawingml/2006/picture">
+                <pic:pic xmlns:pic="http://schemas.openxmlformats.org/drawingml/2006/picture">
+                  <pic:nvPicPr>
+                    <pic:cNvPr id="17" name="Picture 5"/>
+                    <pic:cNvPicPr>
+                      <a:picLocks noChangeAspect="1"/>
+                    </pic:cNvPicPr>
+                  </pic:nvPicPr>
+                  <pic:blipFill>
+                    <a:blip r:embed="rId20"/>
+                    <a:stretch>
+                      <a:fillRect/>
+                    </a:stretch>
+                  </pic:blipFill>
+                  <pic:spPr>
+                    <a:xfrm>
+                      <a:off x="0" y="0"/>
+                      <a:ext cx="5932805" cy="3335655"/>
+                    </a:xfrm>
+                    <a:prstGeom prst="rect">
+                      <a:avLst/>
+                    </a:prstGeom>
+                    <a:noFill/>
+                    <a:ln>
+                      <a:noFill/>
+                    </a:ln>
+                  </pic:spPr>
+                </pic:pic>
+              </a:graphicData>
+            </a:graphic>
+          </wp:inline>
+        </w:drawing>
+      </w:r>
+    </w:p>
+    <w:p>
+      <w:pPr>
+        <w:pStyle w:val="12"/>
+        <w:keepNext w:val="0"/>
+        <w:keepLines w:val="0"/>
+        <w:widowControl/>
+        <w:suppressLineNumbers w:val="0"/>
+        <w:spacing w:line="360" w:lineRule="auto"/>
+        <w:jc w:val="center"/>
+        <w:rPr>
+          <w:rFonts w:hint="default"/>
+          <w:b/>
+          <w:bCs/>
+          <w:sz w:val="28"/>
+          <w:szCs w:val="28"/>
+          <w:lang w:val="en-GB"/>
+        </w:rPr>
+      </w:pPr>
+      <w:r>
+        <w:rPr>
+          <w:rFonts w:hint="default"/>
+          <w:b/>
+          <w:bCs/>
+          <w:sz w:val="28"/>
+          <w:szCs w:val="28"/>
+          <w:lang w:val="en-GB"/>
+        </w:rPr>
+        <w:t>4.5 rasm. Dars Jadvali</w:t>
+      </w:r>
+    </w:p>
+    <w:p>
+      <w:pPr>
+        <w:pStyle w:val="12"/>
+        <w:keepNext w:val="0"/>
+        <w:keepLines w:val="0"/>
+        <w:widowControl/>
+        <w:suppressLineNumbers w:val="0"/>
+        <w:spacing w:line="360" w:lineRule="auto"/>
         <w:ind w:firstLine="720" w:firstLineChars="0"/>
         <w:jc w:val="both"/>
         <w:rPr>
@@ -16589,6 +17785,90 @@
         <w:widowControl/>
         <w:suppressLineNumbers w:val="0"/>
         <w:spacing w:line="360" w:lineRule="auto"/>
+        <w:jc w:val="both"/>
+      </w:pPr>
+      <w:r>
+        <w:drawing>
+          <wp:inline distT="0" distB="0" distL="114300" distR="114300">
+            <wp:extent cx="5932805" cy="3335655"/>
+            <wp:effectExtent l="0" t="0" r="10795" b="17145"/>
+            <wp:docPr id="18" name="Picture 6"/>
+            <wp:cNvGraphicFramePr>
+              <a:graphicFrameLocks xmlns:a="http://schemas.openxmlformats.org/drawingml/2006/main" noChangeAspect="1"/>
+            </wp:cNvGraphicFramePr>
+            <a:graphic xmlns:a="http://schemas.openxmlformats.org/drawingml/2006/main">
+              <a:graphicData uri="http://schemas.openxmlformats.org/drawingml/2006/picture">
+                <pic:pic xmlns:pic="http://schemas.openxmlformats.org/drawingml/2006/picture">
+                  <pic:nvPicPr>
+                    <pic:cNvPr id="18" name="Picture 6"/>
+                    <pic:cNvPicPr>
+                      <a:picLocks noChangeAspect="1"/>
+                    </pic:cNvPicPr>
+                  </pic:nvPicPr>
+                  <pic:blipFill>
+                    <a:blip r:embed="rId21"/>
+                    <a:stretch>
+                      <a:fillRect/>
+                    </a:stretch>
+                  </pic:blipFill>
+                  <pic:spPr>
+                    <a:xfrm>
+                      <a:off x="0" y="0"/>
+                      <a:ext cx="5932805" cy="3335655"/>
+                    </a:xfrm>
+                    <a:prstGeom prst="rect">
+                      <a:avLst/>
+                    </a:prstGeom>
+                    <a:noFill/>
+                    <a:ln>
+                      <a:noFill/>
+                    </a:ln>
+                  </pic:spPr>
+                </pic:pic>
+              </a:graphicData>
+            </a:graphic>
+          </wp:inline>
+        </w:drawing>
+      </w:r>
+    </w:p>
+    <w:p>
+      <w:pPr>
+        <w:pStyle w:val="12"/>
+        <w:keepNext w:val="0"/>
+        <w:keepLines w:val="0"/>
+        <w:widowControl/>
+        <w:suppressLineNumbers w:val="0"/>
+        <w:spacing w:line="360" w:lineRule="auto"/>
+        <w:jc w:val="center"/>
+        <w:rPr>
+          <w:rFonts w:hint="default"/>
+          <w:b/>
+          <w:bCs/>
+          <w:sz w:val="28"/>
+          <w:szCs w:val="28"/>
+          <w:lang w:val="en-GB"/>
+        </w:rPr>
+      </w:pPr>
+      <w:r>
+        <w:rPr>
+          <w:rFonts w:hint="default"/>
+          <w:b/>
+          <w:bCs/>
+          <w:sz w:val="28"/>
+          <w:szCs w:val="28"/>
+          <w:lang w:val="en-GB"/>
+        </w:rPr>
+        <w:t>4.6 rasm. O’quvchilarni umumiy baholari</w:t>
+      </w:r>
+    </w:p>
+    <w:p>
+      <w:pPr>
+        <w:pStyle w:val="12"/>
+        <w:keepNext w:val="0"/>
+        <w:keepLines w:val="0"/>
+        <w:widowControl/>
+        <w:suppressLineNumbers w:val="0"/>
+        <w:spacing w:line="360" w:lineRule="auto"/>
         <w:ind w:firstLine="720" w:firstLineChars="0"/>
         <w:jc w:val="both"/>
         <w:rPr>
@@ -16689,6 +17969,90 @@
         <w:widowControl/>
         <w:suppressLineNumbers w:val="0"/>
         <w:spacing w:line="360" w:lineRule="auto"/>
+        <w:jc w:val="both"/>
+      </w:pPr>
+      <w:r>
+        <w:drawing>
+          <wp:inline distT="0" distB="0" distL="114300" distR="114300">
+            <wp:extent cx="5932805" cy="3335655"/>
+            <wp:effectExtent l="0" t="0" r="10795" b="17145"/>
+            <wp:docPr id="19" name="Picture 7"/>
+            <wp:cNvGraphicFramePr>
+              <a:graphicFrameLocks xmlns:a="http://schemas.openxmlformats.org/drawingml/2006/main" noChangeAspect="1"/>
+            </wp:cNvGraphicFramePr>
+            <a:graphic xmlns:a="http://schemas.openxmlformats.org/drawingml/2006/main">
+              <a:graphicData uri="http://schemas.openxmlformats.org/drawingml/2006/picture">
+                <pic:pic xmlns:pic="http://schemas.openxmlformats.org/drawingml/2006/picture">
+                  <pic:nvPicPr>
+                    <pic:cNvPr id="19" name="Picture 7"/>
+                    <pic:cNvPicPr>
+                      <a:picLocks noChangeAspect="1"/>
+                    </pic:cNvPicPr>
+                  </pic:nvPicPr>
+                  <pic:blipFill>
+                    <a:blip r:embed="rId22"/>
+                    <a:stretch>
+                      <a:fillRect/>
+                    </a:stretch>
+                  </pic:blipFill>
+                  <pic:spPr>
+                    <a:xfrm>
+                      <a:off x="0" y="0"/>
+                      <a:ext cx="5932805" cy="3335655"/>
+                    </a:xfrm>
+                    <a:prstGeom prst="rect">
+                      <a:avLst/>
+                    </a:prstGeom>
+                    <a:noFill/>
+                    <a:ln>
+                      <a:noFill/>
+                    </a:ln>
+                  </pic:spPr>
+                </pic:pic>
+              </a:graphicData>
+            </a:graphic>
+          </wp:inline>
+        </w:drawing>
+      </w:r>
+    </w:p>
+    <w:p>
+      <w:pPr>
+        <w:pStyle w:val="12"/>
+        <w:keepNext w:val="0"/>
+        <w:keepLines w:val="0"/>
+        <w:widowControl/>
+        <w:suppressLineNumbers w:val="0"/>
+        <w:spacing w:line="360" w:lineRule="auto"/>
+        <w:jc w:val="center"/>
+        <w:rPr>
+          <w:rFonts w:hint="default"/>
+          <w:b/>
+          <w:bCs/>
+          <w:sz w:val="28"/>
+          <w:szCs w:val="28"/>
+          <w:lang w:val="en-GB"/>
+        </w:rPr>
+      </w:pPr>
+      <w:r>
+        <w:rPr>
+          <w:rFonts w:hint="default"/>
+          <w:b/>
+          <w:bCs/>
+          <w:sz w:val="28"/>
+          <w:szCs w:val="28"/>
+          <w:lang w:val="en-GB"/>
+        </w:rPr>
+        <w:t>4.7 rasm. Online chat</w:t>
+      </w:r>
+    </w:p>
+    <w:p>
+      <w:pPr>
+        <w:pStyle w:val="12"/>
+        <w:keepNext w:val="0"/>
+        <w:keepLines w:val="0"/>
+        <w:widowControl/>
+        <w:suppressLineNumbers w:val="0"/>
+        <w:spacing w:line="360" w:lineRule="auto"/>
         <w:ind w:firstLine="720" w:firstLineChars="0"/>
         <w:jc w:val="both"/>
         <w:rPr>
@@ -16754,6 +18118,90 @@
           <w:szCs w:val="28"/>
         </w:rPr>
         <w:t>Bildirishnoma tizimi ham asosiy funksiyalar qatoriga kiradi. Tizim foydalanuvchiga yangi topshiriq, baho yoki muhim xabarlar haqida avtomatik ravishda xabar yuboradi. Bu o‘quvchilarning dars jarayonidan xabardor bo‘lishiga yordam beradi.</w:t>
+      </w:r>
+    </w:p>
+    <w:p>
+      <w:pPr>
+        <w:pStyle w:val="12"/>
+        <w:keepNext w:val="0"/>
+        <w:keepLines w:val="0"/>
+        <w:widowControl/>
+        <w:suppressLineNumbers w:val="0"/>
+        <w:spacing w:line="360" w:lineRule="auto"/>
+        <w:jc w:val="both"/>
+      </w:pPr>
+      <w:r>
+        <w:drawing>
+          <wp:inline distT="0" distB="0" distL="114300" distR="114300">
+            <wp:extent cx="5932805" cy="3335655"/>
+            <wp:effectExtent l="0" t="0" r="10795" b="17145"/>
+            <wp:docPr id="20" name="Picture 8"/>
+            <wp:cNvGraphicFramePr>
+              <a:graphicFrameLocks xmlns:a="http://schemas.openxmlformats.org/drawingml/2006/main" noChangeAspect="1"/>
+            </wp:cNvGraphicFramePr>
+            <a:graphic xmlns:a="http://schemas.openxmlformats.org/drawingml/2006/main">
+              <a:graphicData uri="http://schemas.openxmlformats.org/drawingml/2006/picture">
+                <pic:pic xmlns:pic="http://schemas.openxmlformats.org/drawingml/2006/picture">
+                  <pic:nvPicPr>
+                    <pic:cNvPr id="20" name="Picture 8"/>
+                    <pic:cNvPicPr>
+                      <a:picLocks noChangeAspect="1"/>
+                    </pic:cNvPicPr>
+                  </pic:nvPicPr>
+                  <pic:blipFill>
+                    <a:blip r:embed="rId23"/>
+                    <a:stretch>
+                      <a:fillRect/>
+                    </a:stretch>
+                  </pic:blipFill>
+                  <pic:spPr>
+                    <a:xfrm>
+                      <a:off x="0" y="0"/>
+                      <a:ext cx="5932805" cy="3335655"/>
+                    </a:xfrm>
+                    <a:prstGeom prst="rect">
+                      <a:avLst/>
+                    </a:prstGeom>
+                    <a:noFill/>
+                    <a:ln>
+                      <a:noFill/>
+                    </a:ln>
+                  </pic:spPr>
+                </pic:pic>
+              </a:graphicData>
+            </a:graphic>
+          </wp:inline>
+        </w:drawing>
+      </w:r>
+    </w:p>
+    <w:p>
+      <w:pPr>
+        <w:pStyle w:val="12"/>
+        <w:keepNext w:val="0"/>
+        <w:keepLines w:val="0"/>
+        <w:widowControl/>
+        <w:suppressLineNumbers w:val="0"/>
+        <w:spacing w:line="360" w:lineRule="auto"/>
+        <w:jc w:val="center"/>
+        <w:rPr>
+          <w:rFonts w:hint="default"/>
+          <w:b/>
+          <w:bCs/>
+          <w:sz w:val="28"/>
+          <w:szCs w:val="28"/>
+          <w:lang w:val="en-GB"/>
+        </w:rPr>
+      </w:pPr>
+      <w:r>
+        <w:rPr>
+          <w:rFonts w:hint="default"/>
+          <w:b/>
+          <w:bCs/>
+          <w:sz w:val="28"/>
+          <w:szCs w:val="28"/>
+          <w:lang w:val="en-GB"/>
+        </w:rPr>
+        <w:t>4.8 rasm. Bepul darslar.</w:t>
       </w:r>
     </w:p>
     <w:p>
@@ -16871,6 +18319,90 @@
           <w:szCs w:val="28"/>
         </w:rPr>
         <w:t xml:space="preserve"> taklif etiladi.</w:t>
+      </w:r>
+    </w:p>
+    <w:p>
+      <w:pPr>
+        <w:pStyle w:val="12"/>
+        <w:keepNext w:val="0"/>
+        <w:keepLines w:val="0"/>
+        <w:widowControl/>
+        <w:suppressLineNumbers w:val="0"/>
+        <w:spacing w:line="360" w:lineRule="auto"/>
+        <w:jc w:val="both"/>
+      </w:pPr>
+      <w:r>
+        <w:drawing>
+          <wp:inline distT="0" distB="0" distL="114300" distR="114300">
+            <wp:extent cx="5932805" cy="3335655"/>
+            <wp:effectExtent l="0" t="0" r="10795" b="17145"/>
+            <wp:docPr id="21" name="Picture 9"/>
+            <wp:cNvGraphicFramePr>
+              <a:graphicFrameLocks xmlns:a="http://schemas.openxmlformats.org/drawingml/2006/main" noChangeAspect="1"/>
+            </wp:cNvGraphicFramePr>
+            <a:graphic xmlns:a="http://schemas.openxmlformats.org/drawingml/2006/main">
+              <a:graphicData uri="http://schemas.openxmlformats.org/drawingml/2006/picture">
+                <pic:pic xmlns:pic="http://schemas.openxmlformats.org/drawingml/2006/picture">
+                  <pic:nvPicPr>
+                    <pic:cNvPr id="21" name="Picture 9"/>
+                    <pic:cNvPicPr>
+                      <a:picLocks noChangeAspect="1"/>
+                    </pic:cNvPicPr>
+                  </pic:nvPicPr>
+                  <pic:blipFill>
+                    <a:blip r:embed="rId24"/>
+                    <a:stretch>
+                      <a:fillRect/>
+                    </a:stretch>
+                  </pic:blipFill>
+                  <pic:spPr>
+                    <a:xfrm>
+                      <a:off x="0" y="0"/>
+                      <a:ext cx="5932805" cy="3335655"/>
+                    </a:xfrm>
+                    <a:prstGeom prst="rect">
+                      <a:avLst/>
+                    </a:prstGeom>
+                    <a:noFill/>
+                    <a:ln>
+                      <a:noFill/>
+                    </a:ln>
+                  </pic:spPr>
+                </pic:pic>
+              </a:graphicData>
+            </a:graphic>
+          </wp:inline>
+        </w:drawing>
+      </w:r>
+    </w:p>
+    <w:p>
+      <w:pPr>
+        <w:pStyle w:val="12"/>
+        <w:keepNext w:val="0"/>
+        <w:keepLines w:val="0"/>
+        <w:widowControl/>
+        <w:suppressLineNumbers w:val="0"/>
+        <w:spacing w:line="360" w:lineRule="auto"/>
+        <w:jc w:val="center"/>
+        <w:rPr>
+          <w:rFonts w:hint="default"/>
+          <w:b/>
+          <w:bCs/>
+          <w:sz w:val="28"/>
+          <w:szCs w:val="28"/>
+          <w:lang w:val="en-GB"/>
+        </w:rPr>
+      </w:pPr>
+      <w:r>
+        <w:rPr>
+          <w:rFonts w:hint="default"/>
+          <w:b/>
+          <w:bCs/>
+          <w:sz w:val="28"/>
+          <w:szCs w:val="28"/>
+          <w:lang w:val="en-GB"/>
+        </w:rPr>
+        <w:t>4.9 rasm. Habarnomalar</w:t>
       </w:r>
     </w:p>
     <w:p>
@@ -17114,6 +18646,90 @@
     </w:p>
     <w:p>
       <w:pPr>
+        <w:pStyle w:val="12"/>
+        <w:keepNext w:val="0"/>
+        <w:keepLines w:val="0"/>
+        <w:widowControl/>
+        <w:suppressLineNumbers w:val="0"/>
+        <w:spacing w:line="360" w:lineRule="auto"/>
+        <w:jc w:val="both"/>
+      </w:pPr>
+      <w:r>
+        <w:drawing>
+          <wp:inline distT="0" distB="0" distL="114300" distR="114300">
+            <wp:extent cx="5932805" cy="3335655"/>
+            <wp:effectExtent l="0" t="0" r="10795" b="17145"/>
+            <wp:docPr id="22" name="Picture 10"/>
+            <wp:cNvGraphicFramePr>
+              <a:graphicFrameLocks xmlns:a="http://schemas.openxmlformats.org/drawingml/2006/main" noChangeAspect="1"/>
+            </wp:cNvGraphicFramePr>
+            <a:graphic xmlns:a="http://schemas.openxmlformats.org/drawingml/2006/main">
+              <a:graphicData uri="http://schemas.openxmlformats.org/drawingml/2006/picture">
+                <pic:pic xmlns:pic="http://schemas.openxmlformats.org/drawingml/2006/picture">
+                  <pic:nvPicPr>
+                    <pic:cNvPr id="22" name="Picture 10"/>
+                    <pic:cNvPicPr>
+                      <a:picLocks noChangeAspect="1"/>
+                    </pic:cNvPicPr>
+                  </pic:nvPicPr>
+                  <pic:blipFill>
+                    <a:blip r:embed="rId25"/>
+                    <a:stretch>
+                      <a:fillRect/>
+                    </a:stretch>
+                  </pic:blipFill>
+                  <pic:spPr>
+                    <a:xfrm>
+                      <a:off x="0" y="0"/>
+                      <a:ext cx="5932805" cy="3335655"/>
+                    </a:xfrm>
+                    <a:prstGeom prst="rect">
+                      <a:avLst/>
+                    </a:prstGeom>
+                    <a:noFill/>
+                    <a:ln>
+                      <a:noFill/>
+                    </a:ln>
+                  </pic:spPr>
+                </pic:pic>
+              </a:graphicData>
+            </a:graphic>
+          </wp:inline>
+        </w:drawing>
+      </w:r>
+    </w:p>
+    <w:p>
+      <w:pPr>
+        <w:pStyle w:val="12"/>
+        <w:keepNext w:val="0"/>
+        <w:keepLines w:val="0"/>
+        <w:widowControl/>
+        <w:suppressLineNumbers w:val="0"/>
+        <w:spacing w:line="360" w:lineRule="auto"/>
+        <w:jc w:val="center"/>
+        <w:rPr>
+          <w:rFonts w:hint="default"/>
+          <w:b/>
+          <w:bCs/>
+          <w:sz w:val="28"/>
+          <w:szCs w:val="28"/>
+          <w:lang w:val="en-GB"/>
+        </w:rPr>
+      </w:pPr>
+      <w:r>
+        <w:rPr>
+          <w:rFonts w:hint="default"/>
+          <w:b/>
+          <w:bCs/>
+          <w:sz w:val="28"/>
+          <w:szCs w:val="28"/>
+          <w:lang w:val="en-GB"/>
+        </w:rPr>
+        <w:t>4.10 rasm. O’quvchilar ro’yxati</w:t>
+      </w:r>
+    </w:p>
+    <w:p>
+      <w:pPr>
         <w:pStyle w:val="4"/>
         <w:keepNext w:val="0"/>
         <w:keepLines w:val="0"/>
@@ -17874,6 +19490,90 @@
     </w:p>
     <w:p>
       <w:pPr>
+        <w:pStyle w:val="12"/>
+        <w:keepNext w:val="0"/>
+        <w:keepLines w:val="0"/>
+        <w:widowControl/>
+        <w:suppressLineNumbers w:val="0"/>
+        <w:spacing w:line="360" w:lineRule="auto"/>
+        <w:jc w:val="both"/>
+      </w:pPr>
+      <w:r>
+        <w:drawing>
+          <wp:inline distT="0" distB="0" distL="114300" distR="114300">
+            <wp:extent cx="5932805" cy="3335655"/>
+            <wp:effectExtent l="0" t="0" r="10795" b="17145"/>
+            <wp:docPr id="23" name="Picture 11"/>
+            <wp:cNvGraphicFramePr>
+              <a:graphicFrameLocks xmlns:a="http://schemas.openxmlformats.org/drawingml/2006/main" noChangeAspect="1"/>
+            </wp:cNvGraphicFramePr>
+            <a:graphic xmlns:a="http://schemas.openxmlformats.org/drawingml/2006/main">
+              <a:graphicData uri="http://schemas.openxmlformats.org/drawingml/2006/picture">
+                <pic:pic xmlns:pic="http://schemas.openxmlformats.org/drawingml/2006/picture">
+                  <pic:nvPicPr>
+                    <pic:cNvPr id="23" name="Picture 11"/>
+                    <pic:cNvPicPr>
+                      <a:picLocks noChangeAspect="1"/>
+                    </pic:cNvPicPr>
+                  </pic:nvPicPr>
+                  <pic:blipFill>
+                    <a:blip r:embed="rId26"/>
+                    <a:stretch>
+                      <a:fillRect/>
+                    </a:stretch>
+                  </pic:blipFill>
+                  <pic:spPr>
+                    <a:xfrm>
+                      <a:off x="0" y="0"/>
+                      <a:ext cx="5932805" cy="3335655"/>
+                    </a:xfrm>
+                    <a:prstGeom prst="rect">
+                      <a:avLst/>
+                    </a:prstGeom>
+                    <a:noFill/>
+                    <a:ln>
+                      <a:noFill/>
+                    </a:ln>
+                  </pic:spPr>
+                </pic:pic>
+              </a:graphicData>
+            </a:graphic>
+          </wp:inline>
+        </w:drawing>
+      </w:r>
+    </w:p>
+    <w:p>
+      <w:pPr>
+        <w:pStyle w:val="12"/>
+        <w:keepNext w:val="0"/>
+        <w:keepLines w:val="0"/>
+        <w:widowControl/>
+        <w:suppressLineNumbers w:val="0"/>
+        <w:spacing w:line="360" w:lineRule="auto"/>
+        <w:jc w:val="center"/>
+        <w:rPr>
+          <w:rFonts w:hint="default"/>
+          <w:b/>
+          <w:bCs/>
+          <w:sz w:val="28"/>
+          <w:szCs w:val="28"/>
+          <w:lang w:val="en-GB"/>
+        </w:rPr>
+      </w:pPr>
+      <w:r>
+        <w:rPr>
+          <w:rFonts w:hint="default"/>
+          <w:b/>
+          <w:bCs/>
+          <w:sz w:val="28"/>
+          <w:szCs w:val="28"/>
+          <w:lang w:val="en-GB"/>
+        </w:rPr>
+        <w:t>4.11 rasm. Fanlar bo’yicha baholar</w:t>
+      </w:r>
+    </w:p>
+    <w:p>
+      <w:pPr>
         <w:pStyle w:val="4"/>
         <w:keepNext w:val="0"/>
         <w:keepLines w:val="0"/>
@@ -18406,8 +20106,8 @@
           <w:szCs w:val="28"/>
         </w:rPr>
       </w:pPr>
-      <w:bookmarkStart w:id="121" w:name="_Toc29565"/>
-      <w:bookmarkStart w:id="122" w:name="_Toc12116"/>
+      <w:bookmarkStart w:id="121" w:name="_Toc12116"/>
+      <w:bookmarkStart w:id="122" w:name="_Toc29565"/>
       <w:bookmarkStart w:id="123" w:name="_Toc19420"/>
       <w:r>
         <w:rPr>
@@ -19940,6 +21640,90 @@
         <w:widowControl/>
         <w:suppressLineNumbers w:val="0"/>
         <w:spacing w:line="360" w:lineRule="auto"/>
+        <w:jc w:val="both"/>
+      </w:pPr>
+      <w:r>
+        <w:drawing>
+          <wp:inline distT="0" distB="0" distL="114300" distR="114300">
+            <wp:extent cx="5932805" cy="3335655"/>
+            <wp:effectExtent l="0" t="0" r="10795" b="17145"/>
+            <wp:docPr id="24" name="Picture 12"/>
+            <wp:cNvGraphicFramePr>
+              <a:graphicFrameLocks xmlns:a="http://schemas.openxmlformats.org/drawingml/2006/main" noChangeAspect="1"/>
+            </wp:cNvGraphicFramePr>
+            <a:graphic xmlns:a="http://schemas.openxmlformats.org/drawingml/2006/main">
+              <a:graphicData uri="http://schemas.openxmlformats.org/drawingml/2006/picture">
+                <pic:pic xmlns:pic="http://schemas.openxmlformats.org/drawingml/2006/picture">
+                  <pic:nvPicPr>
+                    <pic:cNvPr id="24" name="Picture 12"/>
+                    <pic:cNvPicPr>
+                      <a:picLocks noChangeAspect="1"/>
+                    </pic:cNvPicPr>
+                  </pic:nvPicPr>
+                  <pic:blipFill>
+                    <a:blip r:embed="rId27"/>
+                    <a:stretch>
+                      <a:fillRect/>
+                    </a:stretch>
+                  </pic:blipFill>
+                  <pic:spPr>
+                    <a:xfrm>
+                      <a:off x="0" y="0"/>
+                      <a:ext cx="5932805" cy="3335655"/>
+                    </a:xfrm>
+                    <a:prstGeom prst="rect">
+                      <a:avLst/>
+                    </a:prstGeom>
+                    <a:noFill/>
+                    <a:ln>
+                      <a:noFill/>
+                    </a:ln>
+                  </pic:spPr>
+                </pic:pic>
+              </a:graphicData>
+            </a:graphic>
+          </wp:inline>
+        </w:drawing>
+      </w:r>
+    </w:p>
+    <w:p>
+      <w:pPr>
+        <w:pStyle w:val="12"/>
+        <w:keepNext w:val="0"/>
+        <w:keepLines w:val="0"/>
+        <w:widowControl/>
+        <w:suppressLineNumbers w:val="0"/>
+        <w:spacing w:line="360" w:lineRule="auto"/>
+        <w:jc w:val="center"/>
+        <w:rPr>
+          <w:rFonts w:hint="default"/>
+          <w:b/>
+          <w:bCs/>
+          <w:sz w:val="28"/>
+          <w:szCs w:val="28"/>
+          <w:lang w:val="en-GB"/>
+        </w:rPr>
+      </w:pPr>
+      <w:r>
+        <w:rPr>
+          <w:rFonts w:hint="default"/>
+          <w:b/>
+          <w:bCs/>
+          <w:sz w:val="28"/>
+          <w:szCs w:val="28"/>
+          <w:lang w:val="en-GB"/>
+        </w:rPr>
+        <w:t>4.12 rasm. fanlar</w:t>
+      </w:r>
+    </w:p>
+    <w:p>
+      <w:pPr>
+        <w:pStyle w:val="12"/>
+        <w:keepNext w:val="0"/>
+        <w:keepLines w:val="0"/>
+        <w:widowControl/>
+        <w:suppressLineNumbers w:val="0"/>
+        <w:spacing w:line="360" w:lineRule="auto"/>
         <w:ind w:firstLine="720" w:firstLineChars="0"/>
         <w:jc w:val="both"/>
         <w:rPr>
@@ -20105,6 +21889,90 @@
           <w:szCs w:val="28"/>
         </w:rPr>
         <w:t>Demo jarayonida qo‘shimcha funksiyalar ham ko‘rsatiladi. Masalan, foydalanuvchilarning chat orqali o‘qituvchi bilan bog‘lanishi, bildirishnomalar orqali yangiliklardan xabardor bo‘lishi, mustaqil loyiha yoki topshiriqlarni bajarish imkoniyatlari. Bu orqali platformaning interaktivligi va o‘quvchilarning faoliyatini rag‘batlantirish mexanizmi namoyon bo‘ladi.</w:t>
+      </w:r>
+    </w:p>
+    <w:p>
+      <w:pPr>
+        <w:pStyle w:val="12"/>
+        <w:keepNext w:val="0"/>
+        <w:keepLines w:val="0"/>
+        <w:widowControl/>
+        <w:suppressLineNumbers w:val="0"/>
+        <w:spacing w:line="360" w:lineRule="auto"/>
+        <w:jc w:val="both"/>
+      </w:pPr>
+      <w:r>
+        <w:drawing>
+          <wp:inline distT="0" distB="0" distL="114300" distR="114300">
+            <wp:extent cx="5932805" cy="3335655"/>
+            <wp:effectExtent l="0" t="0" r="10795" b="17145"/>
+            <wp:docPr id="25" name="Picture 13"/>
+            <wp:cNvGraphicFramePr>
+              <a:graphicFrameLocks xmlns:a="http://schemas.openxmlformats.org/drawingml/2006/main" noChangeAspect="1"/>
+            </wp:cNvGraphicFramePr>
+            <a:graphic xmlns:a="http://schemas.openxmlformats.org/drawingml/2006/main">
+              <a:graphicData uri="http://schemas.openxmlformats.org/drawingml/2006/picture">
+                <pic:pic xmlns:pic="http://schemas.openxmlformats.org/drawingml/2006/picture">
+                  <pic:nvPicPr>
+                    <pic:cNvPr id="25" name="Picture 13"/>
+                    <pic:cNvPicPr>
+                      <a:picLocks noChangeAspect="1"/>
+                    </pic:cNvPicPr>
+                  </pic:nvPicPr>
+                  <pic:blipFill>
+                    <a:blip r:embed="rId28"/>
+                    <a:stretch>
+                      <a:fillRect/>
+                    </a:stretch>
+                  </pic:blipFill>
+                  <pic:spPr>
+                    <a:xfrm>
+                      <a:off x="0" y="0"/>
+                      <a:ext cx="5932805" cy="3335655"/>
+                    </a:xfrm>
+                    <a:prstGeom prst="rect">
+                      <a:avLst/>
+                    </a:prstGeom>
+                    <a:noFill/>
+                    <a:ln>
+                      <a:noFill/>
+                    </a:ln>
+                  </pic:spPr>
+                </pic:pic>
+              </a:graphicData>
+            </a:graphic>
+          </wp:inline>
+        </w:drawing>
+      </w:r>
+    </w:p>
+    <w:p>
+      <w:pPr>
+        <w:pStyle w:val="12"/>
+        <w:keepNext w:val="0"/>
+        <w:keepLines w:val="0"/>
+        <w:widowControl/>
+        <w:suppressLineNumbers w:val="0"/>
+        <w:spacing w:line="360" w:lineRule="auto"/>
+        <w:jc w:val="center"/>
+        <w:rPr>
+          <w:rFonts w:hint="default"/>
+          <w:b/>
+          <w:bCs/>
+          <w:sz w:val="28"/>
+          <w:szCs w:val="28"/>
+          <w:lang w:val="en-GB"/>
+        </w:rPr>
+      </w:pPr>
+      <w:r>
+        <w:rPr>
+          <w:rFonts w:hint="default"/>
+          <w:b/>
+          <w:bCs/>
+          <w:sz w:val="28"/>
+          <w:szCs w:val="28"/>
+          <w:lang w:val="en-GB"/>
+        </w:rPr>
+        <w:t>4.13 rasm. Tugallagan o’quvchilar</w:t>
       </w:r>
     </w:p>
     <w:p>
@@ -20215,11 +22083,11 @@
           <w:szCs w:val="32"/>
         </w:rPr>
       </w:pPr>
-      <w:bookmarkStart w:id="133" w:name="_Toc17538"/>
-      <w:bookmarkStart w:id="134" w:name="_Toc1107"/>
-      <w:bookmarkStart w:id="135" w:name="_Toc8030"/>
-      <w:bookmarkStart w:id="136" w:name="_Toc12702"/>
-      <w:bookmarkStart w:id="137" w:name="_Toc1466"/>
+      <w:bookmarkStart w:id="133" w:name="_Toc8030"/>
+      <w:bookmarkStart w:id="134" w:name="_Toc12702"/>
+      <w:bookmarkStart w:id="135" w:name="_Toc1107"/>
+      <w:bookmarkStart w:id="136" w:name="_Toc1466"/>
+      <w:bookmarkStart w:id="137" w:name="_Toc17538"/>
       <w:r>
         <w:rPr>
           <w:rFonts w:hint="default" w:ascii="Times New Roman" w:hAnsi="Times New Roman" w:cs="Times New Roman"/>
@@ -20567,9 +22435,9 @@
           <w:szCs w:val="32"/>
         </w:rPr>
       </w:pPr>
-      <w:bookmarkStart w:id="140" w:name="_Toc16197"/>
-      <w:bookmarkStart w:id="141" w:name="_Toc31172"/>
-      <w:bookmarkStart w:id="142" w:name="_Toc14984"/>
+      <w:bookmarkStart w:id="140" w:name="_Toc31172"/>
+      <w:bookmarkStart w:id="141" w:name="_Toc14984"/>
+      <w:bookmarkStart w:id="142" w:name="_Toc16197"/>
       <w:bookmarkStart w:id="143" w:name="_Toc27570"/>
       <w:bookmarkStart w:id="144" w:name="_Toc21591"/>
       <w:r>
@@ -20591,8 +22459,8 @@
           <w:szCs w:val="32"/>
         </w:rPr>
       </w:pPr>
-      <w:bookmarkStart w:id="145" w:name="_Toc30421"/>
-      <w:bookmarkStart w:id="146" w:name="_Toc4543"/>
+      <w:bookmarkStart w:id="145" w:name="_Toc4543"/>
+      <w:bookmarkStart w:id="146" w:name="_Toc30421"/>
       <w:r>
         <w:rPr>
           <w:rFonts w:hint="default" w:ascii="Times New Roman" w:hAnsi="Times New Roman" w:cs="Times New Roman"/>

</xml_diff>